<commit_message>
Actualización del código. Reporte funcionando 100%
</commit_message>
<xml_diff>
--- a/INFORME TÉCNICO FINAL.docx
+++ b/INFORME TÉCNICO FINAL.docx
@@ -269,16 +269,17 @@
       </w:tblPr>
       <w:tblGrid>
         <w:gridCol w:w="1297"/>
-        <w:gridCol w:w="3586"/>
-        <w:gridCol w:w="281"/>
-        <w:gridCol w:w="2094"/>
-        <w:gridCol w:w="1758"/>
+        <w:gridCol w:w="3574"/>
+        <w:gridCol w:w="279"/>
+        <w:gridCol w:w="2071"/>
+        <w:gridCol w:w="1795"/>
       </w:tblGrid>
       <w:tr>
         <w:tc>
           <w:tcPr>
             <w:tcW w:w="1129" w:type="dxa"/>
             <w:shd w:val="clear" w:color="auto" w:fill="E8E8E8" w:themeFill="background2"/>
+            <w:vAlign w:val="center"/>
           </w:tcPr>
           <w:p>
             <w:pPr>
@@ -304,15 +305,24 @@
             <w:tcBorders>
               <w:right w:val="single" w:sz="4" w:space="0" w:color="auto"/>
             </w:tcBorders>
-          </w:tcPr>
-          <w:p>
-            <w:pPr>
-              <w:rPr>
-                <w:rFonts w:ascii="Roboto Mono" w:hAnsi="Roboto Mono"/>
-                <w:sz w:val="20"/>
-                <w:szCs w:val="20"/>
-              </w:rPr>
-            </w:pPr>
+            <w:vAlign w:val="center"/>
+          </w:tcPr>
+          <w:p>
+            <w:pPr>
+              <w:rPr>
+                <w:rFonts w:ascii="Roboto Mono" w:hAnsi="Roboto Mono"/>
+                <w:sz w:val="20"/>
+                <w:szCs w:val="20"/>
+              </w:rPr>
+            </w:pPr>
+            <w:r>
+              <w:rPr>
+                <w:rFonts w:ascii="Roboto Mono" w:hAnsi="Roboto Mono"/>
+                <w:sz w:val="20"/>
+                <w:szCs w:val="20"/>
+              </w:rPr>
+              <w:t>{{cliente}}</w:t>
+            </w:r>
           </w:p>
         </w:tc>
         <w:tc>
@@ -324,6 +334,7 @@
               <w:bottom w:val="nil"/>
               <w:right w:val="single" w:sz="4" w:space="0" w:color="auto"/>
             </w:tcBorders>
+            <w:vAlign w:val="center"/>
           </w:tcPr>
           <w:p>
             <w:pPr>
@@ -342,6 +353,7 @@
               <w:left w:val="single" w:sz="4" w:space="0" w:color="auto"/>
             </w:tcBorders>
             <w:shd w:val="clear" w:color="auto" w:fill="E8E8E8" w:themeFill="background2"/>
+            <w:vAlign w:val="center"/>
           </w:tcPr>
           <w:p>
             <w:pPr>
@@ -364,15 +376,24 @@
         <w:tc>
           <w:tcPr>
             <w:tcW w:w="1804" w:type="dxa"/>
-          </w:tcPr>
-          <w:p>
-            <w:pPr>
-              <w:rPr>
-                <w:rFonts w:ascii="Roboto Mono" w:hAnsi="Roboto Mono"/>
-                <w:sz w:val="20"/>
-                <w:szCs w:val="20"/>
-              </w:rPr>
-            </w:pPr>
+            <w:vAlign w:val="center"/>
+          </w:tcPr>
+          <w:p>
+            <w:pPr>
+              <w:rPr>
+                <w:rFonts w:ascii="Roboto Mono" w:hAnsi="Roboto Mono"/>
+                <w:sz w:val="20"/>
+                <w:szCs w:val="20"/>
+              </w:rPr>
+            </w:pPr>
+            <w:r>
+              <w:rPr>
+                <w:rFonts w:ascii="Roboto Mono" w:hAnsi="Roboto Mono"/>
+                <w:sz w:val="20"/>
+                <w:szCs w:val="20"/>
+              </w:rPr>
+              <w:t>{{fecha}}</w:t>
+            </w:r>
           </w:p>
         </w:tc>
       </w:tr>
@@ -381,6 +402,7 @@
           <w:tcPr>
             <w:tcW w:w="1129" w:type="dxa"/>
             <w:shd w:val="clear" w:color="auto" w:fill="E8E8E8" w:themeFill="background2"/>
+            <w:vAlign w:val="center"/>
           </w:tcPr>
           <w:p>
             <w:pPr>
@@ -406,15 +428,64 @@
             <w:tcBorders>
               <w:right w:val="single" w:sz="4" w:space="0" w:color="auto"/>
             </w:tcBorders>
-          </w:tcPr>
-          <w:p>
-            <w:pPr>
-              <w:rPr>
-                <w:rFonts w:ascii="Roboto Mono" w:hAnsi="Roboto Mono"/>
-                <w:sz w:val="20"/>
-                <w:szCs w:val="20"/>
-              </w:rPr>
-            </w:pPr>
+            <w:vAlign w:val="center"/>
+          </w:tcPr>
+          <w:p>
+            <w:pPr>
+              <w:rPr>
+                <w:rFonts w:ascii="Roboto Mono" w:hAnsi="Roboto Mono"/>
+                <w:sz w:val="20"/>
+                <w:szCs w:val="20"/>
+              </w:rPr>
+            </w:pPr>
+            <w:r>
+              <w:rPr>
+                <w:rFonts w:ascii="Roboto Mono" w:hAnsi="Roboto Mono"/>
+                <w:sz w:val="20"/>
+                <w:szCs w:val="20"/>
+              </w:rPr>
+              <w:t>{{direccion}}</w:t>
+            </w:r>
+            <w:r>
+              <w:rPr>
+                <w:rFonts w:ascii="Roboto Mono" w:hAnsi="Roboto Mono"/>
+                <w:sz w:val="20"/>
+                <w:szCs w:val="20"/>
+              </w:rPr>
+              <w:t>,</w:t>
+            </w:r>
+            <w:r>
+              <w:rPr>
+                <w:rFonts w:ascii="Roboto Mono" w:hAnsi="Roboto Mono"/>
+                <w:sz w:val="20"/>
+                <w:szCs w:val="20"/>
+              </w:rPr>
+              <w:t xml:space="preserve"> </w:t>
+            </w:r>
+            <w:r>
+              <w:rPr>
+                <w:rFonts w:ascii="Roboto Mono" w:hAnsi="Roboto Mono"/>
+                <w:sz w:val="20"/>
+                <w:szCs w:val="20"/>
+              </w:rPr>
+              <w:t>{{</w:t>
+            </w:r>
+            <w:r>
+              <w:rPr>
+                <w:rFonts w:ascii="Roboto Mono" w:hAnsi="Roboto Mono"/>
+                <w:sz w:val="20"/>
+                <w:szCs w:val="20"/>
+              </w:rPr>
+              <w:t>municipio</w:t>
+            </w:r>
+            <w:r>
+              <w:rPr>
+                <w:rFonts w:ascii="Roboto Mono" w:hAnsi="Roboto Mono"/>
+                <w:sz w:val="20"/>
+                <w:szCs w:val="20"/>
+              </w:rPr>
+              <w:t>}}</w:t>
+            </w:r>
           </w:p>
         </w:tc>
         <w:tc>
@@ -426,6 +497,7 @@
               <w:bottom w:val="nil"/>
               <w:right w:val="single" w:sz="4" w:space="0" w:color="auto"/>
             </w:tcBorders>
+            <w:vAlign w:val="center"/>
           </w:tcPr>
           <w:p>
             <w:pPr>
@@ -444,6 +516,7 @@
               <w:left w:val="single" w:sz="4" w:space="0" w:color="auto"/>
             </w:tcBorders>
             <w:shd w:val="clear" w:color="auto" w:fill="E8E8E8" w:themeFill="background2"/>
+            <w:vAlign w:val="center"/>
           </w:tcPr>
           <w:p>
             <w:pPr>
@@ -466,15 +539,24 @@
         <w:tc>
           <w:tcPr>
             <w:tcW w:w="1804" w:type="dxa"/>
-          </w:tcPr>
-          <w:p>
-            <w:pPr>
-              <w:rPr>
-                <w:rFonts w:ascii="Roboto Mono" w:hAnsi="Roboto Mono"/>
-                <w:sz w:val="20"/>
-                <w:szCs w:val="20"/>
-              </w:rPr>
-            </w:pPr>
+            <w:vAlign w:val="center"/>
+          </w:tcPr>
+          <w:p>
+            <w:pPr>
+              <w:rPr>
+                <w:rFonts w:ascii="Roboto Mono" w:hAnsi="Roboto Mono"/>
+                <w:sz w:val="20"/>
+                <w:szCs w:val="20"/>
+              </w:rPr>
+            </w:pPr>
+            <w:r>
+              <w:rPr>
+                <w:rFonts w:ascii="Roboto Mono" w:hAnsi="Roboto Mono"/>
+                <w:sz w:val="20"/>
+                <w:szCs w:val="20"/>
+              </w:rPr>
+              <w:t>{{hora}}</w:t>
+            </w:r>
           </w:p>
         </w:tc>
       </w:tr>
@@ -483,6 +565,7 @@
           <w:tcPr>
             <w:tcW w:w="1129" w:type="dxa"/>
             <w:shd w:val="clear" w:color="auto" w:fill="E8E8E8" w:themeFill="background2"/>
+            <w:vAlign w:val="center"/>
           </w:tcPr>
           <w:p>
             <w:pPr>
@@ -508,15 +591,24 @@
             <w:tcBorders>
               <w:right w:val="single" w:sz="4" w:space="0" w:color="auto"/>
             </w:tcBorders>
-          </w:tcPr>
-          <w:p>
-            <w:pPr>
-              <w:rPr>
-                <w:rFonts w:ascii="Roboto Mono" w:hAnsi="Roboto Mono"/>
-                <w:sz w:val="20"/>
-                <w:szCs w:val="20"/>
-              </w:rPr>
-            </w:pPr>
+            <w:vAlign w:val="center"/>
+          </w:tcPr>
+          <w:p>
+            <w:pPr>
+              <w:rPr>
+                <w:rFonts w:ascii="Roboto Mono" w:hAnsi="Roboto Mono"/>
+                <w:sz w:val="20"/>
+                <w:szCs w:val="20"/>
+              </w:rPr>
+            </w:pPr>
+            <w:r>
+              <w:rPr>
+                <w:rFonts w:ascii="Roboto Mono" w:hAnsi="Roboto Mono"/>
+                <w:sz w:val="20"/>
+                <w:szCs w:val="20"/>
+              </w:rPr>
+              <w:t>{{telefono}}</w:t>
+            </w:r>
           </w:p>
         </w:tc>
         <w:tc>
@@ -528,6 +620,7 @@
               <w:bottom w:val="nil"/>
               <w:right w:val="single" w:sz="4" w:space="0" w:color="auto"/>
             </w:tcBorders>
+            <w:vAlign w:val="center"/>
           </w:tcPr>
           <w:p>
             <w:pPr>
@@ -546,6 +639,7 @@
               <w:left w:val="single" w:sz="4" w:space="0" w:color="auto"/>
             </w:tcBorders>
             <w:shd w:val="clear" w:color="auto" w:fill="E8E8E8" w:themeFill="background2"/>
+            <w:vAlign w:val="center"/>
           </w:tcPr>
           <w:p>
             <w:pPr>
@@ -568,15 +662,24 @@
         <w:tc>
           <w:tcPr>
             <w:tcW w:w="1804" w:type="dxa"/>
-          </w:tcPr>
-          <w:p>
-            <w:pPr>
-              <w:rPr>
-                <w:rFonts w:ascii="Roboto Mono" w:hAnsi="Roboto Mono"/>
-                <w:sz w:val="20"/>
-                <w:szCs w:val="20"/>
-              </w:rPr>
-            </w:pPr>
+            <w:vAlign w:val="center"/>
+          </w:tcPr>
+          <w:p>
+            <w:pPr>
+              <w:rPr>
+                <w:rFonts w:ascii="Roboto Mono" w:hAnsi="Roboto Mono"/>
+                <w:sz w:val="20"/>
+                <w:szCs w:val="20"/>
+              </w:rPr>
+            </w:pPr>
+            <w:r>
+              <w:rPr>
+                <w:rFonts w:ascii="Roboto Mono" w:hAnsi="Roboto Mono"/>
+                <w:sz w:val="20"/>
+                <w:szCs w:val="20"/>
+              </w:rPr>
+              <w:t>{{h_inicio}}</w:t>
+            </w:r>
           </w:p>
         </w:tc>
       </w:tr>
@@ -585,6 +688,7 @@
           <w:tcPr>
             <w:tcW w:w="1129" w:type="dxa"/>
             <w:shd w:val="clear" w:color="auto" w:fill="E8E8E8" w:themeFill="background2"/>
+            <w:vAlign w:val="center"/>
           </w:tcPr>
           <w:p>
             <w:pPr>
@@ -610,15 +714,24 @@
             <w:tcBorders>
               <w:right w:val="single" w:sz="4" w:space="0" w:color="auto"/>
             </w:tcBorders>
-          </w:tcPr>
-          <w:p>
-            <w:pPr>
-              <w:rPr>
-                <w:rFonts w:ascii="Roboto Mono" w:hAnsi="Roboto Mono"/>
-                <w:sz w:val="20"/>
-                <w:szCs w:val="20"/>
-              </w:rPr>
-            </w:pPr>
+            <w:vAlign w:val="center"/>
+          </w:tcPr>
+          <w:p>
+            <w:pPr>
+              <w:rPr>
+                <w:rFonts w:ascii="Roboto Mono" w:hAnsi="Roboto Mono"/>
+                <w:sz w:val="20"/>
+                <w:szCs w:val="20"/>
+              </w:rPr>
+            </w:pPr>
+            <w:r>
+              <w:rPr>
+                <w:rFonts w:ascii="Roboto Mono" w:hAnsi="Roboto Mono"/>
+                <w:sz w:val="20"/>
+                <w:szCs w:val="20"/>
+              </w:rPr>
+              <w:t>{{sector}}</w:t>
+            </w:r>
           </w:p>
         </w:tc>
         <w:tc>
@@ -630,6 +743,7 @@
               <w:bottom w:val="nil"/>
               <w:right w:val="single" w:sz="4" w:space="0" w:color="auto"/>
             </w:tcBorders>
+            <w:vAlign w:val="center"/>
           </w:tcPr>
           <w:p>
             <w:pPr>
@@ -648,6 +762,7 @@
               <w:left w:val="single" w:sz="4" w:space="0" w:color="auto"/>
             </w:tcBorders>
             <w:shd w:val="clear" w:color="auto" w:fill="E8E8E8" w:themeFill="background2"/>
+            <w:vAlign w:val="center"/>
           </w:tcPr>
           <w:p>
             <w:pPr>
@@ -670,15 +785,24 @@
         <w:tc>
           <w:tcPr>
             <w:tcW w:w="1804" w:type="dxa"/>
-          </w:tcPr>
-          <w:p>
-            <w:pPr>
-              <w:rPr>
-                <w:rFonts w:ascii="Roboto Mono" w:hAnsi="Roboto Mono"/>
-                <w:sz w:val="20"/>
-                <w:szCs w:val="20"/>
-              </w:rPr>
-            </w:pPr>
+            <w:vAlign w:val="center"/>
+          </w:tcPr>
+          <w:p>
+            <w:pPr>
+              <w:rPr>
+                <w:rFonts w:ascii="Roboto Mono" w:hAnsi="Roboto Mono"/>
+                <w:sz w:val="20"/>
+                <w:szCs w:val="20"/>
+              </w:rPr>
+            </w:pPr>
+            <w:r>
+              <w:rPr>
+                <w:rFonts w:ascii="Roboto Mono" w:hAnsi="Roboto Mono"/>
+                <w:sz w:val="20"/>
+                <w:szCs w:val="20"/>
+              </w:rPr>
+              <w:t>{{h_salida}}</w:t>
+            </w:r>
           </w:p>
         </w:tc>
       </w:tr>
@@ -706,6 +830,7 @@
           <w:tcPr>
             <w:tcW w:w="9016" w:type="dxa"/>
             <w:shd w:val="clear" w:color="auto" w:fill="E8E8E8" w:themeFill="background2"/>
+            <w:vAlign w:val="center"/>
           </w:tcPr>
           <w:p>
             <w:pPr>
@@ -729,7 +854,23 @@
                 <w:sz w:val="20"/>
                 <w:szCs w:val="20"/>
               </w:rPr>
-              <w:t xml:space="preserve"> {{}}</w:t>
+              <w:t xml:space="preserve"> {{</w:t>
+            </w:r>
+            <w:r>
+              <w:rPr>
+                <w:rFonts w:ascii="Roboto Mono" w:hAnsi="Roboto Mono"/>
+                <w:sz w:val="20"/>
+                <w:szCs w:val="20"/>
+              </w:rPr>
+              <w:t>areas_controladas</w:t>
+            </w:r>
+            <w:r>
+              <w:rPr>
+                <w:rFonts w:ascii="Roboto Mono" w:hAnsi="Roboto Mono"/>
+                <w:sz w:val="20"/>
+                <w:szCs w:val="20"/>
+              </w:rPr>
+              <w:t>}}</w:t>
             </w:r>
           </w:p>
         </w:tc>
@@ -758,6 +899,7 @@
           <w:tcPr>
             <w:tcW w:w="9016" w:type="dxa"/>
             <w:shd w:val="clear" w:color="auto" w:fill="E8E8E8" w:themeFill="background2"/>
+            <w:vAlign w:val="center"/>
           </w:tcPr>
           <w:p>
             <w:pPr>
@@ -774,6 +916,47 @@
                 <w:szCs w:val="20"/>
               </w:rPr>
               <w:t>Antecedentes:</w:t>
+            </w:r>
+            <w:r>
+              <w:rPr>
+                <w:rFonts w:ascii="Roboto Mono" w:hAnsi="Roboto Mono"/>
+                <w:sz w:val="20"/>
+                <w:szCs w:val="20"/>
+              </w:rPr>
+              <w:t xml:space="preserve"> </w:t>
+            </w:r>
+          </w:p>
+          <w:p>
+            <w:pPr>
+              <w:rPr>
+                <w:rFonts w:ascii="Roboto Mono" w:hAnsi="Roboto Mono"/>
+                <w:sz w:val="20"/>
+                <w:szCs w:val="20"/>
+              </w:rPr>
+            </w:pPr>
+            <w:r>
+              <w:rPr>
+                <w:rFonts w:ascii="Roboto Mono" w:hAnsi="Roboto Mono"/>
+                <w:sz w:val="20"/>
+                <w:szCs w:val="20"/>
+              </w:rPr>
+              <w:t>{{</w:t>
+            </w:r>
+            <w:r>
+              <w:rPr>
+                <w:rFonts w:ascii="Roboto Mono" w:hAnsi="Roboto Mono"/>
+                <w:sz w:val="20"/>
+                <w:szCs w:val="20"/>
+              </w:rPr>
+              <w:t>antecedentes</w:t>
+            </w:r>
+            <w:r>
+              <w:rPr>
+                <w:rFonts w:ascii="Roboto Mono" w:hAnsi="Roboto Mono"/>
+                <w:sz w:val="20"/>
+                <w:szCs w:val="20"/>
+              </w:rPr>
+              <w:t>}}</w:t>
             </w:r>
           </w:p>
         </w:tc>
@@ -802,6 +985,7 @@
           <w:tcPr>
             <w:tcW w:w="9016" w:type="dxa"/>
             <w:shd w:val="clear" w:color="auto" w:fill="E8E8E8" w:themeFill="background2"/>
+            <w:vAlign w:val="center"/>
           </w:tcPr>
           <w:p>
             <w:pPr>
@@ -818,6 +1002,39 @@
                 <w:szCs w:val="20"/>
               </w:rPr>
               <w:t>Observaciones del servicio:</w:t>
+            </w:r>
+          </w:p>
+          <w:p>
+            <w:pPr>
+              <w:rPr>
+                <w:rFonts w:ascii="Roboto Mono" w:hAnsi="Roboto Mono"/>
+                <w:sz w:val="20"/>
+                <w:szCs w:val="20"/>
+              </w:rPr>
+            </w:pPr>
+            <w:r>
+              <w:rPr>
+                <w:rFonts w:ascii="Roboto Mono" w:hAnsi="Roboto Mono"/>
+                <w:sz w:val="20"/>
+                <w:szCs w:val="20"/>
+              </w:rPr>
+              <w:t>{{</w:t>
+            </w:r>
+            <w:r>
+              <w:rPr>
+                <w:rFonts w:ascii="Roboto Mono" w:hAnsi="Roboto Mono"/>
+                <w:sz w:val="20"/>
+                <w:szCs w:val="20"/>
+              </w:rPr>
+              <w:t>obs_generales</w:t>
+            </w:r>
+            <w:r>
+              <w:rPr>
+                <w:rFonts w:ascii="Roboto Mono" w:hAnsi="Roboto Mono"/>
+                <w:sz w:val="20"/>
+                <w:szCs w:val="20"/>
+              </w:rPr>
+              <w:t>}}</w:t>
             </w:r>
           </w:p>
         </w:tc>
@@ -848,21 +1065,28 @@
           <w:tcPr>
             <w:tcW w:w="4390" w:type="dxa"/>
             <w:tcBorders>
+              <w:bottom w:val="nil"/>
               <w:right w:val="single" w:sz="4" w:space="0" w:color="auto"/>
             </w:tcBorders>
             <w:shd w:val="clear" w:color="auto" w:fill="E8E8E8" w:themeFill="background2"/>
-          </w:tcPr>
-          <w:p>
-            <w:pPr>
-              <w:rPr>
-                <w:rFonts w:ascii="Roboto Mono" w:hAnsi="Roboto Mono"/>
-                <w:sz w:val="20"/>
-                <w:szCs w:val="20"/>
-              </w:rPr>
-            </w:pPr>
-            <w:r>
-              <w:rPr>
-                <w:rFonts w:ascii="Roboto Mono" w:hAnsi="Roboto Mono"/>
+            <w:vAlign w:val="center"/>
+          </w:tcPr>
+          <w:p>
+            <w:pPr>
+              <w:jc w:val="center"/>
+              <w:rPr>
+                <w:rFonts w:ascii="Roboto Mono" w:hAnsi="Roboto Mono"/>
+                <w:b/>
+                <w:bCs/>
+                <w:sz w:val="20"/>
+                <w:szCs w:val="20"/>
+              </w:rPr>
+            </w:pPr>
+            <w:r>
+              <w:rPr>
+                <w:rFonts w:ascii="Roboto Mono" w:hAnsi="Roboto Mono"/>
+                <w:b/>
+                <w:bCs/>
                 <w:sz w:val="20"/>
                 <w:szCs w:val="20"/>
               </w:rPr>
@@ -882,6 +1106,7 @@
           </w:tcPr>
           <w:p>
             <w:pPr>
+              <w:jc w:val="center"/>
               <w:rPr>
                 <w:rFonts w:ascii="Roboto Mono" w:hAnsi="Roboto Mono"/>
                 <w:sz w:val="20"/>
@@ -895,20 +1120,27 @@
             <w:tcW w:w="4343" w:type="dxa"/>
             <w:tcBorders>
               <w:left w:val="single" w:sz="4" w:space="0" w:color="auto"/>
+              <w:bottom w:val="nil"/>
             </w:tcBorders>
             <w:shd w:val="clear" w:color="auto" w:fill="E8E8E8" w:themeFill="background2"/>
-          </w:tcPr>
-          <w:p>
-            <w:pPr>
-              <w:rPr>
-                <w:rFonts w:ascii="Roboto Mono" w:hAnsi="Roboto Mono"/>
-                <w:sz w:val="20"/>
-                <w:szCs w:val="20"/>
-              </w:rPr>
-            </w:pPr>
-            <w:r>
-              <w:rPr>
-                <w:rFonts w:ascii="Roboto Mono" w:hAnsi="Roboto Mono"/>
+            <w:vAlign w:val="center"/>
+          </w:tcPr>
+          <w:p>
+            <w:pPr>
+              <w:jc w:val="center"/>
+              <w:rPr>
+                <w:rFonts w:ascii="Roboto Mono" w:hAnsi="Roboto Mono"/>
+                <w:b/>
+                <w:bCs/>
+                <w:sz w:val="20"/>
+                <w:szCs w:val="20"/>
+              </w:rPr>
+            </w:pPr>
+            <w:r>
+              <w:rPr>
+                <w:rFonts w:ascii="Roboto Mono" w:hAnsi="Roboto Mono"/>
+                <w:b/>
+                <w:bCs/>
                 <w:sz w:val="20"/>
                 <w:szCs w:val="20"/>
               </w:rPr>
@@ -922,18 +1154,29 @@
           <w:tcPr>
             <w:tcW w:w="4390" w:type="dxa"/>
             <w:tcBorders>
+              <w:top w:val="nil"/>
               <w:right w:val="single" w:sz="4" w:space="0" w:color="auto"/>
             </w:tcBorders>
             <w:shd w:val="clear" w:color="auto" w:fill="E8E8E8" w:themeFill="background2"/>
-          </w:tcPr>
-          <w:p>
-            <w:pPr>
-              <w:rPr>
-                <w:rFonts w:ascii="Roboto Mono" w:hAnsi="Roboto Mono"/>
-                <w:sz w:val="20"/>
-                <w:szCs w:val="20"/>
-              </w:rPr>
-            </w:pPr>
+            <w:vAlign w:val="center"/>
+          </w:tcPr>
+          <w:p>
+            <w:pPr>
+              <w:jc w:val="center"/>
+              <w:rPr>
+                <w:rFonts w:ascii="Roboto Mono" w:hAnsi="Roboto Mono"/>
+                <w:sz w:val="20"/>
+                <w:szCs w:val="20"/>
+              </w:rPr>
+            </w:pPr>
+            <w:r>
+              <w:rPr>
+                <w:rFonts w:ascii="Roboto Mono" w:hAnsi="Roboto Mono"/>
+                <w:sz w:val="20"/>
+                <w:szCs w:val="20"/>
+              </w:rPr>
+              <w:t>{{img_1}}</w:t>
+            </w:r>
           </w:p>
         </w:tc>
         <w:tc>
@@ -960,18 +1203,29 @@
           <w:tcPr>
             <w:tcW w:w="4343" w:type="dxa"/>
             <w:tcBorders>
+              <w:top w:val="nil"/>
               <w:left w:val="single" w:sz="4" w:space="0" w:color="auto"/>
             </w:tcBorders>
             <w:shd w:val="clear" w:color="auto" w:fill="E8E8E8" w:themeFill="background2"/>
-          </w:tcPr>
-          <w:p>
-            <w:pPr>
-              <w:rPr>
-                <w:rFonts w:ascii="Roboto Mono" w:hAnsi="Roboto Mono"/>
-                <w:sz w:val="20"/>
-                <w:szCs w:val="20"/>
-              </w:rPr>
-            </w:pPr>
+            <w:vAlign w:val="center"/>
+          </w:tcPr>
+          <w:p>
+            <w:pPr>
+              <w:jc w:val="center"/>
+              <w:rPr>
+                <w:rFonts w:ascii="Roboto Mono" w:hAnsi="Roboto Mono"/>
+                <w:sz w:val="20"/>
+                <w:szCs w:val="20"/>
+              </w:rPr>
+            </w:pPr>
+            <w:r>
+              <w:rPr>
+                <w:rFonts w:ascii="Roboto Mono" w:hAnsi="Roboto Mono"/>
+                <w:sz w:val="20"/>
+                <w:szCs w:val="20"/>
+              </w:rPr>
+              <w:t>{{img_2}}</w:t>
+            </w:r>
           </w:p>
         </w:tc>
       </w:tr>
@@ -999,6 +1253,7 @@
           <w:tcPr>
             <w:tcW w:w="9016" w:type="dxa"/>
             <w:shd w:val="clear" w:color="auto" w:fill="E8E8E8" w:themeFill="background2"/>
+            <w:vAlign w:val="center"/>
           </w:tcPr>
           <w:p>
             <w:pPr>
@@ -1029,6 +1284,7 @@
           <w:tcPr>
             <w:tcW w:w="9016" w:type="dxa"/>
             <w:shd w:val="clear" w:color="auto" w:fill="E8E8E8" w:themeFill="background2"/>
+            <w:vAlign w:val="center"/>
           </w:tcPr>
           <w:p>
             <w:pPr>
@@ -1064,6 +1320,7 @@
           <w:tcPr>
             <w:tcW w:w="9016" w:type="dxa"/>
             <w:shd w:val="clear" w:color="auto" w:fill="E8E8E8" w:themeFill="background2"/>
+            <w:vAlign w:val="center"/>
           </w:tcPr>
           <w:p>
             <w:pPr>
@@ -1099,6 +1356,7 @@
           <w:tcPr>
             <w:tcW w:w="9016" w:type="dxa"/>
             <w:shd w:val="clear" w:color="auto" w:fill="E8E8E8" w:themeFill="background2"/>
+            <w:vAlign w:val="center"/>
           </w:tcPr>
           <w:p>
             <w:pPr>
@@ -1158,6 +1416,7 @@
               <w:right w:val="single" w:sz="4" w:space="0" w:color="auto"/>
             </w:tcBorders>
             <w:shd w:val="clear" w:color="auto" w:fill="E8E8E8" w:themeFill="background2"/>
+            <w:vAlign w:val="center"/>
           </w:tcPr>
           <w:p>
             <w:pPr>
@@ -1203,31 +1462,40 @@
             <w:tcBorders>
               <w:left w:val="single" w:sz="4" w:space="0" w:color="auto"/>
             </w:tcBorders>
-            <w:shd w:val="clear" w:color="auto" w:fill="E8E8E8" w:themeFill="background2"/>
-          </w:tcPr>
-          <w:p>
-            <w:pPr>
-              <w:rPr>
-                <w:rFonts w:ascii="Roboto Mono" w:hAnsi="Roboto Mono"/>
-                <w:sz w:val="20"/>
-                <w:szCs w:val="20"/>
-              </w:rPr>
-            </w:pPr>
-            <w:r>
-              <w:rPr>
-                <w:rFonts w:ascii="Roboto Mono" w:hAnsi="Roboto Mono"/>
-                <w:sz w:val="20"/>
-                <w:szCs w:val="20"/>
-              </w:rPr>
-              <w:t xml:space="preserve">Recomendaciones </w:t>
-            </w:r>
-            <w:r>
-              <w:rPr>
-                <w:rFonts w:ascii="Roboto Mono" w:hAnsi="Roboto Mono"/>
-                <w:sz w:val="20"/>
-                <w:szCs w:val="20"/>
-              </w:rPr>
-              <w:t xml:space="preserve"> Específicas</w:t>
+            <w:shd w:val="clear" w:color="auto" w:fill="E8E8E8"/>
+            <w:vAlign w:val="center"/>
+          </w:tcPr>
+          <w:p>
+            <w:pPr>
+              <w:rPr>
+                <w:rFonts w:ascii="Roboto Mono" w:hAnsi="Roboto Mono"/>
+                <w:sz w:val="20"/>
+                <w:szCs w:val="20"/>
+              </w:rPr>
+            </w:pPr>
+            <w:r>
+              <w:rPr>
+                <w:rFonts w:ascii="Roboto Mono" w:hAnsi="Roboto Mono"/>
+                <w:sz w:val="20"/>
+                <w:szCs w:val="20"/>
+              </w:rPr>
+              <w:t>Recomendacion</w:t>
+            </w:r>
+            <w:r>
+              <w:rPr>
+                <w:rFonts w:ascii="Roboto Mono" w:hAnsi="Roboto Mono"/>
+                <w:sz w:val="20"/>
+                <w:szCs w:val="20"/>
+              </w:rPr>
+              <w:t xml:space="preserve"> Específica</w:t>
+            </w:r>
+            <w:r>
+              <w:rPr>
+                <w:rFonts w:ascii="Roboto Mono" w:hAnsi="Roboto Mono"/>
+                <w:sz w:val="20"/>
+                <w:szCs w:val="20"/>
+              </w:rPr>
+              <w:t xml:space="preserve"> 1</w:t>
             </w:r>
           </w:p>
         </w:tc>
@@ -1236,19 +1504,45 @@
         <w:tc>
           <w:tcPr>
             <w:tcW w:w="4248" w:type="dxa"/>
+            <w:vMerge w:val="restart"/>
             <w:tcBorders>
               <w:right w:val="single" w:sz="4" w:space="0" w:color="auto"/>
             </w:tcBorders>
             <w:shd w:val="clear" w:color="auto" w:fill="E8E8E8" w:themeFill="background2"/>
-          </w:tcPr>
-          <w:p>
-            <w:pPr>
-              <w:rPr>
-                <w:rFonts w:ascii="Roboto Mono" w:hAnsi="Roboto Mono"/>
-                <w:sz w:val="20"/>
-                <w:szCs w:val="20"/>
-              </w:rPr>
-            </w:pPr>
+            <w:vAlign w:val="center"/>
+          </w:tcPr>
+          <w:p>
+            <w:pPr>
+              <w:rPr>
+                <w:rFonts w:ascii="Roboto Mono" w:hAnsi="Roboto Mono"/>
+                <w:sz w:val="20"/>
+                <w:szCs w:val="20"/>
+              </w:rPr>
+            </w:pPr>
+            <w:r>
+              <w:rPr>
+                <w:rFonts w:ascii="Roboto Mono" w:hAnsi="Roboto Mono"/>
+                <w:sz w:val="20"/>
+                <w:szCs w:val="20"/>
+              </w:rPr>
+              <w:t>{{</w:t>
+            </w:r>
+            <w:r>
+              <w:rPr>
+                <w:rFonts w:ascii="Roboto Mono" w:hAnsi="Roboto Mono"/>
+                <w:sz w:val="20"/>
+                <w:szCs w:val="20"/>
+              </w:rPr>
+              <w:t>reco_general</w:t>
+            </w:r>
+            <w:r>
+              <w:rPr>
+                <w:rFonts w:ascii="Roboto Mono" w:hAnsi="Roboto Mono"/>
+                <w:sz w:val="20"/>
+                <w:szCs w:val="20"/>
+              </w:rPr>
+              <w:t>}}</w:t>
+            </w:r>
           </w:p>
         </w:tc>
         <w:tc>
@@ -1277,15 +1571,362 @@
             <w:tcBorders>
               <w:left w:val="single" w:sz="4" w:space="0" w:color="auto"/>
             </w:tcBorders>
-          </w:tcPr>
-          <w:p>
-            <w:pPr>
-              <w:rPr>
-                <w:rFonts w:ascii="Roboto Mono" w:hAnsi="Roboto Mono"/>
-                <w:sz w:val="20"/>
-                <w:szCs w:val="20"/>
-              </w:rPr>
-            </w:pPr>
+            <w:vAlign w:val="center"/>
+          </w:tcPr>
+          <w:p>
+            <w:pPr>
+              <w:rPr>
+                <w:rFonts w:ascii="Roboto Mono" w:hAnsi="Roboto Mono"/>
+                <w:sz w:val="20"/>
+                <w:szCs w:val="20"/>
+              </w:rPr>
+            </w:pPr>
+            <w:r>
+              <w:rPr>
+                <w:rFonts w:ascii="Roboto Mono" w:hAnsi="Roboto Mono"/>
+                <w:sz w:val="20"/>
+                <w:szCs w:val="20"/>
+              </w:rPr>
+              <w:t>{{</w:t>
+            </w:r>
+            <w:r>
+              <w:rPr>
+                <w:rFonts w:ascii="Roboto Mono" w:hAnsi="Roboto Mono"/>
+                <w:sz w:val="20"/>
+                <w:szCs w:val="20"/>
+              </w:rPr>
+              <w:t>reco_especificas_</w:t>
+            </w:r>
+            <w:r>
+              <w:rPr>
+                <w:rFonts w:ascii="Roboto Mono" w:hAnsi="Roboto Mono"/>
+                <w:sz w:val="20"/>
+                <w:szCs w:val="20"/>
+              </w:rPr>
+              <w:t>1}}</w:t>
+            </w:r>
+          </w:p>
+        </w:tc>
+      </w:tr>
+      <w:tr>
+        <w:tc>
+          <w:tcPr>
+            <w:tcW w:w="4248" w:type="dxa"/>
+            <w:vMerge/>
+            <w:tcBorders>
+              <w:right w:val="single" w:sz="4" w:space="0" w:color="auto"/>
+            </w:tcBorders>
+            <w:shd w:val="clear" w:color="auto" w:fill="E8E8E8" w:themeFill="background2"/>
+            <w:vAlign w:val="center"/>
+          </w:tcPr>
+          <w:p>
+            <w:pPr>
+              <w:rPr>
+                <w:rFonts w:ascii="Roboto Mono" w:hAnsi="Roboto Mono"/>
+                <w:sz w:val="20"/>
+                <w:szCs w:val="20"/>
+              </w:rPr>
+            </w:pPr>
+          </w:p>
+        </w:tc>
+        <w:tc>
+          <w:tcPr>
+            <w:tcW w:w="283" w:type="dxa"/>
+            <w:tcBorders>
+              <w:top w:val="nil"/>
+              <w:left w:val="single" w:sz="4" w:space="0" w:color="auto"/>
+              <w:bottom w:val="nil"/>
+              <w:right w:val="single" w:sz="4" w:space="0" w:color="auto"/>
+            </w:tcBorders>
+          </w:tcPr>
+          <w:p>
+            <w:pPr>
+              <w:rPr>
+                <w:rFonts w:ascii="Roboto Mono" w:hAnsi="Roboto Mono"/>
+                <w:sz w:val="20"/>
+                <w:szCs w:val="20"/>
+              </w:rPr>
+            </w:pPr>
+          </w:p>
+        </w:tc>
+        <w:tc>
+          <w:tcPr>
+            <w:tcW w:w="4485" w:type="dxa"/>
+            <w:tcBorders>
+              <w:left w:val="single" w:sz="4" w:space="0" w:color="auto"/>
+            </w:tcBorders>
+            <w:shd w:val="clear" w:color="auto" w:fill="E8E8E8"/>
+            <w:vAlign w:val="center"/>
+          </w:tcPr>
+          <w:p>
+            <w:pPr>
+              <w:rPr>
+                <w:rFonts w:ascii="Roboto Mono" w:hAnsi="Roboto Mono"/>
+                <w:sz w:val="20"/>
+                <w:szCs w:val="20"/>
+              </w:rPr>
+            </w:pPr>
+            <w:r>
+              <w:rPr>
+                <w:rFonts w:ascii="Roboto Mono" w:hAnsi="Roboto Mono"/>
+                <w:sz w:val="20"/>
+                <w:szCs w:val="20"/>
+              </w:rPr>
+              <w:t xml:space="preserve">Recomendacion </w:t>
+            </w:r>
+            <w:r>
+              <w:rPr>
+                <w:rFonts w:ascii="Roboto Mono" w:hAnsi="Roboto Mono"/>
+                <w:sz w:val="20"/>
+                <w:szCs w:val="20"/>
+              </w:rPr>
+              <w:t>Específica 2</w:t>
+            </w:r>
+          </w:p>
+        </w:tc>
+      </w:tr>
+      <w:tr>
+        <w:tc>
+          <w:tcPr>
+            <w:tcW w:w="4248" w:type="dxa"/>
+            <w:vMerge/>
+            <w:tcBorders>
+              <w:right w:val="single" w:sz="4" w:space="0" w:color="auto"/>
+            </w:tcBorders>
+            <w:shd w:val="clear" w:color="auto" w:fill="E8E8E8" w:themeFill="background2"/>
+            <w:vAlign w:val="center"/>
+          </w:tcPr>
+          <w:p>
+            <w:pPr>
+              <w:rPr>
+                <w:rFonts w:ascii="Roboto Mono" w:hAnsi="Roboto Mono"/>
+                <w:sz w:val="20"/>
+                <w:szCs w:val="20"/>
+              </w:rPr>
+            </w:pPr>
+          </w:p>
+        </w:tc>
+        <w:tc>
+          <w:tcPr>
+            <w:tcW w:w="283" w:type="dxa"/>
+            <w:tcBorders>
+              <w:top w:val="nil"/>
+              <w:left w:val="single" w:sz="4" w:space="0" w:color="auto"/>
+              <w:bottom w:val="nil"/>
+              <w:right w:val="single" w:sz="4" w:space="0" w:color="auto"/>
+            </w:tcBorders>
+          </w:tcPr>
+          <w:p>
+            <w:pPr>
+              <w:rPr>
+                <w:rFonts w:ascii="Roboto Mono" w:hAnsi="Roboto Mono"/>
+                <w:sz w:val="20"/>
+                <w:szCs w:val="20"/>
+              </w:rPr>
+            </w:pPr>
+          </w:p>
+        </w:tc>
+        <w:tc>
+          <w:tcPr>
+            <w:tcW w:w="4485" w:type="dxa"/>
+            <w:tcBorders>
+              <w:left w:val="single" w:sz="4" w:space="0" w:color="auto"/>
+            </w:tcBorders>
+            <w:vAlign w:val="center"/>
+          </w:tcPr>
+          <w:p>
+            <w:pPr>
+              <w:rPr>
+                <w:rFonts w:ascii="Roboto Mono" w:hAnsi="Roboto Mono"/>
+                <w:sz w:val="20"/>
+                <w:szCs w:val="20"/>
+              </w:rPr>
+            </w:pPr>
+            <w:r>
+              <w:rPr>
+                <w:rFonts w:ascii="Roboto Mono" w:hAnsi="Roboto Mono"/>
+                <w:sz w:val="20"/>
+                <w:szCs w:val="20"/>
+              </w:rPr>
+              <w:t>{{</w:t>
+            </w:r>
+            <w:r>
+              <w:rPr>
+                <w:rFonts w:ascii="Roboto Mono" w:hAnsi="Roboto Mono"/>
+                <w:sz w:val="20"/>
+                <w:szCs w:val="20"/>
+              </w:rPr>
+              <w:t>reco_especificas_</w:t>
+            </w:r>
+            <w:r>
+              <w:rPr>
+                <w:rFonts w:ascii="Roboto Mono" w:hAnsi="Roboto Mono"/>
+                <w:sz w:val="20"/>
+                <w:szCs w:val="20"/>
+              </w:rPr>
+              <w:t>2}}</w:t>
+            </w:r>
+          </w:p>
+        </w:tc>
+      </w:tr>
+      <w:tr>
+        <w:tc>
+          <w:tcPr>
+            <w:tcW w:w="4248" w:type="dxa"/>
+            <w:vMerge/>
+            <w:tcBorders>
+              <w:right w:val="single" w:sz="4" w:space="0" w:color="auto"/>
+            </w:tcBorders>
+            <w:shd w:val="clear" w:color="auto" w:fill="E8E8E8" w:themeFill="background2"/>
+            <w:vAlign w:val="center"/>
+          </w:tcPr>
+          <w:p>
+            <w:pPr>
+              <w:rPr>
+                <w:rFonts w:ascii="Roboto Mono" w:hAnsi="Roboto Mono"/>
+                <w:sz w:val="20"/>
+                <w:szCs w:val="20"/>
+              </w:rPr>
+            </w:pPr>
+          </w:p>
+        </w:tc>
+        <w:tc>
+          <w:tcPr>
+            <w:tcW w:w="283" w:type="dxa"/>
+            <w:tcBorders>
+              <w:top w:val="nil"/>
+              <w:left w:val="single" w:sz="4" w:space="0" w:color="auto"/>
+              <w:bottom w:val="nil"/>
+              <w:right w:val="single" w:sz="4" w:space="0" w:color="auto"/>
+            </w:tcBorders>
+          </w:tcPr>
+          <w:p>
+            <w:pPr>
+              <w:rPr>
+                <w:rFonts w:ascii="Roboto Mono" w:hAnsi="Roboto Mono"/>
+                <w:sz w:val="20"/>
+                <w:szCs w:val="20"/>
+              </w:rPr>
+            </w:pPr>
+          </w:p>
+        </w:tc>
+        <w:tc>
+          <w:tcPr>
+            <w:tcW w:w="4485" w:type="dxa"/>
+            <w:tcBorders>
+              <w:left w:val="single" w:sz="4" w:space="0" w:color="auto"/>
+            </w:tcBorders>
+            <w:shd w:val="clear" w:color="auto" w:fill="E8E8E8"/>
+            <w:vAlign w:val="center"/>
+          </w:tcPr>
+          <w:p>
+            <w:pPr>
+              <w:rPr>
+                <w:rFonts w:ascii="Roboto Mono" w:hAnsi="Roboto Mono"/>
+                <w:sz w:val="20"/>
+                <w:szCs w:val="20"/>
+              </w:rPr>
+            </w:pPr>
+            <w:r>
+              <w:rPr>
+                <w:rFonts w:ascii="Roboto Mono" w:hAnsi="Roboto Mono"/>
+                <w:sz w:val="20"/>
+                <w:szCs w:val="20"/>
+              </w:rPr>
+              <w:t xml:space="preserve">Recomendacion </w:t>
+            </w:r>
+            <w:r>
+              <w:rPr>
+                <w:rFonts w:ascii="Roboto Mono" w:hAnsi="Roboto Mono"/>
+                <w:sz w:val="20"/>
+                <w:szCs w:val="20"/>
+              </w:rPr>
+              <w:t>Específica 3</w:t>
+            </w:r>
+          </w:p>
+        </w:tc>
+      </w:tr>
+      <w:tr>
+        <w:tc>
+          <w:tcPr>
+            <w:tcW w:w="4248" w:type="dxa"/>
+            <w:vMerge/>
+            <w:tcBorders>
+              <w:right w:val="single" w:sz="4" w:space="0" w:color="auto"/>
+            </w:tcBorders>
+            <w:shd w:val="clear" w:color="auto" w:fill="E8E8E8" w:themeFill="background2"/>
+            <w:vAlign w:val="center"/>
+          </w:tcPr>
+          <w:p>
+            <w:pPr>
+              <w:rPr>
+                <w:rFonts w:ascii="Roboto Mono" w:hAnsi="Roboto Mono"/>
+                <w:sz w:val="20"/>
+                <w:szCs w:val="20"/>
+              </w:rPr>
+            </w:pPr>
+          </w:p>
+        </w:tc>
+        <w:tc>
+          <w:tcPr>
+            <w:tcW w:w="283" w:type="dxa"/>
+            <w:tcBorders>
+              <w:top w:val="nil"/>
+              <w:left w:val="single" w:sz="4" w:space="0" w:color="auto"/>
+              <w:bottom w:val="nil"/>
+              <w:right w:val="single" w:sz="4" w:space="0" w:color="auto"/>
+            </w:tcBorders>
+          </w:tcPr>
+          <w:p>
+            <w:pPr>
+              <w:rPr>
+                <w:rFonts w:ascii="Roboto Mono" w:hAnsi="Roboto Mono"/>
+                <w:sz w:val="20"/>
+                <w:szCs w:val="20"/>
+              </w:rPr>
+            </w:pPr>
+          </w:p>
+        </w:tc>
+        <w:tc>
+          <w:tcPr>
+            <w:tcW w:w="4485" w:type="dxa"/>
+            <w:tcBorders>
+              <w:left w:val="single" w:sz="4" w:space="0" w:color="auto"/>
+            </w:tcBorders>
+            <w:vAlign w:val="center"/>
+          </w:tcPr>
+          <w:p>
+            <w:pPr>
+              <w:rPr>
+                <w:rFonts w:ascii="Roboto Mono" w:hAnsi="Roboto Mono"/>
+                <w:sz w:val="20"/>
+                <w:szCs w:val="20"/>
+              </w:rPr>
+            </w:pPr>
+            <w:r>
+              <w:rPr>
+                <w:rFonts w:ascii="Roboto Mono" w:hAnsi="Roboto Mono"/>
+                <w:sz w:val="20"/>
+                <w:szCs w:val="20"/>
+              </w:rPr>
+              <w:t>{{</w:t>
+            </w:r>
+            <w:r>
+              <w:rPr>
+                <w:rFonts w:ascii="Roboto Mono" w:hAnsi="Roboto Mono"/>
+                <w:sz w:val="20"/>
+                <w:szCs w:val="20"/>
+              </w:rPr>
+              <w:t>reco_especificas_</w:t>
+            </w:r>
+            <w:r>
+              <w:rPr>
+                <w:rFonts w:ascii="Roboto Mono" w:hAnsi="Roboto Mono"/>
+                <w:sz w:val="20"/>
+                <w:szCs w:val="20"/>
+              </w:rPr>
+              <w:t>3}}</w:t>
+            </w:r>
           </w:p>
         </w:tc>
       </w:tr>
@@ -1318,6 +1959,7 @@
               <w:right w:val="single" w:sz="4" w:space="0" w:color="auto"/>
             </w:tcBorders>
             <w:shd w:val="clear" w:color="auto" w:fill="E8E8E8" w:themeFill="background2"/>
+            <w:vAlign w:val="center"/>
           </w:tcPr>
           <w:p>
             <w:pPr>
@@ -1334,6 +1976,39 @@
                 <w:szCs w:val="20"/>
               </w:rPr>
               <w:t>Plaguicidas utilizados:</w:t>
+            </w:r>
+          </w:p>
+          <w:p>
+            <w:pPr>
+              <w:rPr>
+                <w:rFonts w:ascii="Roboto Mono" w:hAnsi="Roboto Mono"/>
+                <w:sz w:val="20"/>
+                <w:szCs w:val="20"/>
+              </w:rPr>
+            </w:pPr>
+            <w:r>
+              <w:rPr>
+                <w:rFonts w:ascii="Roboto Mono" w:hAnsi="Roboto Mono"/>
+                <w:sz w:val="20"/>
+                <w:szCs w:val="20"/>
+              </w:rPr>
+              <w:t>{{</w:t>
+            </w:r>
+            <w:r>
+              <w:rPr>
+                <w:rFonts w:ascii="Roboto Mono" w:hAnsi="Roboto Mono"/>
+                <w:sz w:val="20"/>
+                <w:szCs w:val="20"/>
+              </w:rPr>
+              <w:t>plaguicidas</w:t>
+            </w:r>
+            <w:r>
+              <w:rPr>
+                <w:rFonts w:ascii="Roboto Mono" w:hAnsi="Roboto Mono"/>
+                <w:sz w:val="20"/>
+                <w:szCs w:val="20"/>
+              </w:rPr>
+              <w:t>}}</w:t>
             </w:r>
           </w:p>
         </w:tc>
@@ -1364,6 +2039,7 @@
               <w:left w:val="single" w:sz="4" w:space="0" w:color="auto"/>
             </w:tcBorders>
             <w:shd w:val="clear" w:color="auto" w:fill="E8E8E8" w:themeFill="background2"/>
+            <w:vAlign w:val="center"/>
           </w:tcPr>
           <w:p>
             <w:pPr>
@@ -1380,6 +2056,39 @@
                 <w:szCs w:val="20"/>
               </w:rPr>
               <w:t>Métodos de control utilizados:</w:t>
+            </w:r>
+          </w:p>
+          <w:p>
+            <w:pPr>
+              <w:rPr>
+                <w:rFonts w:ascii="Roboto Mono" w:hAnsi="Roboto Mono"/>
+                <w:sz w:val="20"/>
+                <w:szCs w:val="20"/>
+              </w:rPr>
+            </w:pPr>
+            <w:r>
+              <w:rPr>
+                <w:rFonts w:ascii="Roboto Mono" w:hAnsi="Roboto Mono"/>
+                <w:sz w:val="20"/>
+                <w:szCs w:val="20"/>
+              </w:rPr>
+              <w:t>{{</w:t>
+            </w:r>
+            <w:r>
+              <w:rPr>
+                <w:rFonts w:ascii="Roboto Mono" w:hAnsi="Roboto Mono"/>
+                <w:sz w:val="20"/>
+                <w:szCs w:val="20"/>
+              </w:rPr>
+              <w:t>metodo_control</w:t>
+            </w:r>
+            <w:r>
+              <w:rPr>
+                <w:rFonts w:ascii="Roboto Mono" w:hAnsi="Roboto Mono"/>
+                <w:sz w:val="20"/>
+                <w:szCs w:val="20"/>
+              </w:rPr>
+              <w:t>}}</w:t>
             </w:r>
           </w:p>
         </w:tc>
@@ -1438,15 +2147,40 @@
             <w:tcBorders>
               <w:right w:val="single" w:sz="4" w:space="0" w:color="auto"/>
             </w:tcBorders>
-          </w:tcPr>
-          <w:p>
-            <w:pPr>
-              <w:rPr>
-                <w:rFonts w:ascii="Roboto Mono" w:hAnsi="Roboto Mono"/>
-                <w:sz w:val="20"/>
-                <w:szCs w:val="20"/>
-              </w:rPr>
-            </w:pPr>
+            <w:vAlign w:val="center"/>
+          </w:tcPr>
+          <w:p>
+            <w:pPr>
+              <w:rPr>
+                <w:rFonts w:ascii="Roboto Mono" w:hAnsi="Roboto Mono"/>
+                <w:sz w:val="20"/>
+                <w:szCs w:val="20"/>
+              </w:rPr>
+            </w:pPr>
+            <w:r>
+              <w:rPr>
+                <w:rFonts w:ascii="Roboto Mono" w:hAnsi="Roboto Mono"/>
+                <w:sz w:val="20"/>
+                <w:szCs w:val="20"/>
+              </w:rPr>
+              <w:t>{{</w:t>
+            </w:r>
+            <w:r>
+              <w:rPr>
+                <w:rFonts w:ascii="Roboto Mono" w:hAnsi="Roboto Mono"/>
+                <w:sz w:val="20"/>
+                <w:szCs w:val="20"/>
+              </w:rPr>
+              <w:t>acompanante</w:t>
+            </w:r>
+            <w:r>
+              <w:rPr>
+                <w:rFonts w:ascii="Roboto Mono" w:hAnsi="Roboto Mono"/>
+                <w:sz w:val="20"/>
+                <w:szCs w:val="20"/>
+              </w:rPr>
+              <w:t>}}</w:t>
+            </w:r>
           </w:p>
         </w:tc>
         <w:tc>
@@ -1499,15 +2233,40 @@
         <w:tc>
           <w:tcPr>
             <w:tcW w:w="1804" w:type="dxa"/>
-          </w:tcPr>
-          <w:p>
-            <w:pPr>
-              <w:rPr>
-                <w:rFonts w:ascii="Roboto Mono" w:hAnsi="Roboto Mono"/>
-                <w:sz w:val="20"/>
-                <w:szCs w:val="20"/>
-              </w:rPr>
-            </w:pPr>
+            <w:vAlign w:val="center"/>
+          </w:tcPr>
+          <w:p>
+            <w:pPr>
+              <w:rPr>
+                <w:rFonts w:ascii="Roboto Mono" w:hAnsi="Roboto Mono"/>
+                <w:sz w:val="20"/>
+                <w:szCs w:val="20"/>
+              </w:rPr>
+            </w:pPr>
+            <w:r>
+              <w:rPr>
+                <w:rFonts w:ascii="Roboto Mono" w:hAnsi="Roboto Mono"/>
+                <w:sz w:val="20"/>
+                <w:szCs w:val="20"/>
+              </w:rPr>
+              <w:t>{{</w:t>
+            </w:r>
+            <w:r>
+              <w:rPr>
+                <w:rFonts w:ascii="Roboto Mono" w:hAnsi="Roboto Mono"/>
+                <w:sz w:val="20"/>
+                <w:szCs w:val="20"/>
+              </w:rPr>
+              <w:t>tecnicos</w:t>
+            </w:r>
+            <w:r>
+              <w:rPr>
+                <w:rFonts w:ascii="Roboto Mono" w:hAnsi="Roboto Mono"/>
+                <w:sz w:val="20"/>
+                <w:szCs w:val="20"/>
+              </w:rPr>
+              <w:t>}}</w:t>
+            </w:r>
           </w:p>
         </w:tc>
       </w:tr>
@@ -1542,15 +2301,40 @@
             <w:tcBorders>
               <w:right w:val="single" w:sz="4" w:space="0" w:color="auto"/>
             </w:tcBorders>
-          </w:tcPr>
-          <w:p>
-            <w:pPr>
-              <w:rPr>
-                <w:rFonts w:ascii="Roboto Mono" w:hAnsi="Roboto Mono"/>
-                <w:sz w:val="20"/>
-                <w:szCs w:val="20"/>
-              </w:rPr>
-            </w:pPr>
+            <w:vAlign w:val="center"/>
+          </w:tcPr>
+          <w:p>
+            <w:pPr>
+              <w:rPr>
+                <w:rFonts w:ascii="Roboto Mono" w:hAnsi="Roboto Mono"/>
+                <w:sz w:val="20"/>
+                <w:szCs w:val="20"/>
+              </w:rPr>
+            </w:pPr>
+            <w:r>
+              <w:rPr>
+                <w:rFonts w:ascii="Roboto Mono" w:hAnsi="Roboto Mono"/>
+                <w:sz w:val="20"/>
+                <w:szCs w:val="20"/>
+              </w:rPr>
+              <w:t>{{</w:t>
+            </w:r>
+            <w:r>
+              <w:rPr>
+                <w:rFonts w:ascii="Roboto Mono" w:hAnsi="Roboto Mono"/>
+                <w:sz w:val="20"/>
+                <w:szCs w:val="20"/>
+              </w:rPr>
+              <w:t>cargo</w:t>
+            </w:r>
+            <w:r>
+              <w:rPr>
+                <w:rFonts w:ascii="Roboto Mono" w:hAnsi="Roboto Mono"/>
+                <w:sz w:val="20"/>
+                <w:szCs w:val="20"/>
+              </w:rPr>
+              <w:t>}}</w:t>
+            </w:r>
           </w:p>
         </w:tc>
         <w:tc>
@@ -1603,15 +2387,132 @@
         <w:tc>
           <w:tcPr>
             <w:tcW w:w="1804" w:type="dxa"/>
-          </w:tcPr>
-          <w:p>
-            <w:pPr>
-              <w:rPr>
-                <w:rFonts w:ascii="Roboto Mono" w:hAnsi="Roboto Mono"/>
-                <w:sz w:val="20"/>
-                <w:szCs w:val="20"/>
-              </w:rPr>
-            </w:pPr>
+            <w:vAlign w:val="center"/>
+          </w:tcPr>
+          <w:p>
+            <w:pPr>
+              <w:rPr>
+                <w:rFonts w:ascii="Roboto Mono" w:hAnsi="Roboto Mono"/>
+                <w:sz w:val="20"/>
+                <w:szCs w:val="20"/>
+              </w:rPr>
+            </w:pPr>
+            <w:r>
+              <w:rPr>
+                <w:rFonts w:ascii="Roboto Mono" w:hAnsi="Roboto Mono"/>
+                <w:sz w:val="20"/>
+                <w:szCs w:val="20"/>
+              </w:rPr>
+              <w:t>{{</w:t>
+            </w:r>
+            <w:r>
+              <w:rPr>
+                <w:rFonts w:ascii="Roboto Mono" w:hAnsi="Roboto Mono"/>
+                <w:sz w:val="20"/>
+                <w:szCs w:val="20"/>
+              </w:rPr>
+              <w:t>tecnico encargado</w:t>
+            </w:r>
+            <w:r>
+              <w:rPr>
+                <w:rFonts w:ascii="Roboto Mono" w:hAnsi="Roboto Mono"/>
+                <w:sz w:val="20"/>
+                <w:szCs w:val="20"/>
+              </w:rPr>
+              <w:t>}}</w:t>
+            </w:r>
+          </w:p>
+        </w:tc>
+      </w:tr>
+    </w:tbl>
+    <w:p>
+      <w:pPr>
+        <w:rPr>
+          <w:rFonts w:ascii="Roboto Mono" w:hAnsi="Roboto Mono"/>
+          <w:sz w:val="20"/>
+          <w:szCs w:val="20"/>
+        </w:rPr>
+      </w:pPr>
+    </w:p>
+    <w:tbl>
+      <w:tblPr>
+        <w:tblStyle w:val="TableGrid"/>
+        <w:tblW w:w="0" w:type="auto"/>
+        <w:tblLook w:val="04A0" w:firstRow="1" w:lastRow="0" w:firstColumn="1" w:lastColumn="0" w:noHBand="0" w:noVBand="1"/>
+      </w:tblPr>
+      <w:tblGrid>
+        <w:gridCol w:w="9016"/>
+      </w:tblGrid>
+      <w:tr>
+        <w:tc>
+          <w:tcPr>
+            <w:tcW w:w="9016" w:type="dxa"/>
+            <w:shd w:val="clear" w:color="auto" w:fill="E8E8E8"/>
+            <w:vAlign w:val="center"/>
+          </w:tcPr>
+          <w:p>
+            <w:pPr>
+              <w:jc w:val="center"/>
+              <w:rPr>
+                <w:rFonts w:ascii="Roboto Mono" w:hAnsi="Roboto Mono"/>
+                <w:sz w:val="20"/>
+                <w:szCs w:val="20"/>
+              </w:rPr>
+            </w:pPr>
+            <w:r>
+              <w:rPr>
+                <w:rFonts w:ascii="Roboto Mono" w:hAnsi="Roboto Mono"/>
+                <w:sz w:val="20"/>
+                <w:szCs w:val="20"/>
+              </w:rPr>
+              <w:t>{{riesgos_internos_plot}}</w:t>
+            </w:r>
+          </w:p>
+        </w:tc>
+      </w:tr>
+    </w:tbl>
+    <w:p>
+      <w:pPr>
+        <w:rPr>
+          <w:rFonts w:ascii="Roboto Mono" w:hAnsi="Roboto Mono"/>
+          <w:sz w:val="20"/>
+          <w:szCs w:val="20"/>
+        </w:rPr>
+      </w:pPr>
+    </w:p>
+    <w:tbl>
+      <w:tblPr>
+        <w:tblStyle w:val="TableGrid"/>
+        <w:tblW w:w="0" w:type="auto"/>
+        <w:tblLook w:val="04A0" w:firstRow="1" w:lastRow="0" w:firstColumn="1" w:lastColumn="0" w:noHBand="0" w:noVBand="1"/>
+      </w:tblPr>
+      <w:tblGrid>
+        <w:gridCol w:w="9016"/>
+      </w:tblGrid>
+      <w:tr>
+        <w:tc>
+          <w:tcPr>
+            <w:tcW w:w="9016" w:type="dxa"/>
+            <w:shd w:val="clear" w:color="auto" w:fill="E8E8E8"/>
+            <w:vAlign w:val="center"/>
+          </w:tcPr>
+          <w:p>
+            <w:pPr>
+              <w:jc w:val="center"/>
+              <w:rPr>
+                <w:rFonts w:ascii="Roboto Mono" w:hAnsi="Roboto Mono"/>
+                <w:sz w:val="20"/>
+                <w:szCs w:val="20"/>
+              </w:rPr>
+            </w:pPr>
+            <w:r>
+              <w:rPr>
+                <w:rFonts w:ascii="Roboto Mono" w:hAnsi="Roboto Mono"/>
+                <w:sz w:val="20"/>
+                <w:szCs w:val="20"/>
+              </w:rPr>
+              <w:t>{{riesgos_externos_plot}}</w:t>
+            </w:r>
           </w:p>
         </w:tc>
       </w:tr>

</xml_diff>

<commit_message>
Agregar el codigo de streamlit listo para lanzar la aplicación
</commit_message>
<xml_diff>
--- a/INFORME TÉCNICO FINAL.docx
+++ b/INFORME TÉCNICO FINAL.docx
@@ -468,23 +468,7 @@
                 <w:sz w:val="20"/>
                 <w:szCs w:val="20"/>
               </w:rPr>
-              <w:t>{{</w:t>
-            </w:r>
-            <w:r>
-              <w:rPr>
-                <w:rFonts w:ascii="Roboto Mono" w:hAnsi="Roboto Mono"/>
-                <w:sz w:val="20"/>
-                <w:szCs w:val="20"/>
-              </w:rPr>
-              <w:t>municipio</w:t>
-            </w:r>
-            <w:r>
-              <w:rPr>
-                <w:rFonts w:ascii="Roboto Mono" w:hAnsi="Roboto Mono"/>
-                <w:sz w:val="20"/>
-                <w:szCs w:val="20"/>
-              </w:rPr>
-              <w:t>}}</w:t>
+              <w:t>{{municipio}}</w:t>
             </w:r>
           </w:p>
         </w:tc>
@@ -846,15 +830,7 @@
                 <w:sz w:val="20"/>
                 <w:szCs w:val="20"/>
               </w:rPr>
-              <w:t>Areas controladas:</w:t>
-            </w:r>
-            <w:r>
-              <w:rPr>
-                <w:rFonts w:ascii="Roboto Mono" w:hAnsi="Roboto Mono"/>
-                <w:sz w:val="20"/>
-                <w:szCs w:val="20"/>
-              </w:rPr>
-              <w:t xml:space="preserve"> {{</w:t>
+              <w:t>Areas controladas: {{</w:t>
             </w:r>
             <w:r>
               <w:rPr>
@@ -1404,14 +1380,14 @@
         <w:tblLook w:val="04A0" w:firstRow="1" w:lastRow="0" w:firstColumn="1" w:lastColumn="0" w:noHBand="0" w:noVBand="1"/>
       </w:tblPr>
       <w:tblGrid>
-        <w:gridCol w:w="4248"/>
-        <w:gridCol w:w="283"/>
-        <w:gridCol w:w="4485"/>
+        <w:gridCol w:w="5240"/>
+        <w:gridCol w:w="284"/>
+        <w:gridCol w:w="3492"/>
       </w:tblGrid>
       <w:tr>
         <w:tc>
           <w:tcPr>
-            <w:tcW w:w="4248" w:type="dxa"/>
+            <w:tcW w:w="5240" w:type="dxa"/>
             <w:tcBorders>
               <w:right w:val="single" w:sz="4" w:space="0" w:color="auto"/>
             </w:tcBorders>
@@ -1438,7 +1414,7 @@
         </w:tc>
         <w:tc>
           <w:tcPr>
-            <w:tcW w:w="283" w:type="dxa"/>
+            <w:tcW w:w="284" w:type="dxa"/>
             <w:tcBorders>
               <w:top w:val="nil"/>
               <w:left w:val="single" w:sz="4" w:space="0" w:color="auto"/>
@@ -1458,7 +1434,7 @@
         </w:tc>
         <w:tc>
           <w:tcPr>
-            <w:tcW w:w="4485" w:type="dxa"/>
+            <w:tcW w:w="3492" w:type="dxa"/>
             <w:tcBorders>
               <w:left w:val="single" w:sz="4" w:space="0" w:color="auto"/>
             </w:tcBorders>
@@ -1479,15 +1455,7 @@
                 <w:sz w:val="20"/>
                 <w:szCs w:val="20"/>
               </w:rPr>
-              <w:t>Recomendacion</w:t>
-            </w:r>
-            <w:r>
-              <w:rPr>
-                <w:rFonts w:ascii="Roboto Mono" w:hAnsi="Roboto Mono"/>
-                <w:sz w:val="20"/>
-                <w:szCs w:val="20"/>
-              </w:rPr>
-              <w:t xml:space="preserve"> Específica</w:t>
+              <w:t>Recomendacion Específica</w:t>
             </w:r>
             <w:r>
               <w:rPr>
@@ -1503,7 +1471,7 @@
       <w:tr>
         <w:tc>
           <w:tcPr>
-            <w:tcW w:w="4248" w:type="dxa"/>
+            <w:tcW w:w="5240" w:type="dxa"/>
             <w:vMerge w:val="restart"/>
             <w:tcBorders>
               <w:right w:val="single" w:sz="4" w:space="0" w:color="auto"/>
@@ -1525,29 +1493,13 @@
                 <w:sz w:val="20"/>
                 <w:szCs w:val="20"/>
               </w:rPr>
-              <w:t>{{</w:t>
-            </w:r>
-            <w:r>
-              <w:rPr>
-                <w:rFonts w:ascii="Roboto Mono" w:hAnsi="Roboto Mono"/>
-                <w:sz w:val="20"/>
-                <w:szCs w:val="20"/>
-              </w:rPr>
-              <w:t>reco_general</w:t>
-            </w:r>
-            <w:r>
-              <w:rPr>
-                <w:rFonts w:ascii="Roboto Mono" w:hAnsi="Roboto Mono"/>
-                <w:sz w:val="20"/>
-                <w:szCs w:val="20"/>
-              </w:rPr>
-              <w:t>}}</w:t>
-            </w:r>
-          </w:p>
-        </w:tc>
-        <w:tc>
-          <w:tcPr>
-            <w:tcW w:w="283" w:type="dxa"/>
+              <w:t>{{reco_general}}</w:t>
+            </w:r>
+          </w:p>
+        </w:tc>
+        <w:tc>
+          <w:tcPr>
+            <w:tcW w:w="284" w:type="dxa"/>
             <w:tcBorders>
               <w:top w:val="nil"/>
               <w:left w:val="single" w:sz="4" w:space="0" w:color="auto"/>
@@ -1567,7 +1519,7 @@
         </w:tc>
         <w:tc>
           <w:tcPr>
-            <w:tcW w:w="4485" w:type="dxa"/>
+            <w:tcW w:w="3492" w:type="dxa"/>
             <w:tcBorders>
               <w:left w:val="single" w:sz="4" w:space="0" w:color="auto"/>
             </w:tcBorders>
@@ -1587,23 +1539,7 @@
                 <w:sz w:val="20"/>
                 <w:szCs w:val="20"/>
               </w:rPr>
-              <w:t>{{</w:t>
-            </w:r>
-            <w:r>
-              <w:rPr>
-                <w:rFonts w:ascii="Roboto Mono" w:hAnsi="Roboto Mono"/>
-                <w:sz w:val="20"/>
-                <w:szCs w:val="20"/>
-              </w:rPr>
-              <w:t>reco_especificas_</w:t>
-            </w:r>
-            <w:r>
-              <w:rPr>
-                <w:rFonts w:ascii="Roboto Mono" w:hAnsi="Roboto Mono"/>
-                <w:sz w:val="20"/>
-                <w:szCs w:val="20"/>
-              </w:rPr>
-              <w:t>1}}</w:t>
+              <w:t>{{reco_especificas_1}}</w:t>
             </w:r>
           </w:p>
         </w:tc>
@@ -1611,7 +1547,7 @@
       <w:tr>
         <w:tc>
           <w:tcPr>
-            <w:tcW w:w="4248" w:type="dxa"/>
+            <w:tcW w:w="5240" w:type="dxa"/>
             <w:vMerge/>
             <w:tcBorders>
               <w:right w:val="single" w:sz="4" w:space="0" w:color="auto"/>
@@ -1631,7 +1567,7 @@
         </w:tc>
         <w:tc>
           <w:tcPr>
-            <w:tcW w:w="283" w:type="dxa"/>
+            <w:tcW w:w="284" w:type="dxa"/>
             <w:tcBorders>
               <w:top w:val="nil"/>
               <w:left w:val="single" w:sz="4" w:space="0" w:color="auto"/>
@@ -1651,7 +1587,7 @@
         </w:tc>
         <w:tc>
           <w:tcPr>
-            <w:tcW w:w="4485" w:type="dxa"/>
+            <w:tcW w:w="3492" w:type="dxa"/>
             <w:tcBorders>
               <w:left w:val="single" w:sz="4" w:space="0" w:color="auto"/>
             </w:tcBorders>
@@ -1672,15 +1608,7 @@
                 <w:sz w:val="20"/>
                 <w:szCs w:val="20"/>
               </w:rPr>
-              <w:t xml:space="preserve">Recomendacion </w:t>
-            </w:r>
-            <w:r>
-              <w:rPr>
-                <w:rFonts w:ascii="Roboto Mono" w:hAnsi="Roboto Mono"/>
-                <w:sz w:val="20"/>
-                <w:szCs w:val="20"/>
-              </w:rPr>
-              <w:t>Específica 2</w:t>
+              <w:t>Recomendacion Específica 2</w:t>
             </w:r>
           </w:p>
         </w:tc>
@@ -1688,7 +1616,7 @@
       <w:tr>
         <w:tc>
           <w:tcPr>
-            <w:tcW w:w="4248" w:type="dxa"/>
+            <w:tcW w:w="5240" w:type="dxa"/>
             <w:vMerge/>
             <w:tcBorders>
               <w:right w:val="single" w:sz="4" w:space="0" w:color="auto"/>
@@ -1708,7 +1636,7 @@
         </w:tc>
         <w:tc>
           <w:tcPr>
-            <w:tcW w:w="283" w:type="dxa"/>
+            <w:tcW w:w="284" w:type="dxa"/>
             <w:tcBorders>
               <w:top w:val="nil"/>
               <w:left w:val="single" w:sz="4" w:space="0" w:color="auto"/>
@@ -1728,7 +1656,7 @@
         </w:tc>
         <w:tc>
           <w:tcPr>
-            <w:tcW w:w="4485" w:type="dxa"/>
+            <w:tcW w:w="3492" w:type="dxa"/>
             <w:tcBorders>
               <w:left w:val="single" w:sz="4" w:space="0" w:color="auto"/>
             </w:tcBorders>
@@ -1748,23 +1676,7 @@
                 <w:sz w:val="20"/>
                 <w:szCs w:val="20"/>
               </w:rPr>
-              <w:t>{{</w:t>
-            </w:r>
-            <w:r>
-              <w:rPr>
-                <w:rFonts w:ascii="Roboto Mono" w:hAnsi="Roboto Mono"/>
-                <w:sz w:val="20"/>
-                <w:szCs w:val="20"/>
-              </w:rPr>
-              <w:t>reco_especificas_</w:t>
-            </w:r>
-            <w:r>
-              <w:rPr>
-                <w:rFonts w:ascii="Roboto Mono" w:hAnsi="Roboto Mono"/>
-                <w:sz w:val="20"/>
-                <w:szCs w:val="20"/>
-              </w:rPr>
-              <w:t>2}}</w:t>
+              <w:t>{{reco_especificas_2}}</w:t>
             </w:r>
           </w:p>
         </w:tc>
@@ -1772,7 +1684,7 @@
       <w:tr>
         <w:tc>
           <w:tcPr>
-            <w:tcW w:w="4248" w:type="dxa"/>
+            <w:tcW w:w="5240" w:type="dxa"/>
             <w:vMerge/>
             <w:tcBorders>
               <w:right w:val="single" w:sz="4" w:space="0" w:color="auto"/>
@@ -1792,7 +1704,7 @@
         </w:tc>
         <w:tc>
           <w:tcPr>
-            <w:tcW w:w="283" w:type="dxa"/>
+            <w:tcW w:w="284" w:type="dxa"/>
             <w:tcBorders>
               <w:top w:val="nil"/>
               <w:left w:val="single" w:sz="4" w:space="0" w:color="auto"/>
@@ -1812,7 +1724,7 @@
         </w:tc>
         <w:tc>
           <w:tcPr>
-            <w:tcW w:w="4485" w:type="dxa"/>
+            <w:tcW w:w="3492" w:type="dxa"/>
             <w:tcBorders>
               <w:left w:val="single" w:sz="4" w:space="0" w:color="auto"/>
             </w:tcBorders>
@@ -1833,15 +1745,7 @@
                 <w:sz w:val="20"/>
                 <w:szCs w:val="20"/>
               </w:rPr>
-              <w:t xml:space="preserve">Recomendacion </w:t>
-            </w:r>
-            <w:r>
-              <w:rPr>
-                <w:rFonts w:ascii="Roboto Mono" w:hAnsi="Roboto Mono"/>
-                <w:sz w:val="20"/>
-                <w:szCs w:val="20"/>
-              </w:rPr>
-              <w:t>Específica 3</w:t>
+              <w:t>Recomendacion Específica 3</w:t>
             </w:r>
           </w:p>
         </w:tc>
@@ -1849,7 +1753,7 @@
       <w:tr>
         <w:tc>
           <w:tcPr>
-            <w:tcW w:w="4248" w:type="dxa"/>
+            <w:tcW w:w="5240" w:type="dxa"/>
             <w:vMerge/>
             <w:tcBorders>
               <w:right w:val="single" w:sz="4" w:space="0" w:color="auto"/>
@@ -1869,7 +1773,7 @@
         </w:tc>
         <w:tc>
           <w:tcPr>
-            <w:tcW w:w="283" w:type="dxa"/>
+            <w:tcW w:w="284" w:type="dxa"/>
             <w:tcBorders>
               <w:top w:val="nil"/>
               <w:left w:val="single" w:sz="4" w:space="0" w:color="auto"/>
@@ -1889,7 +1793,7 @@
         </w:tc>
         <w:tc>
           <w:tcPr>
-            <w:tcW w:w="4485" w:type="dxa"/>
+            <w:tcW w:w="3492" w:type="dxa"/>
             <w:tcBorders>
               <w:left w:val="single" w:sz="4" w:space="0" w:color="auto"/>
             </w:tcBorders>
@@ -1909,23 +1813,7 @@
                 <w:sz w:val="20"/>
                 <w:szCs w:val="20"/>
               </w:rPr>
-              <w:t>{{</w:t>
-            </w:r>
-            <w:r>
-              <w:rPr>
-                <w:rFonts w:ascii="Roboto Mono" w:hAnsi="Roboto Mono"/>
-                <w:sz w:val="20"/>
-                <w:szCs w:val="20"/>
-              </w:rPr>
-              <w:t>reco_especificas_</w:t>
-            </w:r>
-            <w:r>
-              <w:rPr>
-                <w:rFonts w:ascii="Roboto Mono" w:hAnsi="Roboto Mono"/>
-                <w:sz w:val="20"/>
-                <w:szCs w:val="20"/>
-              </w:rPr>
-              <w:t>3}}</w:t>
+              <w:t>{{reco_especificas_3}}</w:t>
             </w:r>
           </w:p>
         </w:tc>
@@ -1992,23 +1880,7 @@
                 <w:sz w:val="20"/>
                 <w:szCs w:val="20"/>
               </w:rPr>
-              <w:t>{{</w:t>
-            </w:r>
-            <w:r>
-              <w:rPr>
-                <w:rFonts w:ascii="Roboto Mono" w:hAnsi="Roboto Mono"/>
-                <w:sz w:val="20"/>
-                <w:szCs w:val="20"/>
-              </w:rPr>
-              <w:t>plaguicidas</w:t>
-            </w:r>
-            <w:r>
-              <w:rPr>
-                <w:rFonts w:ascii="Roboto Mono" w:hAnsi="Roboto Mono"/>
-                <w:sz w:val="20"/>
-                <w:szCs w:val="20"/>
-              </w:rPr>
-              <w:t>}}</w:t>
+              <w:t>{{plaguicidas}}</w:t>
             </w:r>
           </w:p>
         </w:tc>
@@ -2072,23 +1944,7 @@
                 <w:sz w:val="20"/>
                 <w:szCs w:val="20"/>
               </w:rPr>
-              <w:t>{{</w:t>
-            </w:r>
-            <w:r>
-              <w:rPr>
-                <w:rFonts w:ascii="Roboto Mono" w:hAnsi="Roboto Mono"/>
-                <w:sz w:val="20"/>
-                <w:szCs w:val="20"/>
-              </w:rPr>
-              <w:t>metodo_control</w:t>
-            </w:r>
-            <w:r>
-              <w:rPr>
-                <w:rFonts w:ascii="Roboto Mono" w:hAnsi="Roboto Mono"/>
-                <w:sz w:val="20"/>
-                <w:szCs w:val="20"/>
-              </w:rPr>
-              <w:t>}}</w:t>
+              <w:t>{{metodo_control}}</w:t>
             </w:r>
           </w:p>
         </w:tc>
@@ -2163,23 +2019,7 @@
                 <w:sz w:val="20"/>
                 <w:szCs w:val="20"/>
               </w:rPr>
-              <w:t>{{</w:t>
-            </w:r>
-            <w:r>
-              <w:rPr>
-                <w:rFonts w:ascii="Roboto Mono" w:hAnsi="Roboto Mono"/>
-                <w:sz w:val="20"/>
-                <w:szCs w:val="20"/>
-              </w:rPr>
-              <w:t>acompanante</w:t>
-            </w:r>
-            <w:r>
-              <w:rPr>
-                <w:rFonts w:ascii="Roboto Mono" w:hAnsi="Roboto Mono"/>
-                <w:sz w:val="20"/>
-                <w:szCs w:val="20"/>
-              </w:rPr>
-              <w:t>}}</w:t>
+              <w:t>{{acompanante}}</w:t>
             </w:r>
           </w:p>
         </w:tc>
@@ -2249,23 +2089,7 @@
                 <w:sz w:val="20"/>
                 <w:szCs w:val="20"/>
               </w:rPr>
-              <w:t>{{</w:t>
-            </w:r>
-            <w:r>
-              <w:rPr>
-                <w:rFonts w:ascii="Roboto Mono" w:hAnsi="Roboto Mono"/>
-                <w:sz w:val="20"/>
-                <w:szCs w:val="20"/>
-              </w:rPr>
-              <w:t>tecnicos</w:t>
-            </w:r>
-            <w:r>
-              <w:rPr>
-                <w:rFonts w:ascii="Roboto Mono" w:hAnsi="Roboto Mono"/>
-                <w:sz w:val="20"/>
-                <w:szCs w:val="20"/>
-              </w:rPr>
-              <w:t>}}</w:t>
+              <w:t>{{tecnicos}}</w:t>
             </w:r>
           </w:p>
         </w:tc>
@@ -2317,23 +2141,7 @@
                 <w:sz w:val="20"/>
                 <w:szCs w:val="20"/>
               </w:rPr>
-              <w:t>{{</w:t>
-            </w:r>
-            <w:r>
-              <w:rPr>
-                <w:rFonts w:ascii="Roboto Mono" w:hAnsi="Roboto Mono"/>
-                <w:sz w:val="20"/>
-                <w:szCs w:val="20"/>
-              </w:rPr>
-              <w:t>cargo</w:t>
-            </w:r>
-            <w:r>
-              <w:rPr>
-                <w:rFonts w:ascii="Roboto Mono" w:hAnsi="Roboto Mono"/>
-                <w:sz w:val="20"/>
-                <w:szCs w:val="20"/>
-              </w:rPr>
-              <w:t>}}</w:t>
+              <w:t>{{cargo}}</w:t>
             </w:r>
           </w:p>
         </w:tc>
@@ -2403,23 +2211,7 @@
                 <w:sz w:val="20"/>
                 <w:szCs w:val="20"/>
               </w:rPr>
-              <w:t>{{</w:t>
-            </w:r>
-            <w:r>
-              <w:rPr>
-                <w:rFonts w:ascii="Roboto Mono" w:hAnsi="Roboto Mono"/>
-                <w:sz w:val="20"/>
-                <w:szCs w:val="20"/>
-              </w:rPr>
-              <w:t>tecnico encargado</w:t>
-            </w:r>
-            <w:r>
-              <w:rPr>
-                <w:rFonts w:ascii="Roboto Mono" w:hAnsi="Roboto Mono"/>
-                <w:sz w:val="20"/>
-                <w:szCs w:val="20"/>
-              </w:rPr>
-              <w:t>}}</w:t>
+              <w:t>{{tecnico encargado}}</w:t>
             </w:r>
           </w:p>
         </w:tc>

</xml_diff>

<commit_message>
actualización de la plantilla
</commit_message>
<xml_diff>
--- a/INFORME TÉCNICO FINAL.docx
+++ b/INFORME TÉCNICO FINAL.docx
@@ -51,7 +51,7 @@
                           <pic:cNvPicPr/>
                         </pic:nvPicPr>
                         <pic:blipFill>
-                          <a:blip r:embed="rId4" cstate="print">
+                          <a:blip r:embed="rId6" cstate="print">
                             <a:extLst>
                               <a:ext uri="{28A0092B-C50C-407E-A947-70E740481C1C}">
                                 <a14:useLocalDpi xmlns:a14="http://schemas.microsoft.com/office/drawing/2010/main" val="0"/>
@@ -2318,7 +2318,1082 @@
         </w:rPr>
       </w:pPr>
     </w:p>
+    <w:p>
+      <w:pPr>
+        <w:rPr>
+          <w:rFonts w:ascii="Roboto Mono" w:hAnsi="Roboto Mono"/>
+          <w:sz w:val="20"/>
+          <w:szCs w:val="20"/>
+        </w:rPr>
+      </w:pPr>
+    </w:p>
+    <w:p>
+      <w:pPr>
+        <w:rPr>
+          <w:rFonts w:ascii="Roboto Mono" w:hAnsi="Roboto Mono"/>
+          <w:sz w:val="20"/>
+          <w:szCs w:val="20"/>
+        </w:rPr>
+      </w:pPr>
+      <w:r>
+        <w:rPr>
+          <w:rFonts w:ascii="Roboto Mono" w:hAnsi="Roboto Mono"/>
+          <w:sz w:val="20"/>
+          <w:szCs w:val="20"/>
+        </w:rPr>
+        <w:t xml:space="preserve">Próximo control: </w:t>
+      </w:r>
+    </w:p>
+    <w:tbl>
+      <w:tblPr>
+        <w:tblStyle w:val="TableGrid"/>
+        <w:tblW w:w="0" w:type="auto"/>
+        <w:tblLook w:val="04A0" w:firstRow="1" w:lastRow="0" w:firstColumn="1" w:lastColumn="0" w:noHBand="0" w:noVBand="1"/>
+      </w:tblPr>
+      <w:tblGrid>
+        <w:gridCol w:w="4390"/>
+        <w:gridCol w:w="283"/>
+        <w:gridCol w:w="4343"/>
+      </w:tblGrid>
+      <w:tr>
+        <w:tc>
+          <w:tcPr>
+            <w:tcW w:w="9016" w:type="dxa"/>
+            <w:gridSpan w:val="3"/>
+            <w:shd w:val="clear" w:color="auto" w:fill="E8E8E8"/>
+            <w:vAlign w:val="center"/>
+          </w:tcPr>
+          <w:p>
+            <w:pPr>
+              <w:jc w:val="center"/>
+              <w:rPr>
+                <w:rFonts w:ascii="Roboto Mono" w:hAnsi="Roboto Mono"/>
+                <w:sz w:val="20"/>
+                <w:szCs w:val="20"/>
+              </w:rPr>
+            </w:pPr>
+            <w:r>
+              <w:rPr>
+                <w:rFonts w:ascii="Roboto Mono" w:hAnsi="Roboto Mono"/>
+                <w:sz w:val="20"/>
+                <w:szCs w:val="20"/>
+              </w:rPr>
+              <w:lastRenderedPageBreak/>
+              <w:t>Registro Fotográfico</w:t>
+            </w:r>
+          </w:p>
+        </w:tc>
+      </w:tr>
+      <w:tr>
+        <w:tc>
+          <w:tcPr>
+            <w:tcW w:w="4390" w:type="dxa"/>
+            <w:tcBorders>
+              <w:bottom w:val="single" w:sz="4" w:space="0" w:color="auto"/>
+              <w:right w:val="single" w:sz="4" w:space="0" w:color="auto"/>
+            </w:tcBorders>
+          </w:tcPr>
+          <w:p>
+            <w:pPr>
+              <w:rPr>
+                <w:rFonts w:ascii="Roboto Mono" w:hAnsi="Roboto Mono"/>
+                <w:sz w:val="20"/>
+                <w:szCs w:val="20"/>
+              </w:rPr>
+            </w:pPr>
+          </w:p>
+          <w:p>
+            <w:pPr>
+              <w:rPr>
+                <w:rFonts w:ascii="Roboto Mono" w:hAnsi="Roboto Mono"/>
+                <w:sz w:val="20"/>
+                <w:szCs w:val="20"/>
+              </w:rPr>
+            </w:pPr>
+          </w:p>
+          <w:p>
+            <w:pPr>
+              <w:rPr>
+                <w:rFonts w:ascii="Roboto Mono" w:hAnsi="Roboto Mono"/>
+                <w:sz w:val="20"/>
+                <w:szCs w:val="20"/>
+              </w:rPr>
+            </w:pPr>
+          </w:p>
+          <w:p>
+            <w:pPr>
+              <w:rPr>
+                <w:rFonts w:ascii="Roboto Mono" w:hAnsi="Roboto Mono"/>
+                <w:sz w:val="20"/>
+                <w:szCs w:val="20"/>
+              </w:rPr>
+            </w:pPr>
+          </w:p>
+          <w:p>
+            <w:pPr>
+              <w:rPr>
+                <w:rFonts w:ascii="Roboto Mono" w:hAnsi="Roboto Mono"/>
+                <w:sz w:val="20"/>
+                <w:szCs w:val="20"/>
+              </w:rPr>
+            </w:pPr>
+          </w:p>
+          <w:p>
+            <w:pPr>
+              <w:rPr>
+                <w:rFonts w:ascii="Roboto Mono" w:hAnsi="Roboto Mono"/>
+                <w:sz w:val="20"/>
+                <w:szCs w:val="20"/>
+              </w:rPr>
+            </w:pPr>
+          </w:p>
+          <w:p>
+            <w:pPr>
+              <w:rPr>
+                <w:rFonts w:ascii="Roboto Mono" w:hAnsi="Roboto Mono"/>
+                <w:sz w:val="20"/>
+                <w:szCs w:val="20"/>
+              </w:rPr>
+            </w:pPr>
+          </w:p>
+          <w:p>
+            <w:pPr>
+              <w:rPr>
+                <w:rFonts w:ascii="Roboto Mono" w:hAnsi="Roboto Mono"/>
+                <w:sz w:val="20"/>
+                <w:szCs w:val="20"/>
+              </w:rPr>
+            </w:pPr>
+          </w:p>
+          <w:p>
+            <w:pPr>
+              <w:rPr>
+                <w:rFonts w:ascii="Roboto Mono" w:hAnsi="Roboto Mono"/>
+                <w:sz w:val="20"/>
+                <w:szCs w:val="20"/>
+              </w:rPr>
+            </w:pPr>
+          </w:p>
+        </w:tc>
+        <w:tc>
+          <w:tcPr>
+            <w:tcW w:w="283" w:type="dxa"/>
+            <w:tcBorders>
+              <w:top w:val="nil"/>
+              <w:left w:val="single" w:sz="4" w:space="0" w:color="auto"/>
+              <w:bottom w:val="nil"/>
+              <w:right w:val="single" w:sz="4" w:space="0" w:color="auto"/>
+            </w:tcBorders>
+          </w:tcPr>
+          <w:p>
+            <w:pPr>
+              <w:rPr>
+                <w:rFonts w:ascii="Roboto Mono" w:hAnsi="Roboto Mono"/>
+                <w:sz w:val="20"/>
+                <w:szCs w:val="20"/>
+              </w:rPr>
+            </w:pPr>
+          </w:p>
+        </w:tc>
+        <w:tc>
+          <w:tcPr>
+            <w:tcW w:w="4343" w:type="dxa"/>
+            <w:tcBorders>
+              <w:left w:val="single" w:sz="4" w:space="0" w:color="auto"/>
+              <w:bottom w:val="single" w:sz="4" w:space="0" w:color="auto"/>
+            </w:tcBorders>
+          </w:tcPr>
+          <w:p>
+            <w:pPr>
+              <w:rPr>
+                <w:rFonts w:ascii="Roboto Mono" w:hAnsi="Roboto Mono"/>
+                <w:sz w:val="20"/>
+                <w:szCs w:val="20"/>
+              </w:rPr>
+            </w:pPr>
+          </w:p>
+          <w:p>
+            <w:pPr>
+              <w:rPr>
+                <w:rFonts w:ascii="Roboto Mono" w:hAnsi="Roboto Mono"/>
+                <w:sz w:val="20"/>
+                <w:szCs w:val="20"/>
+              </w:rPr>
+            </w:pPr>
+          </w:p>
+          <w:p>
+            <w:pPr>
+              <w:rPr>
+                <w:rFonts w:ascii="Roboto Mono" w:hAnsi="Roboto Mono"/>
+                <w:sz w:val="20"/>
+                <w:szCs w:val="20"/>
+              </w:rPr>
+            </w:pPr>
+          </w:p>
+          <w:p>
+            <w:pPr>
+              <w:rPr>
+                <w:rFonts w:ascii="Roboto Mono" w:hAnsi="Roboto Mono"/>
+                <w:sz w:val="20"/>
+                <w:szCs w:val="20"/>
+              </w:rPr>
+            </w:pPr>
+          </w:p>
+          <w:p>
+            <w:pPr>
+              <w:rPr>
+                <w:rFonts w:ascii="Roboto Mono" w:hAnsi="Roboto Mono"/>
+                <w:sz w:val="20"/>
+                <w:szCs w:val="20"/>
+              </w:rPr>
+            </w:pPr>
+          </w:p>
+          <w:p>
+            <w:pPr>
+              <w:rPr>
+                <w:rFonts w:ascii="Roboto Mono" w:hAnsi="Roboto Mono"/>
+                <w:sz w:val="20"/>
+                <w:szCs w:val="20"/>
+              </w:rPr>
+            </w:pPr>
+          </w:p>
+          <w:p>
+            <w:pPr>
+              <w:rPr>
+                <w:rFonts w:ascii="Roboto Mono" w:hAnsi="Roboto Mono"/>
+                <w:sz w:val="20"/>
+                <w:szCs w:val="20"/>
+              </w:rPr>
+            </w:pPr>
+          </w:p>
+          <w:p>
+            <w:pPr>
+              <w:rPr>
+                <w:rFonts w:ascii="Roboto Mono" w:hAnsi="Roboto Mono"/>
+                <w:sz w:val="20"/>
+                <w:szCs w:val="20"/>
+              </w:rPr>
+            </w:pPr>
+          </w:p>
+          <w:p>
+            <w:pPr>
+              <w:rPr>
+                <w:rFonts w:ascii="Roboto Mono" w:hAnsi="Roboto Mono"/>
+                <w:sz w:val="20"/>
+                <w:szCs w:val="20"/>
+              </w:rPr>
+            </w:pPr>
+          </w:p>
+        </w:tc>
+      </w:tr>
+      <w:tr>
+        <w:tc>
+          <w:tcPr>
+            <w:tcW w:w="4390" w:type="dxa"/>
+            <w:tcBorders>
+              <w:top w:val="single" w:sz="4" w:space="0" w:color="auto"/>
+              <w:left w:val="nil"/>
+              <w:bottom w:val="single" w:sz="4" w:space="0" w:color="auto"/>
+              <w:right w:val="nil"/>
+            </w:tcBorders>
+          </w:tcPr>
+          <w:p>
+            <w:pPr>
+              <w:rPr>
+                <w:rFonts w:ascii="Roboto Mono" w:hAnsi="Roboto Mono"/>
+                <w:sz w:val="20"/>
+                <w:szCs w:val="20"/>
+              </w:rPr>
+            </w:pPr>
+          </w:p>
+        </w:tc>
+        <w:tc>
+          <w:tcPr>
+            <w:tcW w:w="283" w:type="dxa"/>
+            <w:tcBorders>
+              <w:top w:val="nil"/>
+              <w:left w:val="nil"/>
+              <w:bottom w:val="nil"/>
+              <w:right w:val="nil"/>
+            </w:tcBorders>
+          </w:tcPr>
+          <w:p>
+            <w:pPr>
+              <w:rPr>
+                <w:rFonts w:ascii="Roboto Mono" w:hAnsi="Roboto Mono"/>
+                <w:sz w:val="20"/>
+                <w:szCs w:val="20"/>
+              </w:rPr>
+            </w:pPr>
+          </w:p>
+        </w:tc>
+        <w:tc>
+          <w:tcPr>
+            <w:tcW w:w="4343" w:type="dxa"/>
+            <w:tcBorders>
+              <w:top w:val="single" w:sz="4" w:space="0" w:color="auto"/>
+              <w:left w:val="nil"/>
+              <w:bottom w:val="single" w:sz="4" w:space="0" w:color="auto"/>
+              <w:right w:val="nil"/>
+            </w:tcBorders>
+          </w:tcPr>
+          <w:p>
+            <w:pPr>
+              <w:rPr>
+                <w:rFonts w:ascii="Roboto Mono" w:hAnsi="Roboto Mono"/>
+                <w:sz w:val="20"/>
+                <w:szCs w:val="20"/>
+              </w:rPr>
+            </w:pPr>
+          </w:p>
+        </w:tc>
+      </w:tr>
+      <w:tr>
+        <w:tc>
+          <w:tcPr>
+            <w:tcW w:w="4390" w:type="dxa"/>
+            <w:tcBorders>
+              <w:top w:val="single" w:sz="4" w:space="0" w:color="auto"/>
+              <w:bottom w:val="single" w:sz="4" w:space="0" w:color="auto"/>
+              <w:right w:val="single" w:sz="4" w:space="0" w:color="auto"/>
+            </w:tcBorders>
+          </w:tcPr>
+          <w:p>
+            <w:pPr>
+              <w:rPr>
+                <w:rFonts w:ascii="Roboto Mono" w:hAnsi="Roboto Mono"/>
+                <w:sz w:val="20"/>
+                <w:szCs w:val="20"/>
+              </w:rPr>
+            </w:pPr>
+          </w:p>
+          <w:p>
+            <w:pPr>
+              <w:rPr>
+                <w:rFonts w:ascii="Roboto Mono" w:hAnsi="Roboto Mono"/>
+                <w:sz w:val="20"/>
+                <w:szCs w:val="20"/>
+              </w:rPr>
+            </w:pPr>
+          </w:p>
+          <w:p>
+            <w:pPr>
+              <w:rPr>
+                <w:rFonts w:ascii="Roboto Mono" w:hAnsi="Roboto Mono"/>
+                <w:sz w:val="20"/>
+                <w:szCs w:val="20"/>
+              </w:rPr>
+            </w:pPr>
+          </w:p>
+          <w:p>
+            <w:pPr>
+              <w:rPr>
+                <w:rFonts w:ascii="Roboto Mono" w:hAnsi="Roboto Mono"/>
+                <w:sz w:val="20"/>
+                <w:szCs w:val="20"/>
+              </w:rPr>
+            </w:pPr>
+          </w:p>
+          <w:p>
+            <w:pPr>
+              <w:rPr>
+                <w:rFonts w:ascii="Roboto Mono" w:hAnsi="Roboto Mono"/>
+                <w:sz w:val="20"/>
+                <w:szCs w:val="20"/>
+              </w:rPr>
+            </w:pPr>
+          </w:p>
+          <w:p>
+            <w:pPr>
+              <w:rPr>
+                <w:rFonts w:ascii="Roboto Mono" w:hAnsi="Roboto Mono"/>
+                <w:sz w:val="20"/>
+                <w:szCs w:val="20"/>
+              </w:rPr>
+            </w:pPr>
+          </w:p>
+          <w:p>
+            <w:pPr>
+              <w:rPr>
+                <w:rFonts w:ascii="Roboto Mono" w:hAnsi="Roboto Mono"/>
+                <w:sz w:val="20"/>
+                <w:szCs w:val="20"/>
+              </w:rPr>
+            </w:pPr>
+          </w:p>
+          <w:p>
+            <w:pPr>
+              <w:rPr>
+                <w:rFonts w:ascii="Roboto Mono" w:hAnsi="Roboto Mono"/>
+                <w:sz w:val="20"/>
+                <w:szCs w:val="20"/>
+              </w:rPr>
+            </w:pPr>
+          </w:p>
+          <w:p>
+            <w:pPr>
+              <w:rPr>
+                <w:rFonts w:ascii="Roboto Mono" w:hAnsi="Roboto Mono"/>
+                <w:sz w:val="20"/>
+                <w:szCs w:val="20"/>
+              </w:rPr>
+            </w:pPr>
+          </w:p>
+        </w:tc>
+        <w:tc>
+          <w:tcPr>
+            <w:tcW w:w="283" w:type="dxa"/>
+            <w:tcBorders>
+              <w:top w:val="nil"/>
+              <w:left w:val="single" w:sz="4" w:space="0" w:color="auto"/>
+              <w:bottom w:val="nil"/>
+              <w:right w:val="single" w:sz="4" w:space="0" w:color="auto"/>
+            </w:tcBorders>
+          </w:tcPr>
+          <w:p>
+            <w:pPr>
+              <w:rPr>
+                <w:rFonts w:ascii="Roboto Mono" w:hAnsi="Roboto Mono"/>
+                <w:sz w:val="20"/>
+                <w:szCs w:val="20"/>
+              </w:rPr>
+            </w:pPr>
+          </w:p>
+        </w:tc>
+        <w:tc>
+          <w:tcPr>
+            <w:tcW w:w="4343" w:type="dxa"/>
+            <w:tcBorders>
+              <w:top w:val="single" w:sz="4" w:space="0" w:color="auto"/>
+              <w:left w:val="single" w:sz="4" w:space="0" w:color="auto"/>
+              <w:bottom w:val="single" w:sz="4" w:space="0" w:color="auto"/>
+            </w:tcBorders>
+          </w:tcPr>
+          <w:p>
+            <w:pPr>
+              <w:rPr>
+                <w:rFonts w:ascii="Roboto Mono" w:hAnsi="Roboto Mono"/>
+                <w:sz w:val="20"/>
+                <w:szCs w:val="20"/>
+              </w:rPr>
+            </w:pPr>
+          </w:p>
+          <w:p>
+            <w:pPr>
+              <w:rPr>
+                <w:rFonts w:ascii="Roboto Mono" w:hAnsi="Roboto Mono"/>
+                <w:sz w:val="20"/>
+                <w:szCs w:val="20"/>
+              </w:rPr>
+            </w:pPr>
+          </w:p>
+          <w:p>
+            <w:pPr>
+              <w:rPr>
+                <w:rFonts w:ascii="Roboto Mono" w:hAnsi="Roboto Mono"/>
+                <w:sz w:val="20"/>
+                <w:szCs w:val="20"/>
+              </w:rPr>
+            </w:pPr>
+          </w:p>
+          <w:p>
+            <w:pPr>
+              <w:rPr>
+                <w:rFonts w:ascii="Roboto Mono" w:hAnsi="Roboto Mono"/>
+                <w:sz w:val="20"/>
+                <w:szCs w:val="20"/>
+              </w:rPr>
+            </w:pPr>
+          </w:p>
+          <w:p>
+            <w:pPr>
+              <w:rPr>
+                <w:rFonts w:ascii="Roboto Mono" w:hAnsi="Roboto Mono"/>
+                <w:sz w:val="20"/>
+                <w:szCs w:val="20"/>
+              </w:rPr>
+            </w:pPr>
+          </w:p>
+          <w:p>
+            <w:pPr>
+              <w:rPr>
+                <w:rFonts w:ascii="Roboto Mono" w:hAnsi="Roboto Mono"/>
+                <w:sz w:val="20"/>
+                <w:szCs w:val="20"/>
+              </w:rPr>
+            </w:pPr>
+          </w:p>
+          <w:p>
+            <w:pPr>
+              <w:rPr>
+                <w:rFonts w:ascii="Roboto Mono" w:hAnsi="Roboto Mono"/>
+                <w:sz w:val="20"/>
+                <w:szCs w:val="20"/>
+              </w:rPr>
+            </w:pPr>
+          </w:p>
+          <w:p>
+            <w:pPr>
+              <w:rPr>
+                <w:rFonts w:ascii="Roboto Mono" w:hAnsi="Roboto Mono"/>
+                <w:sz w:val="20"/>
+                <w:szCs w:val="20"/>
+              </w:rPr>
+            </w:pPr>
+          </w:p>
+          <w:p>
+            <w:pPr>
+              <w:rPr>
+                <w:rFonts w:ascii="Roboto Mono" w:hAnsi="Roboto Mono"/>
+                <w:sz w:val="20"/>
+                <w:szCs w:val="20"/>
+              </w:rPr>
+            </w:pPr>
+          </w:p>
+        </w:tc>
+      </w:tr>
+      <w:tr>
+        <w:tc>
+          <w:tcPr>
+            <w:tcW w:w="4390" w:type="dxa"/>
+            <w:tcBorders>
+              <w:top w:val="single" w:sz="4" w:space="0" w:color="auto"/>
+              <w:left w:val="nil"/>
+              <w:bottom w:val="single" w:sz="4" w:space="0" w:color="auto"/>
+              <w:right w:val="nil"/>
+            </w:tcBorders>
+          </w:tcPr>
+          <w:p>
+            <w:pPr>
+              <w:rPr>
+                <w:rFonts w:ascii="Roboto Mono" w:hAnsi="Roboto Mono"/>
+                <w:sz w:val="20"/>
+                <w:szCs w:val="20"/>
+              </w:rPr>
+            </w:pPr>
+          </w:p>
+        </w:tc>
+        <w:tc>
+          <w:tcPr>
+            <w:tcW w:w="283" w:type="dxa"/>
+            <w:tcBorders>
+              <w:top w:val="nil"/>
+              <w:left w:val="nil"/>
+              <w:bottom w:val="nil"/>
+              <w:right w:val="nil"/>
+            </w:tcBorders>
+          </w:tcPr>
+          <w:p>
+            <w:pPr>
+              <w:rPr>
+                <w:rFonts w:ascii="Roboto Mono" w:hAnsi="Roboto Mono"/>
+                <w:sz w:val="20"/>
+                <w:szCs w:val="20"/>
+              </w:rPr>
+            </w:pPr>
+          </w:p>
+        </w:tc>
+        <w:tc>
+          <w:tcPr>
+            <w:tcW w:w="4343" w:type="dxa"/>
+            <w:tcBorders>
+              <w:top w:val="single" w:sz="4" w:space="0" w:color="auto"/>
+              <w:left w:val="nil"/>
+              <w:bottom w:val="single" w:sz="4" w:space="0" w:color="auto"/>
+              <w:right w:val="nil"/>
+            </w:tcBorders>
+          </w:tcPr>
+          <w:p>
+            <w:pPr>
+              <w:rPr>
+                <w:rFonts w:ascii="Roboto Mono" w:hAnsi="Roboto Mono"/>
+                <w:sz w:val="20"/>
+                <w:szCs w:val="20"/>
+              </w:rPr>
+            </w:pPr>
+          </w:p>
+        </w:tc>
+      </w:tr>
+      <w:tr>
+        <w:tc>
+          <w:tcPr>
+            <w:tcW w:w="4390" w:type="dxa"/>
+            <w:tcBorders>
+              <w:top w:val="single" w:sz="4" w:space="0" w:color="auto"/>
+              <w:bottom w:val="single" w:sz="4" w:space="0" w:color="auto"/>
+              <w:right w:val="single" w:sz="4" w:space="0" w:color="auto"/>
+            </w:tcBorders>
+          </w:tcPr>
+          <w:p>
+            <w:pPr>
+              <w:rPr>
+                <w:rFonts w:ascii="Roboto Mono" w:hAnsi="Roboto Mono"/>
+                <w:sz w:val="20"/>
+                <w:szCs w:val="20"/>
+              </w:rPr>
+            </w:pPr>
+          </w:p>
+          <w:p>
+            <w:pPr>
+              <w:rPr>
+                <w:rFonts w:ascii="Roboto Mono" w:hAnsi="Roboto Mono"/>
+                <w:sz w:val="20"/>
+                <w:szCs w:val="20"/>
+              </w:rPr>
+            </w:pPr>
+          </w:p>
+          <w:p>
+            <w:pPr>
+              <w:rPr>
+                <w:rFonts w:ascii="Roboto Mono" w:hAnsi="Roboto Mono"/>
+                <w:sz w:val="20"/>
+                <w:szCs w:val="20"/>
+              </w:rPr>
+            </w:pPr>
+          </w:p>
+          <w:p>
+            <w:pPr>
+              <w:rPr>
+                <w:rFonts w:ascii="Roboto Mono" w:hAnsi="Roboto Mono"/>
+                <w:sz w:val="20"/>
+                <w:szCs w:val="20"/>
+              </w:rPr>
+            </w:pPr>
+          </w:p>
+          <w:p>
+            <w:pPr>
+              <w:rPr>
+                <w:rFonts w:ascii="Roboto Mono" w:hAnsi="Roboto Mono"/>
+                <w:sz w:val="20"/>
+                <w:szCs w:val="20"/>
+              </w:rPr>
+            </w:pPr>
+          </w:p>
+          <w:p>
+            <w:pPr>
+              <w:rPr>
+                <w:rFonts w:ascii="Roboto Mono" w:hAnsi="Roboto Mono"/>
+                <w:sz w:val="20"/>
+                <w:szCs w:val="20"/>
+              </w:rPr>
+            </w:pPr>
+          </w:p>
+          <w:p>
+            <w:pPr>
+              <w:rPr>
+                <w:rFonts w:ascii="Roboto Mono" w:hAnsi="Roboto Mono"/>
+                <w:sz w:val="20"/>
+                <w:szCs w:val="20"/>
+              </w:rPr>
+            </w:pPr>
+          </w:p>
+          <w:p>
+            <w:pPr>
+              <w:rPr>
+                <w:rFonts w:ascii="Roboto Mono" w:hAnsi="Roboto Mono"/>
+                <w:sz w:val="20"/>
+                <w:szCs w:val="20"/>
+              </w:rPr>
+            </w:pPr>
+          </w:p>
+          <w:p>
+            <w:pPr>
+              <w:rPr>
+                <w:rFonts w:ascii="Roboto Mono" w:hAnsi="Roboto Mono"/>
+                <w:sz w:val="20"/>
+                <w:szCs w:val="20"/>
+              </w:rPr>
+            </w:pPr>
+          </w:p>
+        </w:tc>
+        <w:tc>
+          <w:tcPr>
+            <w:tcW w:w="283" w:type="dxa"/>
+            <w:tcBorders>
+              <w:top w:val="nil"/>
+              <w:left w:val="single" w:sz="4" w:space="0" w:color="auto"/>
+              <w:bottom w:val="nil"/>
+              <w:right w:val="single" w:sz="4" w:space="0" w:color="auto"/>
+            </w:tcBorders>
+          </w:tcPr>
+          <w:p>
+            <w:pPr>
+              <w:rPr>
+                <w:rFonts w:ascii="Roboto Mono" w:hAnsi="Roboto Mono"/>
+                <w:sz w:val="20"/>
+                <w:szCs w:val="20"/>
+              </w:rPr>
+            </w:pPr>
+          </w:p>
+        </w:tc>
+        <w:tc>
+          <w:tcPr>
+            <w:tcW w:w="4343" w:type="dxa"/>
+            <w:tcBorders>
+              <w:top w:val="single" w:sz="4" w:space="0" w:color="auto"/>
+              <w:left w:val="single" w:sz="4" w:space="0" w:color="auto"/>
+              <w:bottom w:val="single" w:sz="4" w:space="0" w:color="auto"/>
+            </w:tcBorders>
+          </w:tcPr>
+          <w:p>
+            <w:pPr>
+              <w:rPr>
+                <w:rFonts w:ascii="Roboto Mono" w:hAnsi="Roboto Mono"/>
+                <w:sz w:val="20"/>
+                <w:szCs w:val="20"/>
+              </w:rPr>
+            </w:pPr>
+          </w:p>
+          <w:p>
+            <w:pPr>
+              <w:rPr>
+                <w:rFonts w:ascii="Roboto Mono" w:hAnsi="Roboto Mono"/>
+                <w:sz w:val="20"/>
+                <w:szCs w:val="20"/>
+              </w:rPr>
+            </w:pPr>
+          </w:p>
+          <w:p>
+            <w:pPr>
+              <w:rPr>
+                <w:rFonts w:ascii="Roboto Mono" w:hAnsi="Roboto Mono"/>
+                <w:sz w:val="20"/>
+                <w:szCs w:val="20"/>
+              </w:rPr>
+            </w:pPr>
+          </w:p>
+          <w:p>
+            <w:pPr>
+              <w:rPr>
+                <w:rFonts w:ascii="Roboto Mono" w:hAnsi="Roboto Mono"/>
+                <w:sz w:val="20"/>
+                <w:szCs w:val="20"/>
+              </w:rPr>
+            </w:pPr>
+          </w:p>
+          <w:p>
+            <w:pPr>
+              <w:rPr>
+                <w:rFonts w:ascii="Roboto Mono" w:hAnsi="Roboto Mono"/>
+                <w:sz w:val="20"/>
+                <w:szCs w:val="20"/>
+              </w:rPr>
+            </w:pPr>
+          </w:p>
+          <w:p>
+            <w:pPr>
+              <w:rPr>
+                <w:rFonts w:ascii="Roboto Mono" w:hAnsi="Roboto Mono"/>
+                <w:sz w:val="20"/>
+                <w:szCs w:val="20"/>
+              </w:rPr>
+            </w:pPr>
+          </w:p>
+          <w:p>
+            <w:pPr>
+              <w:rPr>
+                <w:rFonts w:ascii="Roboto Mono" w:hAnsi="Roboto Mono"/>
+                <w:sz w:val="20"/>
+                <w:szCs w:val="20"/>
+              </w:rPr>
+            </w:pPr>
+          </w:p>
+          <w:p>
+            <w:pPr>
+              <w:rPr>
+                <w:rFonts w:ascii="Roboto Mono" w:hAnsi="Roboto Mono"/>
+                <w:sz w:val="20"/>
+                <w:szCs w:val="20"/>
+              </w:rPr>
+            </w:pPr>
+          </w:p>
+          <w:p>
+            <w:pPr>
+              <w:rPr>
+                <w:rFonts w:ascii="Roboto Mono" w:hAnsi="Roboto Mono"/>
+                <w:sz w:val="20"/>
+                <w:szCs w:val="20"/>
+              </w:rPr>
+            </w:pPr>
+          </w:p>
+        </w:tc>
+      </w:tr>
+      <w:tr>
+        <w:tc>
+          <w:tcPr>
+            <w:tcW w:w="4390" w:type="dxa"/>
+            <w:tcBorders>
+              <w:top w:val="single" w:sz="4" w:space="0" w:color="auto"/>
+              <w:left w:val="nil"/>
+              <w:bottom w:val="single" w:sz="4" w:space="0" w:color="auto"/>
+              <w:right w:val="nil"/>
+            </w:tcBorders>
+          </w:tcPr>
+          <w:p>
+            <w:pPr>
+              <w:rPr>
+                <w:rFonts w:ascii="Roboto Mono" w:hAnsi="Roboto Mono"/>
+                <w:sz w:val="20"/>
+                <w:szCs w:val="20"/>
+              </w:rPr>
+            </w:pPr>
+          </w:p>
+        </w:tc>
+        <w:tc>
+          <w:tcPr>
+            <w:tcW w:w="283" w:type="dxa"/>
+            <w:tcBorders>
+              <w:top w:val="nil"/>
+              <w:left w:val="nil"/>
+              <w:bottom w:val="nil"/>
+              <w:right w:val="nil"/>
+            </w:tcBorders>
+          </w:tcPr>
+          <w:p>
+            <w:pPr>
+              <w:rPr>
+                <w:rFonts w:ascii="Roboto Mono" w:hAnsi="Roboto Mono"/>
+                <w:sz w:val="20"/>
+                <w:szCs w:val="20"/>
+              </w:rPr>
+            </w:pPr>
+          </w:p>
+        </w:tc>
+        <w:tc>
+          <w:tcPr>
+            <w:tcW w:w="4343" w:type="dxa"/>
+            <w:tcBorders>
+              <w:top w:val="single" w:sz="4" w:space="0" w:color="auto"/>
+              <w:left w:val="nil"/>
+              <w:bottom w:val="single" w:sz="4" w:space="0" w:color="auto"/>
+              <w:right w:val="nil"/>
+            </w:tcBorders>
+          </w:tcPr>
+          <w:p>
+            <w:pPr>
+              <w:rPr>
+                <w:rFonts w:ascii="Roboto Mono" w:hAnsi="Roboto Mono"/>
+                <w:sz w:val="20"/>
+                <w:szCs w:val="20"/>
+              </w:rPr>
+            </w:pPr>
+          </w:p>
+        </w:tc>
+      </w:tr>
+      <w:tr>
+        <w:tc>
+          <w:tcPr>
+            <w:tcW w:w="4390" w:type="dxa"/>
+            <w:tcBorders>
+              <w:top w:val="single" w:sz="4" w:space="0" w:color="auto"/>
+              <w:right w:val="single" w:sz="4" w:space="0" w:color="auto"/>
+            </w:tcBorders>
+          </w:tcPr>
+          <w:p>
+            <w:pPr>
+              <w:rPr>
+                <w:rFonts w:ascii="Roboto Mono" w:hAnsi="Roboto Mono"/>
+                <w:sz w:val="20"/>
+                <w:szCs w:val="20"/>
+              </w:rPr>
+            </w:pPr>
+          </w:p>
+          <w:p>
+            <w:pPr>
+              <w:rPr>
+                <w:rFonts w:ascii="Roboto Mono" w:hAnsi="Roboto Mono"/>
+                <w:sz w:val="20"/>
+                <w:szCs w:val="20"/>
+              </w:rPr>
+            </w:pPr>
+          </w:p>
+          <w:p>
+            <w:pPr>
+              <w:rPr>
+                <w:rFonts w:ascii="Roboto Mono" w:hAnsi="Roboto Mono"/>
+                <w:sz w:val="20"/>
+                <w:szCs w:val="20"/>
+              </w:rPr>
+            </w:pPr>
+          </w:p>
+          <w:p>
+            <w:pPr>
+              <w:rPr>
+                <w:rFonts w:ascii="Roboto Mono" w:hAnsi="Roboto Mono"/>
+                <w:sz w:val="20"/>
+                <w:szCs w:val="20"/>
+              </w:rPr>
+            </w:pPr>
+          </w:p>
+          <w:p>
+            <w:pPr>
+              <w:rPr>
+                <w:rFonts w:ascii="Roboto Mono" w:hAnsi="Roboto Mono"/>
+                <w:sz w:val="20"/>
+                <w:szCs w:val="20"/>
+              </w:rPr>
+            </w:pPr>
+          </w:p>
+          <w:p>
+            <w:pPr>
+              <w:rPr>
+                <w:rFonts w:ascii="Roboto Mono" w:hAnsi="Roboto Mono"/>
+                <w:sz w:val="20"/>
+                <w:szCs w:val="20"/>
+              </w:rPr>
+            </w:pPr>
+          </w:p>
+          <w:p>
+            <w:pPr>
+              <w:rPr>
+                <w:rFonts w:ascii="Roboto Mono" w:hAnsi="Roboto Mono"/>
+                <w:sz w:val="20"/>
+                <w:szCs w:val="20"/>
+              </w:rPr>
+            </w:pPr>
+          </w:p>
+          <w:p>
+            <w:pPr>
+              <w:rPr>
+                <w:rFonts w:ascii="Roboto Mono" w:hAnsi="Roboto Mono"/>
+                <w:sz w:val="20"/>
+                <w:szCs w:val="20"/>
+              </w:rPr>
+            </w:pPr>
+          </w:p>
+          <w:p>
+            <w:pPr>
+              <w:rPr>
+                <w:rFonts w:ascii="Roboto Mono" w:hAnsi="Roboto Mono"/>
+                <w:sz w:val="20"/>
+                <w:szCs w:val="20"/>
+              </w:rPr>
+            </w:pPr>
+          </w:p>
+        </w:tc>
+        <w:tc>
+          <w:tcPr>
+            <w:tcW w:w="283" w:type="dxa"/>
+            <w:tcBorders>
+              <w:top w:val="nil"/>
+              <w:left w:val="single" w:sz="4" w:space="0" w:color="auto"/>
+              <w:bottom w:val="nil"/>
+              <w:right w:val="single" w:sz="4" w:space="0" w:color="auto"/>
+            </w:tcBorders>
+          </w:tcPr>
+          <w:p>
+            <w:pPr>
+              <w:rPr>
+                <w:rFonts w:ascii="Roboto Mono" w:hAnsi="Roboto Mono"/>
+                <w:sz w:val="20"/>
+                <w:szCs w:val="20"/>
+              </w:rPr>
+            </w:pPr>
+          </w:p>
+        </w:tc>
+        <w:tc>
+          <w:tcPr>
+            <w:tcW w:w="4343" w:type="dxa"/>
+            <w:tcBorders>
+              <w:top w:val="single" w:sz="4" w:space="0" w:color="auto"/>
+              <w:left w:val="single" w:sz="4" w:space="0" w:color="auto"/>
+            </w:tcBorders>
+          </w:tcPr>
+          <w:p>
+            <w:pPr>
+              <w:rPr>
+                <w:rFonts w:ascii="Roboto Mono" w:hAnsi="Roboto Mono"/>
+                <w:sz w:val="20"/>
+                <w:szCs w:val="20"/>
+              </w:rPr>
+            </w:pPr>
+          </w:p>
+          <w:p>
+            <w:pPr>
+              <w:rPr>
+                <w:rFonts w:ascii="Roboto Mono" w:hAnsi="Roboto Mono"/>
+                <w:sz w:val="20"/>
+                <w:szCs w:val="20"/>
+              </w:rPr>
+            </w:pPr>
+          </w:p>
+          <w:p>
+            <w:pPr>
+              <w:rPr>
+                <w:rFonts w:ascii="Roboto Mono" w:hAnsi="Roboto Mono"/>
+                <w:sz w:val="20"/>
+                <w:szCs w:val="20"/>
+              </w:rPr>
+            </w:pPr>
+          </w:p>
+          <w:p>
+            <w:pPr>
+              <w:rPr>
+                <w:rFonts w:ascii="Roboto Mono" w:hAnsi="Roboto Mono"/>
+                <w:sz w:val="20"/>
+                <w:szCs w:val="20"/>
+              </w:rPr>
+            </w:pPr>
+          </w:p>
+          <w:p>
+            <w:pPr>
+              <w:rPr>
+                <w:rFonts w:ascii="Roboto Mono" w:hAnsi="Roboto Mono"/>
+                <w:sz w:val="20"/>
+                <w:szCs w:val="20"/>
+              </w:rPr>
+            </w:pPr>
+          </w:p>
+          <w:p>
+            <w:pPr>
+              <w:rPr>
+                <w:rFonts w:ascii="Roboto Mono" w:hAnsi="Roboto Mono"/>
+                <w:sz w:val="20"/>
+                <w:szCs w:val="20"/>
+              </w:rPr>
+            </w:pPr>
+          </w:p>
+          <w:p>
+            <w:pPr>
+              <w:rPr>
+                <w:rFonts w:ascii="Roboto Mono" w:hAnsi="Roboto Mono"/>
+                <w:sz w:val="20"/>
+                <w:szCs w:val="20"/>
+              </w:rPr>
+            </w:pPr>
+          </w:p>
+          <w:p>
+            <w:pPr>
+              <w:rPr>
+                <w:rFonts w:ascii="Roboto Mono" w:hAnsi="Roboto Mono"/>
+                <w:sz w:val="20"/>
+                <w:szCs w:val="20"/>
+              </w:rPr>
+            </w:pPr>
+          </w:p>
+          <w:p>
+            <w:pPr>
+              <w:rPr>
+                <w:rFonts w:ascii="Roboto Mono" w:hAnsi="Roboto Mono"/>
+                <w:sz w:val="20"/>
+                <w:szCs w:val="20"/>
+              </w:rPr>
+            </w:pPr>
+          </w:p>
+        </w:tc>
+      </w:tr>
+    </w:tbl>
+    <w:p>
+      <w:pPr>
+        <w:rPr>
+          <w:rFonts w:ascii="Roboto Mono" w:hAnsi="Roboto Mono"/>
+          <w:sz w:val="20"/>
+          <w:szCs w:val="20"/>
+        </w:rPr>
+      </w:pPr>
+    </w:p>
     <w:sectPr>
+      <w:footerReference w:type="default" r:id="rId7"/>
       <w:pgSz w:w="11906" w:h="16838"/>
       <w:pgMar w:top="1440" w:right="1440" w:bottom="1440" w:left="1440" w:header="708" w:footer="708" w:gutter="0"/>
       <w:cols w:space="708"/>
@@ -2326,6 +3401,109 @@
     </w:sectPr>
   </w:body>
 </w:document>
+</file>
+
+<file path=word/endnotes.xml><?xml version="1.0" encoding="utf-8"?>
+<w:endnotes xmlns:wpc="http://schemas.microsoft.com/office/word/2010/wordprocessingCanvas" xmlns:cx="http://schemas.microsoft.com/office/drawing/2014/chartex" xmlns:cx1="http://schemas.microsoft.com/office/drawing/2015/9/8/chartex" xmlns:cx2="http://schemas.microsoft.com/office/drawing/2015/10/21/chartex" xmlns:cx3="http://schemas.microsoft.com/office/drawing/2016/5/9/chartex" xmlns:cx4="http://schemas.microsoft.com/office/drawing/2016/5/10/chartex" xmlns:cx5="http://schemas.microsoft.com/office/drawing/2016/5/11/chartex" xmlns:cx6="http://schemas.microsoft.com/office/drawing/2016/5/12/chartex" xmlns:cx7="http://schemas.microsoft.com/office/drawing/2016/5/13/chartex" xmlns:cx8="http://schemas.microsoft.com/office/drawing/2016/5/14/chartex" xmlns:mc="http://schemas.openxmlformats.org/markup-compatibility/2006" xmlns:aink="http://schemas.microsoft.com/office/drawing/2016/ink" xmlns:am3d="http://schemas.microsoft.com/office/drawing/2017/model3d" xmlns:o="urn:schemas-microsoft-com:office:office" xmlns:oel="http://schemas.microsoft.com/office/2019/extlst" xmlns:r="http://schemas.openxmlformats.org/officeDocument/2006/relationships" xmlns:m="http://schemas.openxmlformats.org/officeDocument/2006/math" xmlns:v="urn:schemas-microsoft-com:vml" xmlns:wp14="http://schemas.microsoft.com/office/word/2010/wordprocessingDrawing" xmlns:wp="http://schemas.openxmlformats.org/drawingml/2006/wordprocessingDrawing" xmlns:w10="urn:schemas-microsoft-com:office:word" xmlns:w="http://schemas.openxmlformats.org/wordprocessingml/2006/main" xmlns:w14="http://schemas.microsoft.com/office/word/2010/wordml" xmlns:w15="http://schemas.microsoft.com/office/word/2012/wordml" xmlns:w16cex="http://schemas.microsoft.com/office/word/2018/wordml/cex" xmlns:w16cid="http://schemas.microsoft.com/office/word/2016/wordml/cid" xmlns:w16="http://schemas.microsoft.com/office/word/2018/wordml" xmlns:w16du="http://schemas.microsoft.com/office/word/2023/wordml/word16du" xmlns:w16sdtdh="http://schemas.microsoft.com/office/word/2020/wordml/sdtdatahash" xmlns:w16sdtfl="http://schemas.microsoft.com/office/word/2024/wordml/sdtformatlock" xmlns:w16se="http://schemas.microsoft.com/office/word/2015/wordml/symex" xmlns:wpg="http://schemas.microsoft.com/office/word/2010/wordprocessingGroup" xmlns:wpi="http://schemas.microsoft.com/office/word/2010/wordprocessingInk" xmlns:wne="http://schemas.microsoft.com/office/word/2006/wordml" xmlns:wps="http://schemas.microsoft.com/office/word/2010/wordprocessingShape" mc:Ignorable="w14 w15 w16se w16cid w16 w16cex w16sdtdh w16sdtfl w16du wp14">
+  <w:endnote w:type="separator" w:id="-1">
+    <w:p>
+      <w:r>
+        <w:separator/>
+      </w:r>
+    </w:p>
+  </w:endnote>
+  <w:endnote w:type="continuationSeparator" w:id="0">
+    <w:p>
+      <w:r>
+        <w:continuationSeparator/>
+      </w:r>
+    </w:p>
+  </w:endnote>
+</w:endnotes>
+</file>
+
+<file path=word/footer1.xml><?xml version="1.0" encoding="utf-8"?>
+<w:ftr xmlns:wpc="http://schemas.microsoft.com/office/word/2010/wordprocessingCanvas" xmlns:cx="http://schemas.microsoft.com/office/drawing/2014/chartex" xmlns:cx1="http://schemas.microsoft.com/office/drawing/2015/9/8/chartex" xmlns:cx2="http://schemas.microsoft.com/office/drawing/2015/10/21/chartex" xmlns:cx3="http://schemas.microsoft.com/office/drawing/2016/5/9/chartex" xmlns:cx4="http://schemas.microsoft.com/office/drawing/2016/5/10/chartex" xmlns:cx5="http://schemas.microsoft.com/office/drawing/2016/5/11/chartex" xmlns:cx6="http://schemas.microsoft.com/office/drawing/2016/5/12/chartex" xmlns:cx7="http://schemas.microsoft.com/office/drawing/2016/5/13/chartex" xmlns:cx8="http://schemas.microsoft.com/office/drawing/2016/5/14/chartex" xmlns:mc="http://schemas.openxmlformats.org/markup-compatibility/2006" xmlns:aink="http://schemas.microsoft.com/office/drawing/2016/ink" xmlns:am3d="http://schemas.microsoft.com/office/drawing/2017/model3d" xmlns:o="urn:schemas-microsoft-com:office:office" xmlns:oel="http://schemas.microsoft.com/office/2019/extlst" xmlns:r="http://schemas.openxmlformats.org/officeDocument/2006/relationships" xmlns:m="http://schemas.openxmlformats.org/officeDocument/2006/math" xmlns:v="urn:schemas-microsoft-com:vml" xmlns:wp14="http://schemas.microsoft.com/office/word/2010/wordprocessingDrawing" xmlns:wp="http://schemas.openxmlformats.org/drawingml/2006/wordprocessingDrawing" xmlns:w10="urn:schemas-microsoft-com:office:word" xmlns:w="http://schemas.openxmlformats.org/wordprocessingml/2006/main" xmlns:w14="http://schemas.microsoft.com/office/word/2010/wordml" xmlns:w15="http://schemas.microsoft.com/office/word/2012/wordml" xmlns:w16cex="http://schemas.microsoft.com/office/word/2018/wordml/cex" xmlns:w16cid="http://schemas.microsoft.com/office/word/2016/wordml/cid" xmlns:w16="http://schemas.microsoft.com/office/word/2018/wordml" xmlns:w16du="http://schemas.microsoft.com/office/word/2023/wordml/word16du" xmlns:w16sdtdh="http://schemas.microsoft.com/office/word/2020/wordml/sdtdatahash" xmlns:w16sdtfl="http://schemas.microsoft.com/office/word/2024/wordml/sdtformatlock" xmlns:w16se="http://schemas.microsoft.com/office/word/2015/wordml/symex" xmlns:wpg="http://schemas.microsoft.com/office/word/2010/wordprocessingGroup" xmlns:wpi="http://schemas.microsoft.com/office/word/2010/wordprocessingInk" xmlns:wne="http://schemas.microsoft.com/office/word/2006/wordml" xmlns:wps="http://schemas.microsoft.com/office/word/2010/wordprocessingShape" mc:Ignorable="w14 w15 w16se w16cid w16 w16cex w16sdtdh w16sdtfl w16du wp14">
+  <w:p>
+    <w:pPr>
+      <w:pStyle w:val="Footer"/>
+      <w:jc w:val="center"/>
+    </w:pPr>
+    <w:r>
+      <w:rPr>
+        <w:noProof/>
+        <w:lang w:val="en-US"/>
+      </w:rPr>
+      <w:drawing>
+        <wp:inline distT="0" distB="0" distL="0" distR="0" wp14:anchorId="51A18B79" wp14:editId="3D707B9F">
+          <wp:extent cx="4476750" cy="409575"/>
+          <wp:effectExtent l="0" t="0" r="0" b="9525"/>
+          <wp:docPr id="19" name="Imagen 19"/>
+          <wp:cNvGraphicFramePr>
+            <a:graphicFrameLocks xmlns:a="http://schemas.openxmlformats.org/drawingml/2006/main" noChangeAspect="1"/>
+          </wp:cNvGraphicFramePr>
+          <a:graphic xmlns:a="http://schemas.openxmlformats.org/drawingml/2006/main">
+            <a:graphicData uri="http://schemas.openxmlformats.org/drawingml/2006/picture">
+              <pic:pic xmlns:pic="http://schemas.openxmlformats.org/drawingml/2006/picture">
+                <pic:nvPicPr>
+                  <pic:cNvPr id="0" name="Picture 1"/>
+                  <pic:cNvPicPr>
+                    <a:picLocks noChangeAspect="1" noChangeArrowheads="1"/>
+                  </pic:cNvPicPr>
+                </pic:nvPicPr>
+                <pic:blipFill>
+                  <a:blip r:embed="rId1" cstate="print">
+                    <a:extLst>
+                      <a:ext uri="{28A0092B-C50C-407E-A947-70E740481C1C}">
+                        <a14:useLocalDpi xmlns:a14="http://schemas.microsoft.com/office/drawing/2010/main" val="0"/>
+                      </a:ext>
+                    </a:extLst>
+                  </a:blip>
+                  <a:srcRect/>
+                  <a:stretch>
+                    <a:fillRect/>
+                  </a:stretch>
+                </pic:blipFill>
+                <pic:spPr bwMode="auto">
+                  <a:xfrm>
+                    <a:off x="0" y="0"/>
+                    <a:ext cx="4476750" cy="409575"/>
+                  </a:xfrm>
+                  <a:prstGeom prst="rect">
+                    <a:avLst/>
+                  </a:prstGeom>
+                  <a:noFill/>
+                  <a:ln>
+                    <a:noFill/>
+                  </a:ln>
+                </pic:spPr>
+              </pic:pic>
+            </a:graphicData>
+          </a:graphic>
+        </wp:inline>
+      </w:drawing>
+    </w:r>
+  </w:p>
+</w:ftr>
+</file>
+
+<file path=word/footnotes.xml><?xml version="1.0" encoding="utf-8"?>
+<w:footnotes xmlns:wpc="http://schemas.microsoft.com/office/word/2010/wordprocessingCanvas" xmlns:cx="http://schemas.microsoft.com/office/drawing/2014/chartex" xmlns:cx1="http://schemas.microsoft.com/office/drawing/2015/9/8/chartex" xmlns:cx2="http://schemas.microsoft.com/office/drawing/2015/10/21/chartex" xmlns:cx3="http://schemas.microsoft.com/office/drawing/2016/5/9/chartex" xmlns:cx4="http://schemas.microsoft.com/office/drawing/2016/5/10/chartex" xmlns:cx5="http://schemas.microsoft.com/office/drawing/2016/5/11/chartex" xmlns:cx6="http://schemas.microsoft.com/office/drawing/2016/5/12/chartex" xmlns:cx7="http://schemas.microsoft.com/office/drawing/2016/5/13/chartex" xmlns:cx8="http://schemas.microsoft.com/office/drawing/2016/5/14/chartex" xmlns:mc="http://schemas.openxmlformats.org/markup-compatibility/2006" xmlns:aink="http://schemas.microsoft.com/office/drawing/2016/ink" xmlns:am3d="http://schemas.microsoft.com/office/drawing/2017/model3d" xmlns:o="urn:schemas-microsoft-com:office:office" xmlns:oel="http://schemas.microsoft.com/office/2019/extlst" xmlns:r="http://schemas.openxmlformats.org/officeDocument/2006/relationships" xmlns:m="http://schemas.openxmlformats.org/officeDocument/2006/math" xmlns:v="urn:schemas-microsoft-com:vml" xmlns:wp14="http://schemas.microsoft.com/office/word/2010/wordprocessingDrawing" xmlns:wp="http://schemas.openxmlformats.org/drawingml/2006/wordprocessingDrawing" xmlns:w10="urn:schemas-microsoft-com:office:word" xmlns:w="http://schemas.openxmlformats.org/wordprocessingml/2006/main" xmlns:w14="http://schemas.microsoft.com/office/word/2010/wordml" xmlns:w15="http://schemas.microsoft.com/office/word/2012/wordml" xmlns:w16cex="http://schemas.microsoft.com/office/word/2018/wordml/cex" xmlns:w16cid="http://schemas.microsoft.com/office/word/2016/wordml/cid" xmlns:w16="http://schemas.microsoft.com/office/word/2018/wordml" xmlns:w16du="http://schemas.microsoft.com/office/word/2023/wordml/word16du" xmlns:w16sdtdh="http://schemas.microsoft.com/office/word/2020/wordml/sdtdatahash" xmlns:w16sdtfl="http://schemas.microsoft.com/office/word/2024/wordml/sdtformatlock" xmlns:w16se="http://schemas.microsoft.com/office/word/2015/wordml/symex" xmlns:wpg="http://schemas.microsoft.com/office/word/2010/wordprocessingGroup" xmlns:wpi="http://schemas.microsoft.com/office/word/2010/wordprocessingInk" xmlns:wne="http://schemas.microsoft.com/office/word/2006/wordml" xmlns:wps="http://schemas.microsoft.com/office/word/2010/wordprocessingShape" mc:Ignorable="w14 w15 w16se w16cid w16 w16cex w16sdtdh w16sdtfl w16du wp14">
+  <w:footnote w:type="separator" w:id="-1">
+    <w:p>
+      <w:r>
+        <w:separator/>
+      </w:r>
+    </w:p>
+  </w:footnote>
+  <w:footnote w:type="continuationSeparator" w:id="0">
+    <w:p>
+      <w:r>
+        <w:continuationSeparator/>
+      </w:r>
+    </w:p>
+  </w:footnote>
+</w:footnotes>
 </file>
 
 <file path=word/styles.xml><?xml version="1.0" encoding="utf-8"?>
@@ -3256,6 +4434,48 @@
       </w:tblBorders>
     </w:tblPr>
   </w:style>
+  <w:style w:type="paragraph" w:styleId="Header">
+    <w:name w:val="header"/>
+    <w:basedOn w:val="Normal"/>
+    <w:link w:val="HeaderChar"/>
+    <w:uiPriority w:val="99"/>
+    <w:unhideWhenUsed/>
+    <w:rsid w:val="00EC015D"/>
+    <w:pPr>
+      <w:tabs>
+        <w:tab w:val="center" w:pos="4513"/>
+        <w:tab w:val="right" w:pos="9026"/>
+      </w:tabs>
+    </w:pPr>
+  </w:style>
+  <w:style w:type="character" w:customStyle="1" w:styleId="HeaderChar">
+    <w:name w:val="Header Char"/>
+    <w:basedOn w:val="DefaultParagraphFont"/>
+    <w:link w:val="Header"/>
+    <w:uiPriority w:val="99"/>
+    <w:rsid w:val="00EC015D"/>
+  </w:style>
+  <w:style w:type="paragraph" w:styleId="Footer">
+    <w:name w:val="footer"/>
+    <w:basedOn w:val="Normal"/>
+    <w:link w:val="FooterChar"/>
+    <w:uiPriority w:val="99"/>
+    <w:unhideWhenUsed/>
+    <w:rsid w:val="00EC015D"/>
+    <w:pPr>
+      <w:tabs>
+        <w:tab w:val="center" w:pos="4513"/>
+        <w:tab w:val="right" w:pos="9026"/>
+      </w:tabs>
+    </w:pPr>
+  </w:style>
+  <w:style w:type="character" w:customStyle="1" w:styleId="FooterChar">
+    <w:name w:val="Footer Char"/>
+    <w:basedOn w:val="DefaultParagraphFont"/>
+    <w:link w:val="Footer"/>
+    <w:uiPriority w:val="99"/>
+    <w:rsid w:val="00EC015D"/>
+  </w:style>
 </w:styles>
 </file>
 

</xml_diff>

<commit_message>
Agregar integración con LLM (openai)
</commit_message>
<xml_diff>
--- a/INFORME TÉCNICO FINAL.docx
+++ b/INFORME TÉCNICO FINAL.docx
@@ -2226,43 +2226,203 @@
         </w:rPr>
       </w:pPr>
     </w:p>
-    <w:tbl>
-      <w:tblPr>
-        <w:tblStyle w:val="TableGrid"/>
-        <w:tblW w:w="0" w:type="auto"/>
-        <w:tblLook w:val="04A0" w:firstRow="1" w:lastRow="0" w:firstColumn="1" w:lastColumn="0" w:noHBand="0" w:noVBand="1"/>
-      </w:tblPr>
-      <w:tblGrid>
-        <w:gridCol w:w="9016"/>
-      </w:tblGrid>
-      <w:tr>
-        <w:tc>
-          <w:tcPr>
-            <w:tcW w:w="9016" w:type="dxa"/>
-            <w:shd w:val="clear" w:color="auto" w:fill="E8E8E8"/>
-            <w:vAlign w:val="center"/>
-          </w:tcPr>
-          <w:p>
-            <w:pPr>
-              <w:jc w:val="center"/>
-              <w:rPr>
-                <w:rFonts w:ascii="Roboto Mono" w:hAnsi="Roboto Mono"/>
-                <w:sz w:val="20"/>
-                <w:szCs w:val="20"/>
-              </w:rPr>
-            </w:pPr>
-            <w:r>
-              <w:rPr>
-                <w:rFonts w:ascii="Roboto Mono" w:hAnsi="Roboto Mono"/>
-                <w:sz w:val="20"/>
-                <w:szCs w:val="20"/>
-              </w:rPr>
-              <w:t>{{riesgos_internos_plot}}</w:t>
-            </w:r>
-          </w:p>
-        </w:tc>
-      </w:tr>
-    </w:tbl>
+    <w:p>
+      <w:pPr>
+        <w:jc w:val="both"/>
+        <w:rPr>
+          <w:rFonts w:ascii="Roboto Mono" w:hAnsi="Roboto Mono"/>
+          <w:sz w:val="20"/>
+          <w:szCs w:val="20"/>
+        </w:rPr>
+      </w:pPr>
+      <w:r>
+        <w:rPr>
+          <w:rFonts w:ascii="Roboto Mono" w:hAnsi="Roboto Mono"/>
+          <w:sz w:val="20"/>
+          <w:szCs w:val="20"/>
+        </w:rPr>
+        <w:t>Los siguientes gráficos presentan la proporción de los distintos factores de riesgo detectados durante el control de plagas realizado.</w:t>
+      </w:r>
+      <w:r>
+        <w:rPr>
+          <w:rFonts w:ascii="Roboto Mono" w:hAnsi="Roboto Mono"/>
+          <w:sz w:val="20"/>
+          <w:szCs w:val="20"/>
+        </w:rPr>
+        <w:t xml:space="preserve"> </w:t>
+      </w:r>
+      <w:r>
+        <w:rPr>
+          <w:rFonts w:ascii="Roboto Mono" w:hAnsi="Roboto Mono"/>
+          <w:sz w:val="20"/>
+          <w:szCs w:val="20"/>
+        </w:rPr>
+        <w:t>Cada segmento representa el porcentaje de incidencia de un tipo de riesgo identificado en las áreas evaluadas.</w:t>
+      </w:r>
+      <w:r>
+        <w:rPr>
+          <w:rFonts w:ascii="Roboto Mono" w:hAnsi="Roboto Mono"/>
+          <w:sz w:val="20"/>
+          <w:szCs w:val="20"/>
+        </w:rPr>
+        <w:t xml:space="preserve"> </w:t>
+      </w:r>
+      <w:r>
+        <w:rPr>
+          <w:rFonts w:ascii="Roboto Mono" w:hAnsi="Roboto Mono"/>
+          <w:sz w:val="20"/>
+          <w:szCs w:val="20"/>
+        </w:rPr>
+        <w:t>Las secciones más grandes indican mayor nivel de riesgo o mayor prioridad de intervención.</w:t>
+      </w:r>
+    </w:p>
+    <w:p>
+      <w:pPr>
+        <w:jc w:val="both"/>
+        <w:rPr>
+          <w:rFonts w:ascii="Roboto Mono" w:hAnsi="Roboto Mono"/>
+          <w:sz w:val="20"/>
+          <w:szCs w:val="20"/>
+        </w:rPr>
+      </w:pPr>
+      <w:r>
+        <w:rPr>
+          <w:rFonts w:ascii="Roboto Mono" w:hAnsi="Roboto Mono"/>
+          <w:sz w:val="20"/>
+          <w:szCs w:val="20"/>
+        </w:rPr>
+        <w:lastRenderedPageBreak/>
+        <w:t>Un mayor porcentaje en una categoría refleja mayor vulnerabilidad o exposición en ese aspecto.</w:t>
+      </w:r>
+      <w:r>
+        <w:rPr>
+          <w:rFonts w:ascii="Roboto Mono" w:hAnsi="Roboto Mono"/>
+          <w:sz w:val="20"/>
+          <w:szCs w:val="20"/>
+        </w:rPr>
+        <w:t xml:space="preserve"> </w:t>
+      </w:r>
+      <w:r>
+        <w:rPr>
+          <w:rFonts w:ascii="Roboto Mono" w:hAnsi="Roboto Mono"/>
+          <w:sz w:val="20"/>
+          <w:szCs w:val="20"/>
+        </w:rPr>
+        <w:t>Sin embargo, la presencia de un solo riesgo o pocos riesgos no significa ausencia de peligro, sino que el riesgo es</w:t>
+      </w:r>
+      <w:r>
+        <w:rPr>
+          <w:rFonts w:ascii="Roboto Mono" w:hAnsi="Roboto Mono"/>
+          <w:sz w:val="20"/>
+          <w:szCs w:val="20"/>
+        </w:rPr>
+        <w:t xml:space="preserve">tá </w:t>
+      </w:r>
+      <w:r>
+        <w:rPr>
+          <w:rFonts w:ascii="Roboto Mono" w:hAnsi="Roboto Mono"/>
+          <w:sz w:val="20"/>
+          <w:szCs w:val="20"/>
+        </w:rPr>
+        <w:t>concentrado en esa</w:t>
+      </w:r>
+      <w:r>
+        <w:rPr>
+          <w:rFonts w:ascii="Roboto Mono" w:hAnsi="Roboto Mono"/>
+          <w:sz w:val="20"/>
+          <w:szCs w:val="20"/>
+        </w:rPr>
+        <w:t>(</w:t>
+      </w:r>
+      <w:r>
+        <w:rPr>
+          <w:rFonts w:ascii="Roboto Mono" w:hAnsi="Roboto Mono"/>
+          <w:sz w:val="20"/>
+          <w:szCs w:val="20"/>
+        </w:rPr>
+        <w:t>s</w:t>
+      </w:r>
+      <w:r>
+        <w:rPr>
+          <w:rFonts w:ascii="Roboto Mono" w:hAnsi="Roboto Mono"/>
+          <w:sz w:val="20"/>
+          <w:szCs w:val="20"/>
+        </w:rPr>
+        <w:t>)</w:t>
+      </w:r>
+      <w:r>
+        <w:rPr>
+          <w:rFonts w:ascii="Roboto Mono" w:hAnsi="Roboto Mono"/>
+          <w:sz w:val="20"/>
+          <w:szCs w:val="20"/>
+        </w:rPr>
+        <w:t xml:space="preserve"> variable</w:t>
+      </w:r>
+      <w:r>
+        <w:rPr>
+          <w:rFonts w:ascii="Roboto Mono" w:hAnsi="Roboto Mono"/>
+          <w:sz w:val="20"/>
+          <w:szCs w:val="20"/>
+        </w:rPr>
+        <w:t>(</w:t>
+      </w:r>
+      <w:r>
+        <w:rPr>
+          <w:rFonts w:ascii="Roboto Mono" w:hAnsi="Roboto Mono"/>
+          <w:sz w:val="20"/>
+          <w:szCs w:val="20"/>
+        </w:rPr>
+        <w:t>s</w:t>
+      </w:r>
+      <w:r>
+        <w:rPr>
+          <w:rFonts w:ascii="Roboto Mono" w:hAnsi="Roboto Mono"/>
+          <w:sz w:val="20"/>
+          <w:szCs w:val="20"/>
+        </w:rPr>
+        <w:t>)</w:t>
+      </w:r>
+      <w:r>
+        <w:rPr>
+          <w:rFonts w:ascii="Roboto Mono" w:hAnsi="Roboto Mono"/>
+          <w:sz w:val="20"/>
+          <w:szCs w:val="20"/>
+        </w:rPr>
+        <w:t xml:space="preserve"> específica</w:t>
+      </w:r>
+      <w:r>
+        <w:rPr>
+          <w:rFonts w:ascii="Roboto Mono" w:hAnsi="Roboto Mono"/>
+          <w:sz w:val="20"/>
+          <w:szCs w:val="20"/>
+        </w:rPr>
+        <w:t>(</w:t>
+      </w:r>
+      <w:r>
+        <w:rPr>
+          <w:rFonts w:ascii="Roboto Mono" w:hAnsi="Roboto Mono"/>
+          <w:sz w:val="20"/>
+          <w:szCs w:val="20"/>
+        </w:rPr>
+        <w:t>s</w:t>
+      </w:r>
+      <w:r>
+        <w:rPr>
+          <w:rFonts w:ascii="Roboto Mono" w:hAnsi="Roboto Mono"/>
+          <w:sz w:val="20"/>
+          <w:szCs w:val="20"/>
+        </w:rPr>
+        <w:t>)</w:t>
+      </w:r>
+      <w:r>
+        <w:rPr>
+          <w:rFonts w:ascii="Roboto Mono" w:hAnsi="Roboto Mono"/>
+          <w:sz w:val="20"/>
+          <w:szCs w:val="20"/>
+        </w:rPr>
+        <w:t>.</w:t>
+      </w:r>
+    </w:p>
     <w:p>
       <w:pPr>
         <w:rPr>
@@ -2297,6 +2457,83 @@
                 <w:szCs w:val="20"/>
               </w:rPr>
             </w:pPr>
+          </w:p>
+          <w:p>
+            <w:pPr>
+              <w:jc w:val="center"/>
+              <w:rPr>
+                <w:rFonts w:ascii="Roboto Mono" w:hAnsi="Roboto Mono"/>
+                <w:sz w:val="20"/>
+                <w:szCs w:val="20"/>
+              </w:rPr>
+            </w:pPr>
+            <w:r>
+              <w:rPr>
+                <w:rFonts w:ascii="Roboto Mono" w:hAnsi="Roboto Mono"/>
+                <w:sz w:val="20"/>
+                <w:szCs w:val="20"/>
+              </w:rPr>
+              <w:t>{{riesgos_internos_plot}}</w:t>
+            </w:r>
+          </w:p>
+          <w:p>
+            <w:pPr>
+              <w:jc w:val="both"/>
+              <w:rPr>
+                <w:rFonts w:ascii="Roboto Mono" w:hAnsi="Roboto Mono"/>
+                <w:sz w:val="20"/>
+                <w:szCs w:val="20"/>
+              </w:rPr>
+            </w:pPr>
+          </w:p>
+        </w:tc>
+      </w:tr>
+    </w:tbl>
+    <w:p>
+      <w:pPr>
+        <w:rPr>
+          <w:rFonts w:ascii="Roboto Mono" w:hAnsi="Roboto Mono"/>
+          <w:sz w:val="20"/>
+          <w:szCs w:val="20"/>
+        </w:rPr>
+      </w:pPr>
+    </w:p>
+    <w:tbl>
+      <w:tblPr>
+        <w:tblStyle w:val="TableGrid"/>
+        <w:tblpPr w:leftFromText="180" w:rightFromText="180" w:vertAnchor="text" w:horzAnchor="margin" w:tblpY="158"/>
+        <w:tblW w:w="0" w:type="auto"/>
+        <w:tblLook w:val="04A0" w:firstRow="1" w:lastRow="0" w:firstColumn="1" w:lastColumn="0" w:noHBand="0" w:noVBand="1"/>
+      </w:tblPr>
+      <w:tblGrid>
+        <w:gridCol w:w="9016"/>
+      </w:tblGrid>
+      <w:tr>
+        <w:tc>
+          <w:tcPr>
+            <w:tcW w:w="9016" w:type="dxa"/>
+            <w:shd w:val="clear" w:color="auto" w:fill="E8E8E8"/>
+            <w:vAlign w:val="center"/>
+          </w:tcPr>
+          <w:p>
+            <w:pPr>
+              <w:jc w:val="center"/>
+              <w:rPr>
+                <w:rFonts w:ascii="Roboto Mono" w:hAnsi="Roboto Mono"/>
+                <w:sz w:val="20"/>
+                <w:szCs w:val="20"/>
+              </w:rPr>
+            </w:pPr>
+          </w:p>
+          <w:p>
+            <w:pPr>
+              <w:jc w:val="center"/>
+              <w:rPr>
+                <w:rFonts w:ascii="Roboto Mono" w:hAnsi="Roboto Mono"/>
+                <w:sz w:val="20"/>
+                <w:szCs w:val="20"/>
+              </w:rPr>
+            </w:pPr>
             <w:r>
               <w:rPr>
                 <w:rFonts w:ascii="Roboto Mono" w:hAnsi="Roboto Mono"/>
@@ -2305,6 +2542,15 @@
               </w:rPr>
               <w:t>{{riesgos_externos_plot}}</w:t>
             </w:r>
+          </w:p>
+          <w:p>
+            <w:pPr>
+              <w:rPr>
+                <w:rFonts w:ascii="Roboto Mono" w:hAnsi="Roboto Mono"/>
+                <w:sz w:val="20"/>
+                <w:szCs w:val="20"/>
+              </w:rPr>
+            </w:pPr>
           </w:p>
         </w:tc>
       </w:tr>
@@ -2341,9 +2587,64 @@
           <w:sz w:val="20"/>
           <w:szCs w:val="20"/>
         </w:rPr>
-        <w:t xml:space="preserve">Próximo control: </w:t>
+        <w:t>En control de plagas, el riesgo nunca es nulo, por lo que se recomienda mantener acciones preventivas constantes y seguimiento periódico para garantizar condiciones seguras y saludables en el tiempo.</w:t>
       </w:r>
     </w:p>
+    <w:p>
+      <w:pPr>
+        <w:rPr>
+          <w:rFonts w:ascii="Roboto Mono" w:hAnsi="Roboto Mono"/>
+          <w:sz w:val="20"/>
+          <w:szCs w:val="20"/>
+        </w:rPr>
+      </w:pPr>
+    </w:p>
+    <w:p>
+      <w:pPr>
+        <w:rPr>
+          <w:rFonts w:ascii="Roboto Mono" w:hAnsi="Roboto Mono"/>
+          <w:sz w:val="20"/>
+          <w:szCs w:val="20"/>
+        </w:rPr>
+      </w:pPr>
+    </w:p>
+    <w:tbl>
+      <w:tblPr>
+        <w:tblStyle w:val="TableGrid"/>
+        <w:tblpPr w:leftFromText="180" w:rightFromText="180" w:vertAnchor="text" w:horzAnchor="margin" w:tblpY="158"/>
+        <w:tblW w:w="0" w:type="auto"/>
+        <w:tblLook w:val="04A0" w:firstRow="1" w:lastRow="0" w:firstColumn="1" w:lastColumn="0" w:noHBand="0" w:noVBand="1"/>
+      </w:tblPr>
+      <w:tblGrid>
+        <w:gridCol w:w="9016"/>
+      </w:tblGrid>
+      <w:tr>
+        <w:tc>
+          <w:tcPr>
+            <w:tcW w:w="9016" w:type="dxa"/>
+            <w:shd w:val="clear" w:color="auto" w:fill="E8E8E8"/>
+            <w:vAlign w:val="center"/>
+          </w:tcPr>
+          <w:p>
+            <w:pPr>
+              <w:rPr>
+                <w:rFonts w:ascii="Roboto Mono" w:hAnsi="Roboto Mono"/>
+                <w:sz w:val="20"/>
+                <w:szCs w:val="20"/>
+              </w:rPr>
+            </w:pPr>
+            <w:r>
+              <w:rPr>
+                <w:rFonts w:ascii="Roboto Mono" w:hAnsi="Roboto Mono"/>
+                <w:sz w:val="20"/>
+                <w:szCs w:val="20"/>
+              </w:rPr>
+              <w:t xml:space="preserve">Próximo control: </w:t>
+            </w:r>
+          </w:p>
+        </w:tc>
+      </w:tr>
+    </w:tbl>
     <w:p>
       <w:pPr>
         <w:rPr>

</xml_diff>

<commit_message>
remover  espacio para imagenes en la plantilla
</commit_message>
<xml_diff>
--- a/INFORME TÉCNICO FINAL.docx
+++ b/INFORME TÉCNICO FINAL.docx
@@ -2670,15 +2670,12 @@
         <w:tblLook w:val="04A0" w:firstRow="1" w:lastRow="0" w:firstColumn="1" w:lastColumn="0" w:noHBand="0" w:noVBand="1"/>
       </w:tblPr>
       <w:tblGrid>
-        <w:gridCol w:w="4390"/>
-        <w:gridCol w:w="283"/>
-        <w:gridCol w:w="4343"/>
+        <w:gridCol w:w="9016"/>
       </w:tblGrid>
       <w:tr>
         <w:tc>
           <w:tcPr>
             <w:tcW w:w="9016" w:type="dxa"/>
-            <w:gridSpan w:val="3"/>
             <w:shd w:val="clear" w:color="auto" w:fill="E8E8E8"/>
             <w:vAlign w:val="center"/>
           </w:tcPr>
@@ -2699,1064 +2696,6 @@
               </w:rPr>
               <w:t>Registro Fotográfico</w:t>
             </w:r>
-          </w:p>
-        </w:tc>
-      </w:tr>
-      <w:tr>
-        <w:tc>
-          <w:tcPr>
-            <w:tcW w:w="4390" w:type="dxa"/>
-            <w:tcBorders>
-              <w:left w:val="nil"/>
-              <w:bottom w:val="single" w:sz="4" w:space="0" w:color="auto"/>
-              <w:right w:val="nil"/>
-            </w:tcBorders>
-          </w:tcPr>
-          <w:p>
-            <w:pPr>
-              <w:rPr>
-                <w:rFonts w:ascii="Roboto Mono" w:hAnsi="Roboto Mono"/>
-                <w:sz w:val="20"/>
-                <w:szCs w:val="20"/>
-              </w:rPr>
-            </w:pPr>
-          </w:p>
-        </w:tc>
-        <w:tc>
-          <w:tcPr>
-            <w:tcW w:w="283" w:type="dxa"/>
-            <w:tcBorders>
-              <w:top w:val="nil"/>
-              <w:left w:val="nil"/>
-              <w:bottom w:val="nil"/>
-              <w:right w:val="nil"/>
-            </w:tcBorders>
-          </w:tcPr>
-          <w:p>
-            <w:pPr>
-              <w:rPr>
-                <w:rFonts w:ascii="Roboto Mono" w:hAnsi="Roboto Mono"/>
-                <w:sz w:val="20"/>
-                <w:szCs w:val="20"/>
-              </w:rPr>
-            </w:pPr>
-          </w:p>
-        </w:tc>
-        <w:tc>
-          <w:tcPr>
-            <w:tcW w:w="4343" w:type="dxa"/>
-            <w:tcBorders>
-              <w:left w:val="nil"/>
-              <w:bottom w:val="single" w:sz="4" w:space="0" w:color="auto"/>
-              <w:right w:val="nil"/>
-            </w:tcBorders>
-          </w:tcPr>
-          <w:p>
-            <w:pPr>
-              <w:rPr>
-                <w:rFonts w:ascii="Roboto Mono" w:hAnsi="Roboto Mono"/>
-                <w:sz w:val="20"/>
-                <w:szCs w:val="20"/>
-              </w:rPr>
-            </w:pPr>
-          </w:p>
-        </w:tc>
-      </w:tr>
-      <w:tr>
-        <w:tc>
-          <w:tcPr>
-            <w:tcW w:w="4390" w:type="dxa"/>
-            <w:tcBorders>
-              <w:bottom w:val="single" w:sz="4" w:space="0" w:color="auto"/>
-              <w:right w:val="single" w:sz="4" w:space="0" w:color="auto"/>
-            </w:tcBorders>
-          </w:tcPr>
-          <w:p>
-            <w:pPr>
-              <w:rPr>
-                <w:rFonts w:ascii="Roboto Mono" w:hAnsi="Roboto Mono"/>
-                <w:sz w:val="20"/>
-                <w:szCs w:val="20"/>
-              </w:rPr>
-            </w:pPr>
-          </w:p>
-          <w:p>
-            <w:pPr>
-              <w:rPr>
-                <w:rFonts w:ascii="Roboto Mono" w:hAnsi="Roboto Mono"/>
-                <w:sz w:val="20"/>
-                <w:szCs w:val="20"/>
-              </w:rPr>
-            </w:pPr>
-          </w:p>
-          <w:p>
-            <w:pPr>
-              <w:rPr>
-                <w:rFonts w:ascii="Roboto Mono" w:hAnsi="Roboto Mono"/>
-                <w:sz w:val="20"/>
-                <w:szCs w:val="20"/>
-              </w:rPr>
-            </w:pPr>
-          </w:p>
-          <w:p>
-            <w:pPr>
-              <w:rPr>
-                <w:rFonts w:ascii="Roboto Mono" w:hAnsi="Roboto Mono"/>
-                <w:sz w:val="20"/>
-                <w:szCs w:val="20"/>
-              </w:rPr>
-            </w:pPr>
-          </w:p>
-          <w:p>
-            <w:pPr>
-              <w:rPr>
-                <w:rFonts w:ascii="Roboto Mono" w:hAnsi="Roboto Mono"/>
-                <w:sz w:val="20"/>
-                <w:szCs w:val="20"/>
-              </w:rPr>
-            </w:pPr>
-          </w:p>
-          <w:p>
-            <w:pPr>
-              <w:rPr>
-                <w:rFonts w:ascii="Roboto Mono" w:hAnsi="Roboto Mono"/>
-                <w:sz w:val="20"/>
-                <w:szCs w:val="20"/>
-              </w:rPr>
-            </w:pPr>
-          </w:p>
-          <w:p>
-            <w:pPr>
-              <w:rPr>
-                <w:rFonts w:ascii="Roboto Mono" w:hAnsi="Roboto Mono"/>
-                <w:sz w:val="20"/>
-                <w:szCs w:val="20"/>
-              </w:rPr>
-            </w:pPr>
-          </w:p>
-          <w:p>
-            <w:pPr>
-              <w:rPr>
-                <w:rFonts w:ascii="Roboto Mono" w:hAnsi="Roboto Mono"/>
-                <w:sz w:val="20"/>
-                <w:szCs w:val="20"/>
-              </w:rPr>
-            </w:pPr>
-          </w:p>
-          <w:p>
-            <w:pPr>
-              <w:rPr>
-                <w:rFonts w:ascii="Roboto Mono" w:hAnsi="Roboto Mono"/>
-                <w:sz w:val="20"/>
-                <w:szCs w:val="20"/>
-              </w:rPr>
-            </w:pPr>
-          </w:p>
-        </w:tc>
-        <w:tc>
-          <w:tcPr>
-            <w:tcW w:w="283" w:type="dxa"/>
-            <w:tcBorders>
-              <w:top w:val="nil"/>
-              <w:left w:val="single" w:sz="4" w:space="0" w:color="auto"/>
-              <w:bottom w:val="nil"/>
-              <w:right w:val="single" w:sz="4" w:space="0" w:color="auto"/>
-            </w:tcBorders>
-          </w:tcPr>
-          <w:p>
-            <w:pPr>
-              <w:rPr>
-                <w:rFonts w:ascii="Roboto Mono" w:hAnsi="Roboto Mono"/>
-                <w:sz w:val="20"/>
-                <w:szCs w:val="20"/>
-              </w:rPr>
-            </w:pPr>
-          </w:p>
-        </w:tc>
-        <w:tc>
-          <w:tcPr>
-            <w:tcW w:w="4343" w:type="dxa"/>
-            <w:tcBorders>
-              <w:left w:val="single" w:sz="4" w:space="0" w:color="auto"/>
-              <w:bottom w:val="single" w:sz="4" w:space="0" w:color="auto"/>
-            </w:tcBorders>
-          </w:tcPr>
-          <w:p>
-            <w:pPr>
-              <w:rPr>
-                <w:rFonts w:ascii="Roboto Mono" w:hAnsi="Roboto Mono"/>
-                <w:sz w:val="20"/>
-                <w:szCs w:val="20"/>
-              </w:rPr>
-            </w:pPr>
-          </w:p>
-          <w:p>
-            <w:pPr>
-              <w:rPr>
-                <w:rFonts w:ascii="Roboto Mono" w:hAnsi="Roboto Mono"/>
-                <w:sz w:val="20"/>
-                <w:szCs w:val="20"/>
-              </w:rPr>
-            </w:pPr>
-          </w:p>
-          <w:p>
-            <w:pPr>
-              <w:rPr>
-                <w:rFonts w:ascii="Roboto Mono" w:hAnsi="Roboto Mono"/>
-                <w:sz w:val="20"/>
-                <w:szCs w:val="20"/>
-              </w:rPr>
-            </w:pPr>
-          </w:p>
-          <w:p>
-            <w:pPr>
-              <w:rPr>
-                <w:rFonts w:ascii="Roboto Mono" w:hAnsi="Roboto Mono"/>
-                <w:sz w:val="20"/>
-                <w:szCs w:val="20"/>
-              </w:rPr>
-            </w:pPr>
-          </w:p>
-          <w:p>
-            <w:pPr>
-              <w:rPr>
-                <w:rFonts w:ascii="Roboto Mono" w:hAnsi="Roboto Mono"/>
-                <w:sz w:val="20"/>
-                <w:szCs w:val="20"/>
-              </w:rPr>
-            </w:pPr>
-          </w:p>
-          <w:p>
-            <w:pPr>
-              <w:rPr>
-                <w:rFonts w:ascii="Roboto Mono" w:hAnsi="Roboto Mono"/>
-                <w:sz w:val="20"/>
-                <w:szCs w:val="20"/>
-              </w:rPr>
-            </w:pPr>
-          </w:p>
-          <w:p>
-            <w:pPr>
-              <w:rPr>
-                <w:rFonts w:ascii="Roboto Mono" w:hAnsi="Roboto Mono"/>
-                <w:sz w:val="20"/>
-                <w:szCs w:val="20"/>
-              </w:rPr>
-            </w:pPr>
-          </w:p>
-          <w:p>
-            <w:pPr>
-              <w:rPr>
-                <w:rFonts w:ascii="Roboto Mono" w:hAnsi="Roboto Mono"/>
-                <w:sz w:val="20"/>
-                <w:szCs w:val="20"/>
-              </w:rPr>
-            </w:pPr>
-          </w:p>
-          <w:p>
-            <w:pPr>
-              <w:rPr>
-                <w:rFonts w:ascii="Roboto Mono" w:hAnsi="Roboto Mono"/>
-                <w:sz w:val="20"/>
-                <w:szCs w:val="20"/>
-              </w:rPr>
-            </w:pPr>
-          </w:p>
-        </w:tc>
-      </w:tr>
-      <w:tr>
-        <w:tc>
-          <w:tcPr>
-            <w:tcW w:w="4390" w:type="dxa"/>
-            <w:tcBorders>
-              <w:top w:val="single" w:sz="4" w:space="0" w:color="auto"/>
-              <w:left w:val="nil"/>
-              <w:bottom w:val="single" w:sz="4" w:space="0" w:color="auto"/>
-              <w:right w:val="nil"/>
-            </w:tcBorders>
-          </w:tcPr>
-          <w:p>
-            <w:pPr>
-              <w:rPr>
-                <w:rFonts w:ascii="Roboto Mono" w:hAnsi="Roboto Mono"/>
-                <w:sz w:val="20"/>
-                <w:szCs w:val="20"/>
-              </w:rPr>
-            </w:pPr>
-          </w:p>
-        </w:tc>
-        <w:tc>
-          <w:tcPr>
-            <w:tcW w:w="283" w:type="dxa"/>
-            <w:tcBorders>
-              <w:top w:val="nil"/>
-              <w:left w:val="nil"/>
-              <w:bottom w:val="nil"/>
-              <w:right w:val="nil"/>
-            </w:tcBorders>
-          </w:tcPr>
-          <w:p>
-            <w:pPr>
-              <w:rPr>
-                <w:rFonts w:ascii="Roboto Mono" w:hAnsi="Roboto Mono"/>
-                <w:sz w:val="20"/>
-                <w:szCs w:val="20"/>
-              </w:rPr>
-            </w:pPr>
-          </w:p>
-        </w:tc>
-        <w:tc>
-          <w:tcPr>
-            <w:tcW w:w="4343" w:type="dxa"/>
-            <w:tcBorders>
-              <w:top w:val="single" w:sz="4" w:space="0" w:color="auto"/>
-              <w:left w:val="nil"/>
-              <w:bottom w:val="single" w:sz="4" w:space="0" w:color="auto"/>
-              <w:right w:val="nil"/>
-            </w:tcBorders>
-          </w:tcPr>
-          <w:p>
-            <w:pPr>
-              <w:rPr>
-                <w:rFonts w:ascii="Roboto Mono" w:hAnsi="Roboto Mono"/>
-                <w:sz w:val="20"/>
-                <w:szCs w:val="20"/>
-              </w:rPr>
-            </w:pPr>
-          </w:p>
-        </w:tc>
-      </w:tr>
-      <w:tr>
-        <w:tc>
-          <w:tcPr>
-            <w:tcW w:w="4390" w:type="dxa"/>
-            <w:tcBorders>
-              <w:top w:val="single" w:sz="4" w:space="0" w:color="auto"/>
-              <w:bottom w:val="single" w:sz="4" w:space="0" w:color="auto"/>
-              <w:right w:val="single" w:sz="4" w:space="0" w:color="auto"/>
-            </w:tcBorders>
-          </w:tcPr>
-          <w:p>
-            <w:pPr>
-              <w:rPr>
-                <w:rFonts w:ascii="Roboto Mono" w:hAnsi="Roboto Mono"/>
-                <w:sz w:val="20"/>
-                <w:szCs w:val="20"/>
-              </w:rPr>
-            </w:pPr>
-          </w:p>
-          <w:p>
-            <w:pPr>
-              <w:rPr>
-                <w:rFonts w:ascii="Roboto Mono" w:hAnsi="Roboto Mono"/>
-                <w:sz w:val="20"/>
-                <w:szCs w:val="20"/>
-              </w:rPr>
-            </w:pPr>
-          </w:p>
-          <w:p>
-            <w:pPr>
-              <w:rPr>
-                <w:rFonts w:ascii="Roboto Mono" w:hAnsi="Roboto Mono"/>
-                <w:sz w:val="20"/>
-                <w:szCs w:val="20"/>
-              </w:rPr>
-            </w:pPr>
-          </w:p>
-          <w:p>
-            <w:pPr>
-              <w:rPr>
-                <w:rFonts w:ascii="Roboto Mono" w:hAnsi="Roboto Mono"/>
-                <w:sz w:val="20"/>
-                <w:szCs w:val="20"/>
-              </w:rPr>
-            </w:pPr>
-          </w:p>
-          <w:p>
-            <w:pPr>
-              <w:rPr>
-                <w:rFonts w:ascii="Roboto Mono" w:hAnsi="Roboto Mono"/>
-                <w:sz w:val="20"/>
-                <w:szCs w:val="20"/>
-              </w:rPr>
-            </w:pPr>
-          </w:p>
-          <w:p>
-            <w:pPr>
-              <w:rPr>
-                <w:rFonts w:ascii="Roboto Mono" w:hAnsi="Roboto Mono"/>
-                <w:sz w:val="20"/>
-                <w:szCs w:val="20"/>
-              </w:rPr>
-            </w:pPr>
-          </w:p>
-          <w:p>
-            <w:pPr>
-              <w:rPr>
-                <w:rFonts w:ascii="Roboto Mono" w:hAnsi="Roboto Mono"/>
-                <w:sz w:val="20"/>
-                <w:szCs w:val="20"/>
-              </w:rPr>
-            </w:pPr>
-          </w:p>
-          <w:p>
-            <w:pPr>
-              <w:rPr>
-                <w:rFonts w:ascii="Roboto Mono" w:hAnsi="Roboto Mono"/>
-                <w:sz w:val="20"/>
-                <w:szCs w:val="20"/>
-              </w:rPr>
-            </w:pPr>
-          </w:p>
-          <w:p>
-            <w:pPr>
-              <w:rPr>
-                <w:rFonts w:ascii="Roboto Mono" w:hAnsi="Roboto Mono"/>
-                <w:sz w:val="20"/>
-                <w:szCs w:val="20"/>
-              </w:rPr>
-            </w:pPr>
-          </w:p>
-        </w:tc>
-        <w:tc>
-          <w:tcPr>
-            <w:tcW w:w="283" w:type="dxa"/>
-            <w:tcBorders>
-              <w:top w:val="nil"/>
-              <w:left w:val="single" w:sz="4" w:space="0" w:color="auto"/>
-              <w:bottom w:val="nil"/>
-              <w:right w:val="single" w:sz="4" w:space="0" w:color="auto"/>
-            </w:tcBorders>
-          </w:tcPr>
-          <w:p>
-            <w:pPr>
-              <w:rPr>
-                <w:rFonts w:ascii="Roboto Mono" w:hAnsi="Roboto Mono"/>
-                <w:sz w:val="20"/>
-                <w:szCs w:val="20"/>
-              </w:rPr>
-            </w:pPr>
-          </w:p>
-        </w:tc>
-        <w:tc>
-          <w:tcPr>
-            <w:tcW w:w="4343" w:type="dxa"/>
-            <w:tcBorders>
-              <w:top w:val="single" w:sz="4" w:space="0" w:color="auto"/>
-              <w:left w:val="single" w:sz="4" w:space="0" w:color="auto"/>
-              <w:bottom w:val="single" w:sz="4" w:space="0" w:color="auto"/>
-            </w:tcBorders>
-          </w:tcPr>
-          <w:p>
-            <w:pPr>
-              <w:rPr>
-                <w:rFonts w:ascii="Roboto Mono" w:hAnsi="Roboto Mono"/>
-                <w:sz w:val="20"/>
-                <w:szCs w:val="20"/>
-              </w:rPr>
-            </w:pPr>
-          </w:p>
-          <w:p>
-            <w:pPr>
-              <w:rPr>
-                <w:rFonts w:ascii="Roboto Mono" w:hAnsi="Roboto Mono"/>
-                <w:sz w:val="20"/>
-                <w:szCs w:val="20"/>
-              </w:rPr>
-            </w:pPr>
-          </w:p>
-          <w:p>
-            <w:pPr>
-              <w:rPr>
-                <w:rFonts w:ascii="Roboto Mono" w:hAnsi="Roboto Mono"/>
-                <w:sz w:val="20"/>
-                <w:szCs w:val="20"/>
-              </w:rPr>
-            </w:pPr>
-          </w:p>
-          <w:p>
-            <w:pPr>
-              <w:rPr>
-                <w:rFonts w:ascii="Roboto Mono" w:hAnsi="Roboto Mono"/>
-                <w:sz w:val="20"/>
-                <w:szCs w:val="20"/>
-              </w:rPr>
-            </w:pPr>
-          </w:p>
-          <w:p>
-            <w:pPr>
-              <w:rPr>
-                <w:rFonts w:ascii="Roboto Mono" w:hAnsi="Roboto Mono"/>
-                <w:sz w:val="20"/>
-                <w:szCs w:val="20"/>
-              </w:rPr>
-            </w:pPr>
-          </w:p>
-          <w:p>
-            <w:pPr>
-              <w:rPr>
-                <w:rFonts w:ascii="Roboto Mono" w:hAnsi="Roboto Mono"/>
-                <w:sz w:val="20"/>
-                <w:szCs w:val="20"/>
-              </w:rPr>
-            </w:pPr>
-          </w:p>
-          <w:p>
-            <w:pPr>
-              <w:rPr>
-                <w:rFonts w:ascii="Roboto Mono" w:hAnsi="Roboto Mono"/>
-                <w:sz w:val="20"/>
-                <w:szCs w:val="20"/>
-              </w:rPr>
-            </w:pPr>
-          </w:p>
-          <w:p>
-            <w:pPr>
-              <w:rPr>
-                <w:rFonts w:ascii="Roboto Mono" w:hAnsi="Roboto Mono"/>
-                <w:sz w:val="20"/>
-                <w:szCs w:val="20"/>
-              </w:rPr>
-            </w:pPr>
-          </w:p>
-          <w:p>
-            <w:pPr>
-              <w:rPr>
-                <w:rFonts w:ascii="Roboto Mono" w:hAnsi="Roboto Mono"/>
-                <w:sz w:val="20"/>
-                <w:szCs w:val="20"/>
-              </w:rPr>
-            </w:pPr>
-          </w:p>
-        </w:tc>
-      </w:tr>
-      <w:tr>
-        <w:tc>
-          <w:tcPr>
-            <w:tcW w:w="4390" w:type="dxa"/>
-            <w:tcBorders>
-              <w:top w:val="single" w:sz="4" w:space="0" w:color="auto"/>
-              <w:left w:val="nil"/>
-              <w:bottom w:val="single" w:sz="4" w:space="0" w:color="auto"/>
-              <w:right w:val="nil"/>
-            </w:tcBorders>
-          </w:tcPr>
-          <w:p>
-            <w:pPr>
-              <w:rPr>
-                <w:rFonts w:ascii="Roboto Mono" w:hAnsi="Roboto Mono"/>
-                <w:sz w:val="20"/>
-                <w:szCs w:val="20"/>
-              </w:rPr>
-            </w:pPr>
-          </w:p>
-        </w:tc>
-        <w:tc>
-          <w:tcPr>
-            <w:tcW w:w="283" w:type="dxa"/>
-            <w:tcBorders>
-              <w:top w:val="nil"/>
-              <w:left w:val="nil"/>
-              <w:bottom w:val="nil"/>
-              <w:right w:val="nil"/>
-            </w:tcBorders>
-          </w:tcPr>
-          <w:p>
-            <w:pPr>
-              <w:rPr>
-                <w:rFonts w:ascii="Roboto Mono" w:hAnsi="Roboto Mono"/>
-                <w:sz w:val="20"/>
-                <w:szCs w:val="20"/>
-              </w:rPr>
-            </w:pPr>
-          </w:p>
-        </w:tc>
-        <w:tc>
-          <w:tcPr>
-            <w:tcW w:w="4343" w:type="dxa"/>
-            <w:tcBorders>
-              <w:top w:val="single" w:sz="4" w:space="0" w:color="auto"/>
-              <w:left w:val="nil"/>
-              <w:bottom w:val="single" w:sz="4" w:space="0" w:color="auto"/>
-              <w:right w:val="nil"/>
-            </w:tcBorders>
-          </w:tcPr>
-          <w:p>
-            <w:pPr>
-              <w:rPr>
-                <w:rFonts w:ascii="Roboto Mono" w:hAnsi="Roboto Mono"/>
-                <w:sz w:val="20"/>
-                <w:szCs w:val="20"/>
-              </w:rPr>
-            </w:pPr>
-          </w:p>
-        </w:tc>
-      </w:tr>
-      <w:tr>
-        <w:tc>
-          <w:tcPr>
-            <w:tcW w:w="4390" w:type="dxa"/>
-            <w:tcBorders>
-              <w:top w:val="single" w:sz="4" w:space="0" w:color="auto"/>
-              <w:bottom w:val="single" w:sz="4" w:space="0" w:color="auto"/>
-              <w:right w:val="single" w:sz="4" w:space="0" w:color="auto"/>
-            </w:tcBorders>
-          </w:tcPr>
-          <w:p>
-            <w:pPr>
-              <w:rPr>
-                <w:rFonts w:ascii="Roboto Mono" w:hAnsi="Roboto Mono"/>
-                <w:sz w:val="20"/>
-                <w:szCs w:val="20"/>
-              </w:rPr>
-            </w:pPr>
-          </w:p>
-          <w:p>
-            <w:pPr>
-              <w:rPr>
-                <w:rFonts w:ascii="Roboto Mono" w:hAnsi="Roboto Mono"/>
-                <w:sz w:val="20"/>
-                <w:szCs w:val="20"/>
-              </w:rPr>
-            </w:pPr>
-          </w:p>
-          <w:p>
-            <w:pPr>
-              <w:rPr>
-                <w:rFonts w:ascii="Roboto Mono" w:hAnsi="Roboto Mono"/>
-                <w:sz w:val="20"/>
-                <w:szCs w:val="20"/>
-              </w:rPr>
-            </w:pPr>
-          </w:p>
-          <w:p>
-            <w:pPr>
-              <w:rPr>
-                <w:rFonts w:ascii="Roboto Mono" w:hAnsi="Roboto Mono"/>
-                <w:sz w:val="20"/>
-                <w:szCs w:val="20"/>
-              </w:rPr>
-            </w:pPr>
-          </w:p>
-          <w:p>
-            <w:pPr>
-              <w:rPr>
-                <w:rFonts w:ascii="Roboto Mono" w:hAnsi="Roboto Mono"/>
-                <w:sz w:val="20"/>
-                <w:szCs w:val="20"/>
-              </w:rPr>
-            </w:pPr>
-          </w:p>
-          <w:p>
-            <w:pPr>
-              <w:rPr>
-                <w:rFonts w:ascii="Roboto Mono" w:hAnsi="Roboto Mono"/>
-                <w:sz w:val="20"/>
-                <w:szCs w:val="20"/>
-              </w:rPr>
-            </w:pPr>
-          </w:p>
-          <w:p>
-            <w:pPr>
-              <w:rPr>
-                <w:rFonts w:ascii="Roboto Mono" w:hAnsi="Roboto Mono"/>
-                <w:sz w:val="20"/>
-                <w:szCs w:val="20"/>
-              </w:rPr>
-            </w:pPr>
-          </w:p>
-          <w:p>
-            <w:pPr>
-              <w:rPr>
-                <w:rFonts w:ascii="Roboto Mono" w:hAnsi="Roboto Mono"/>
-                <w:sz w:val="20"/>
-                <w:szCs w:val="20"/>
-              </w:rPr>
-            </w:pPr>
-          </w:p>
-          <w:p>
-            <w:pPr>
-              <w:rPr>
-                <w:rFonts w:ascii="Roboto Mono" w:hAnsi="Roboto Mono"/>
-                <w:sz w:val="20"/>
-                <w:szCs w:val="20"/>
-              </w:rPr>
-            </w:pPr>
-          </w:p>
-        </w:tc>
-        <w:tc>
-          <w:tcPr>
-            <w:tcW w:w="283" w:type="dxa"/>
-            <w:tcBorders>
-              <w:top w:val="nil"/>
-              <w:left w:val="single" w:sz="4" w:space="0" w:color="auto"/>
-              <w:bottom w:val="nil"/>
-              <w:right w:val="single" w:sz="4" w:space="0" w:color="auto"/>
-            </w:tcBorders>
-          </w:tcPr>
-          <w:p>
-            <w:pPr>
-              <w:rPr>
-                <w:rFonts w:ascii="Roboto Mono" w:hAnsi="Roboto Mono"/>
-                <w:sz w:val="20"/>
-                <w:szCs w:val="20"/>
-              </w:rPr>
-            </w:pPr>
-          </w:p>
-        </w:tc>
-        <w:tc>
-          <w:tcPr>
-            <w:tcW w:w="4343" w:type="dxa"/>
-            <w:tcBorders>
-              <w:top w:val="single" w:sz="4" w:space="0" w:color="auto"/>
-              <w:left w:val="single" w:sz="4" w:space="0" w:color="auto"/>
-              <w:bottom w:val="single" w:sz="4" w:space="0" w:color="auto"/>
-            </w:tcBorders>
-          </w:tcPr>
-          <w:p>
-            <w:pPr>
-              <w:rPr>
-                <w:rFonts w:ascii="Roboto Mono" w:hAnsi="Roboto Mono"/>
-                <w:sz w:val="20"/>
-                <w:szCs w:val="20"/>
-              </w:rPr>
-            </w:pPr>
-          </w:p>
-          <w:p>
-            <w:pPr>
-              <w:rPr>
-                <w:rFonts w:ascii="Roboto Mono" w:hAnsi="Roboto Mono"/>
-                <w:sz w:val="20"/>
-                <w:szCs w:val="20"/>
-              </w:rPr>
-            </w:pPr>
-          </w:p>
-          <w:p>
-            <w:pPr>
-              <w:rPr>
-                <w:rFonts w:ascii="Roboto Mono" w:hAnsi="Roboto Mono"/>
-                <w:sz w:val="20"/>
-                <w:szCs w:val="20"/>
-              </w:rPr>
-            </w:pPr>
-          </w:p>
-          <w:p>
-            <w:pPr>
-              <w:rPr>
-                <w:rFonts w:ascii="Roboto Mono" w:hAnsi="Roboto Mono"/>
-                <w:sz w:val="20"/>
-                <w:szCs w:val="20"/>
-              </w:rPr>
-            </w:pPr>
-          </w:p>
-          <w:p>
-            <w:pPr>
-              <w:rPr>
-                <w:rFonts w:ascii="Roboto Mono" w:hAnsi="Roboto Mono"/>
-                <w:sz w:val="20"/>
-                <w:szCs w:val="20"/>
-              </w:rPr>
-            </w:pPr>
-          </w:p>
-          <w:p>
-            <w:pPr>
-              <w:rPr>
-                <w:rFonts w:ascii="Roboto Mono" w:hAnsi="Roboto Mono"/>
-                <w:sz w:val="20"/>
-                <w:szCs w:val="20"/>
-              </w:rPr>
-            </w:pPr>
-          </w:p>
-          <w:p>
-            <w:pPr>
-              <w:rPr>
-                <w:rFonts w:ascii="Roboto Mono" w:hAnsi="Roboto Mono"/>
-                <w:sz w:val="20"/>
-                <w:szCs w:val="20"/>
-              </w:rPr>
-            </w:pPr>
-          </w:p>
-          <w:p>
-            <w:pPr>
-              <w:rPr>
-                <w:rFonts w:ascii="Roboto Mono" w:hAnsi="Roboto Mono"/>
-                <w:sz w:val="20"/>
-                <w:szCs w:val="20"/>
-              </w:rPr>
-            </w:pPr>
-          </w:p>
-          <w:p>
-            <w:pPr>
-              <w:rPr>
-                <w:rFonts w:ascii="Roboto Mono" w:hAnsi="Roboto Mono"/>
-                <w:sz w:val="20"/>
-                <w:szCs w:val="20"/>
-              </w:rPr>
-            </w:pPr>
-          </w:p>
-        </w:tc>
-      </w:tr>
-      <w:tr>
-        <w:tc>
-          <w:tcPr>
-            <w:tcW w:w="4390" w:type="dxa"/>
-            <w:tcBorders>
-              <w:top w:val="single" w:sz="4" w:space="0" w:color="auto"/>
-              <w:left w:val="nil"/>
-              <w:bottom w:val="single" w:sz="4" w:space="0" w:color="auto"/>
-              <w:right w:val="nil"/>
-            </w:tcBorders>
-          </w:tcPr>
-          <w:p>
-            <w:pPr>
-              <w:rPr>
-                <w:rFonts w:ascii="Roboto Mono" w:hAnsi="Roboto Mono"/>
-                <w:sz w:val="20"/>
-                <w:szCs w:val="20"/>
-              </w:rPr>
-            </w:pPr>
-          </w:p>
-        </w:tc>
-        <w:tc>
-          <w:tcPr>
-            <w:tcW w:w="283" w:type="dxa"/>
-            <w:tcBorders>
-              <w:top w:val="nil"/>
-              <w:left w:val="nil"/>
-              <w:bottom w:val="nil"/>
-              <w:right w:val="nil"/>
-            </w:tcBorders>
-          </w:tcPr>
-          <w:p>
-            <w:pPr>
-              <w:rPr>
-                <w:rFonts w:ascii="Roboto Mono" w:hAnsi="Roboto Mono"/>
-                <w:sz w:val="20"/>
-                <w:szCs w:val="20"/>
-              </w:rPr>
-            </w:pPr>
-          </w:p>
-        </w:tc>
-        <w:tc>
-          <w:tcPr>
-            <w:tcW w:w="4343" w:type="dxa"/>
-            <w:tcBorders>
-              <w:top w:val="single" w:sz="4" w:space="0" w:color="auto"/>
-              <w:left w:val="nil"/>
-              <w:bottom w:val="single" w:sz="4" w:space="0" w:color="auto"/>
-              <w:right w:val="nil"/>
-            </w:tcBorders>
-          </w:tcPr>
-          <w:p>
-            <w:pPr>
-              <w:rPr>
-                <w:rFonts w:ascii="Roboto Mono" w:hAnsi="Roboto Mono"/>
-                <w:sz w:val="20"/>
-                <w:szCs w:val="20"/>
-              </w:rPr>
-            </w:pPr>
-          </w:p>
-        </w:tc>
-      </w:tr>
-      <w:tr>
-        <w:tc>
-          <w:tcPr>
-            <w:tcW w:w="4390" w:type="dxa"/>
-            <w:tcBorders>
-              <w:top w:val="single" w:sz="4" w:space="0" w:color="auto"/>
-              <w:right w:val="single" w:sz="4" w:space="0" w:color="auto"/>
-            </w:tcBorders>
-          </w:tcPr>
-          <w:p>
-            <w:pPr>
-              <w:rPr>
-                <w:rFonts w:ascii="Roboto Mono" w:hAnsi="Roboto Mono"/>
-                <w:sz w:val="20"/>
-                <w:szCs w:val="20"/>
-              </w:rPr>
-            </w:pPr>
-          </w:p>
-          <w:p>
-            <w:pPr>
-              <w:rPr>
-                <w:rFonts w:ascii="Roboto Mono" w:hAnsi="Roboto Mono"/>
-                <w:sz w:val="20"/>
-                <w:szCs w:val="20"/>
-              </w:rPr>
-            </w:pPr>
-          </w:p>
-          <w:p>
-            <w:pPr>
-              <w:rPr>
-                <w:rFonts w:ascii="Roboto Mono" w:hAnsi="Roboto Mono"/>
-                <w:sz w:val="20"/>
-                <w:szCs w:val="20"/>
-              </w:rPr>
-            </w:pPr>
-          </w:p>
-          <w:p>
-            <w:pPr>
-              <w:rPr>
-                <w:rFonts w:ascii="Roboto Mono" w:hAnsi="Roboto Mono"/>
-                <w:sz w:val="20"/>
-                <w:szCs w:val="20"/>
-              </w:rPr>
-            </w:pPr>
-          </w:p>
-          <w:p>
-            <w:pPr>
-              <w:rPr>
-                <w:rFonts w:ascii="Roboto Mono" w:hAnsi="Roboto Mono"/>
-                <w:sz w:val="20"/>
-                <w:szCs w:val="20"/>
-              </w:rPr>
-            </w:pPr>
-          </w:p>
-          <w:p>
-            <w:pPr>
-              <w:rPr>
-                <w:rFonts w:ascii="Roboto Mono" w:hAnsi="Roboto Mono"/>
-                <w:sz w:val="20"/>
-                <w:szCs w:val="20"/>
-              </w:rPr>
-            </w:pPr>
-          </w:p>
-          <w:p>
-            <w:pPr>
-              <w:rPr>
-                <w:rFonts w:ascii="Roboto Mono" w:hAnsi="Roboto Mono"/>
-                <w:sz w:val="20"/>
-                <w:szCs w:val="20"/>
-              </w:rPr>
-            </w:pPr>
-          </w:p>
-          <w:p>
-            <w:pPr>
-              <w:rPr>
-                <w:rFonts w:ascii="Roboto Mono" w:hAnsi="Roboto Mono"/>
-                <w:sz w:val="20"/>
-                <w:szCs w:val="20"/>
-              </w:rPr>
-            </w:pPr>
-          </w:p>
-          <w:p>
-            <w:pPr>
-              <w:rPr>
-                <w:rFonts w:ascii="Roboto Mono" w:hAnsi="Roboto Mono"/>
-                <w:sz w:val="20"/>
-                <w:szCs w:val="20"/>
-              </w:rPr>
-            </w:pPr>
-          </w:p>
-        </w:tc>
-        <w:tc>
-          <w:tcPr>
-            <w:tcW w:w="283" w:type="dxa"/>
-            <w:tcBorders>
-              <w:top w:val="nil"/>
-              <w:left w:val="single" w:sz="4" w:space="0" w:color="auto"/>
-              <w:bottom w:val="nil"/>
-              <w:right w:val="single" w:sz="4" w:space="0" w:color="auto"/>
-            </w:tcBorders>
-          </w:tcPr>
-          <w:p>
-            <w:pPr>
-              <w:rPr>
-                <w:rFonts w:ascii="Roboto Mono" w:hAnsi="Roboto Mono"/>
-                <w:sz w:val="20"/>
-                <w:szCs w:val="20"/>
-              </w:rPr>
-            </w:pPr>
-          </w:p>
-        </w:tc>
-        <w:tc>
-          <w:tcPr>
-            <w:tcW w:w="4343" w:type="dxa"/>
-            <w:tcBorders>
-              <w:top w:val="single" w:sz="4" w:space="0" w:color="auto"/>
-              <w:left w:val="single" w:sz="4" w:space="0" w:color="auto"/>
-            </w:tcBorders>
-          </w:tcPr>
-          <w:p>
-            <w:pPr>
-              <w:rPr>
-                <w:rFonts w:ascii="Roboto Mono" w:hAnsi="Roboto Mono"/>
-                <w:sz w:val="20"/>
-                <w:szCs w:val="20"/>
-              </w:rPr>
-            </w:pPr>
-          </w:p>
-          <w:p>
-            <w:pPr>
-              <w:rPr>
-                <w:rFonts w:ascii="Roboto Mono" w:hAnsi="Roboto Mono"/>
-                <w:sz w:val="20"/>
-                <w:szCs w:val="20"/>
-              </w:rPr>
-            </w:pPr>
-          </w:p>
-          <w:p>
-            <w:pPr>
-              <w:rPr>
-                <w:rFonts w:ascii="Roboto Mono" w:hAnsi="Roboto Mono"/>
-                <w:sz w:val="20"/>
-                <w:szCs w:val="20"/>
-              </w:rPr>
-            </w:pPr>
-          </w:p>
-          <w:p>
-            <w:pPr>
-              <w:rPr>
-                <w:rFonts w:ascii="Roboto Mono" w:hAnsi="Roboto Mono"/>
-                <w:sz w:val="20"/>
-                <w:szCs w:val="20"/>
-              </w:rPr>
-            </w:pPr>
-          </w:p>
-          <w:p>
-            <w:pPr>
-              <w:rPr>
-                <w:rFonts w:ascii="Roboto Mono" w:hAnsi="Roboto Mono"/>
-                <w:sz w:val="20"/>
-                <w:szCs w:val="20"/>
-              </w:rPr>
-            </w:pPr>
-          </w:p>
-          <w:p>
-            <w:pPr>
-              <w:rPr>
-                <w:rFonts w:ascii="Roboto Mono" w:hAnsi="Roboto Mono"/>
-                <w:sz w:val="20"/>
-                <w:szCs w:val="20"/>
-              </w:rPr>
-            </w:pPr>
-          </w:p>
-          <w:p>
-            <w:pPr>
-              <w:rPr>
-                <w:rFonts w:ascii="Roboto Mono" w:hAnsi="Roboto Mono"/>
-                <w:sz w:val="20"/>
-                <w:szCs w:val="20"/>
-              </w:rPr>
-            </w:pPr>
-          </w:p>
-          <w:p>
-            <w:pPr>
-              <w:rPr>
-                <w:rFonts w:ascii="Roboto Mono" w:hAnsi="Roboto Mono"/>
-                <w:sz w:val="20"/>
-                <w:szCs w:val="20"/>
-              </w:rPr>
-            </w:pPr>
-          </w:p>
-          <w:p>
-            <w:pPr>
-              <w:rPr>
-                <w:rFonts w:ascii="Roboto Mono" w:hAnsi="Roboto Mono"/>
-                <w:sz w:val="20"/>
-                <w:szCs w:val="20"/>
-              </w:rPr>
-            </w:pPr>
           </w:p>
         </w:tc>
       </w:tr>

</xml_diff>

<commit_message>
justificar parrafos en plantilla
</commit_message>
<xml_diff>
--- a/INFORME TÉCNICO FINAL.docx
+++ b/INFORME TÉCNICO FINAL.docx
@@ -818,6 +818,7 @@
           </w:tcPr>
           <w:p>
             <w:pPr>
+              <w:jc w:val="both"/>
               <w:rPr>
                 <w:rFonts w:ascii="Roboto Mono" w:hAnsi="Roboto Mono"/>
                 <w:sz w:val="20"/>
@@ -904,6 +905,7 @@
           </w:p>
           <w:p>
             <w:pPr>
+              <w:jc w:val="both"/>
               <w:rPr>
                 <w:rFonts w:ascii="Roboto Mono" w:hAnsi="Roboto Mono"/>
                 <w:sz w:val="20"/>
@@ -982,6 +984,7 @@
           </w:p>
           <w:p>
             <w:pPr>
+              <w:jc w:val="both"/>
               <w:rPr>
                 <w:rFonts w:ascii="Roboto Mono" w:hAnsi="Roboto Mono"/>
                 <w:sz w:val="20"/>
@@ -1527,6 +1530,7 @@
           </w:tcPr>
           <w:p>
             <w:pPr>
+              <w:jc w:val="both"/>
               <w:rPr>
                 <w:rFonts w:ascii="Roboto Mono" w:hAnsi="Roboto Mono"/>
                 <w:sz w:val="20"/>
@@ -1664,6 +1668,7 @@
           </w:tcPr>
           <w:p>
             <w:pPr>
+              <w:jc w:val="both"/>
               <w:rPr>
                 <w:rFonts w:ascii="Roboto Mono" w:hAnsi="Roboto Mono"/>
                 <w:sz w:val="20"/>
@@ -1801,6 +1806,7 @@
           </w:tcPr>
           <w:p>
             <w:pPr>
+              <w:jc w:val="both"/>
               <w:rPr>
                 <w:rFonts w:ascii="Roboto Mono" w:hAnsi="Roboto Mono"/>
                 <w:sz w:val="20"/>

</xml_diff>

<commit_message>
Ajustar tamaño de tablas en la plantilla
</commit_message>
<xml_diff>
--- a/INFORME TÉCNICO FINAL.docx
+++ b/INFORME TÉCNICO FINAL.docx
@@ -1383,14 +1383,14 @@
         <w:tblLook w:val="04A0" w:firstRow="1" w:lastRow="0" w:firstColumn="1" w:lastColumn="0" w:noHBand="0" w:noVBand="1"/>
       </w:tblPr>
       <w:tblGrid>
-        <w:gridCol w:w="5240"/>
+        <w:gridCol w:w="3539"/>
         <w:gridCol w:w="284"/>
-        <w:gridCol w:w="3492"/>
+        <w:gridCol w:w="5193"/>
       </w:tblGrid>
       <w:tr>
         <w:tc>
           <w:tcPr>
-            <w:tcW w:w="5240" w:type="dxa"/>
+            <w:tcW w:w="3539" w:type="dxa"/>
             <w:tcBorders>
               <w:right w:val="single" w:sz="4" w:space="0" w:color="auto"/>
             </w:tcBorders>
@@ -1437,7 +1437,7 @@
         </w:tc>
         <w:tc>
           <w:tcPr>
-            <w:tcW w:w="3492" w:type="dxa"/>
+            <w:tcW w:w="5193" w:type="dxa"/>
             <w:tcBorders>
               <w:left w:val="single" w:sz="4" w:space="0" w:color="auto"/>
             </w:tcBorders>
@@ -1474,7 +1474,7 @@
       <w:tr>
         <w:tc>
           <w:tcPr>
-            <w:tcW w:w="5240" w:type="dxa"/>
+            <w:tcW w:w="3539" w:type="dxa"/>
             <w:vMerge w:val="restart"/>
             <w:tcBorders>
               <w:right w:val="single" w:sz="4" w:space="0" w:color="auto"/>
@@ -1522,7 +1522,7 @@
         </w:tc>
         <w:tc>
           <w:tcPr>
-            <w:tcW w:w="3492" w:type="dxa"/>
+            <w:tcW w:w="5193" w:type="dxa"/>
             <w:tcBorders>
               <w:left w:val="single" w:sz="4" w:space="0" w:color="auto"/>
             </w:tcBorders>
@@ -1551,7 +1551,7 @@
       <w:tr>
         <w:tc>
           <w:tcPr>
-            <w:tcW w:w="5240" w:type="dxa"/>
+            <w:tcW w:w="3539" w:type="dxa"/>
             <w:vMerge/>
             <w:tcBorders>
               <w:right w:val="single" w:sz="4" w:space="0" w:color="auto"/>
@@ -1591,7 +1591,7 @@
         </w:tc>
         <w:tc>
           <w:tcPr>
-            <w:tcW w:w="3492" w:type="dxa"/>
+            <w:tcW w:w="5193" w:type="dxa"/>
             <w:tcBorders>
               <w:left w:val="single" w:sz="4" w:space="0" w:color="auto"/>
             </w:tcBorders>
@@ -1620,7 +1620,7 @@
       <w:tr>
         <w:tc>
           <w:tcPr>
-            <w:tcW w:w="5240" w:type="dxa"/>
+            <w:tcW w:w="3539" w:type="dxa"/>
             <w:vMerge/>
             <w:tcBorders>
               <w:right w:val="single" w:sz="4" w:space="0" w:color="auto"/>
@@ -1660,7 +1660,7 @@
         </w:tc>
         <w:tc>
           <w:tcPr>
-            <w:tcW w:w="3492" w:type="dxa"/>
+            <w:tcW w:w="5193" w:type="dxa"/>
             <w:tcBorders>
               <w:left w:val="single" w:sz="4" w:space="0" w:color="auto"/>
             </w:tcBorders>
@@ -1689,7 +1689,7 @@
       <w:tr>
         <w:tc>
           <w:tcPr>
-            <w:tcW w:w="5240" w:type="dxa"/>
+            <w:tcW w:w="3539" w:type="dxa"/>
             <w:vMerge/>
             <w:tcBorders>
               <w:right w:val="single" w:sz="4" w:space="0" w:color="auto"/>
@@ -1729,7 +1729,7 @@
         </w:tc>
         <w:tc>
           <w:tcPr>
-            <w:tcW w:w="3492" w:type="dxa"/>
+            <w:tcW w:w="5193" w:type="dxa"/>
             <w:tcBorders>
               <w:left w:val="single" w:sz="4" w:space="0" w:color="auto"/>
             </w:tcBorders>
@@ -1758,7 +1758,7 @@
       <w:tr>
         <w:tc>
           <w:tcPr>
-            <w:tcW w:w="5240" w:type="dxa"/>
+            <w:tcW w:w="3539" w:type="dxa"/>
             <w:vMerge/>
             <w:tcBorders>
               <w:right w:val="single" w:sz="4" w:space="0" w:color="auto"/>
@@ -1798,7 +1798,7 @@
         </w:tc>
         <w:tc>
           <w:tcPr>
-            <w:tcW w:w="3492" w:type="dxa"/>
+            <w:tcW w:w="5193" w:type="dxa"/>
             <w:tcBorders>
               <w:left w:val="single" w:sz="4" w:space="0" w:color="auto"/>
             </w:tcBorders>

</xml_diff>

<commit_message>
actualizar descripción de grafico e incluir colores en descripción
</commit_message>
<xml_diff>
--- a/INFORME TÉCNICO FINAL.docx
+++ b/INFORME TÉCNICO FINAL.docx
@@ -1267,6 +1267,7 @@
           </w:tcPr>
           <w:p>
             <w:pPr>
+              <w:jc w:val="both"/>
               <w:rPr>
                 <w:rFonts w:ascii="Roboto Mono" w:hAnsi="Roboto Mono"/>
                 <w:sz w:val="20"/>
@@ -1278,18 +1279,61 @@
                 <w:rFonts w:ascii="Roboto Mono" w:hAnsi="Roboto Mono"/>
                 <w:b/>
                 <w:bCs/>
-                <w:sz w:val="20"/>
-                <w:szCs w:val="20"/>
-              </w:rPr>
-              <w:t>Región  I – II – IV:</w:t>
-            </w:r>
-            <w:r>
-              <w:rPr>
-                <w:rFonts w:ascii="Roboto Mono" w:hAnsi="Roboto Mono"/>
-                <w:sz w:val="20"/>
-                <w:szCs w:val="20"/>
-              </w:rPr>
-              <w:t xml:space="preserve">  Si el punto se ubica en esta región, se requiere implementar acciones correctivas en el corto plazo.</w:t>
+                <w:color w:val="D32F2F"/>
+                <w:sz w:val="20"/>
+                <w:szCs w:val="20"/>
+              </w:rPr>
+              <w:t>Región I – II – IV</w:t>
+            </w:r>
+            <w:r>
+              <w:rPr>
+                <w:rFonts w:ascii="Roboto Mono" w:hAnsi="Roboto Mono"/>
+                <w:b/>
+                <w:bCs/>
+                <w:sz w:val="20"/>
+                <w:szCs w:val="20"/>
+              </w:rPr>
+              <w:t>:</w:t>
+            </w:r>
+            <w:r>
+              <w:rPr>
+                <w:rFonts w:ascii="Roboto Mono" w:hAnsi="Roboto Mono"/>
+                <w:sz w:val="20"/>
+                <w:szCs w:val="20"/>
+              </w:rPr>
+              <w:t xml:space="preserve"> </w:t>
+            </w:r>
+            <w:r>
+              <w:rPr>
+                <w:rFonts w:ascii="Roboto Mono" w:hAnsi="Roboto Mono"/>
+                <w:sz w:val="20"/>
+                <w:szCs w:val="20"/>
+              </w:rPr>
+              <w:t>N</w:t>
+            </w:r>
+            <w:r>
+              <w:rPr>
+                <w:rFonts w:ascii="Roboto Mono" w:hAnsi="Roboto Mono"/>
+                <w:sz w:val="20"/>
+                <w:szCs w:val="20"/>
+              </w:rPr>
+              <w:t>ivel de riesgo elevado</w:t>
+            </w:r>
+            <w:r>
+              <w:rPr>
+                <w:rFonts w:ascii="Roboto Mono" w:hAnsi="Roboto Mono"/>
+                <w:sz w:val="20"/>
+                <w:szCs w:val="20"/>
+              </w:rPr>
+              <w:t xml:space="preserve">. </w:t>
+            </w:r>
+            <w:r>
+              <w:rPr>
+                <w:rFonts w:ascii="Roboto Mono" w:hAnsi="Roboto Mono"/>
+                <w:sz w:val="20"/>
+                <w:szCs w:val="20"/>
+              </w:rPr>
+              <w:t>Las condiciones internas y/o externas requieren la implementación de acciones correctivas en el corto plazo, con el fin de reducir la vulnerabilidad del establecimiento frente a la presencia de plagas.</w:t>
             </w:r>
           </w:p>
         </w:tc>
@@ -1303,6 +1347,7 @@
           </w:tcPr>
           <w:p>
             <w:pPr>
+              <w:jc w:val="both"/>
               <w:rPr>
                 <w:rFonts w:ascii="Roboto Mono" w:hAnsi="Roboto Mono"/>
                 <w:sz w:val="20"/>
@@ -1314,18 +1359,45 @@
                 <w:rFonts w:ascii="Roboto Mono" w:hAnsi="Roboto Mono"/>
                 <w:b/>
                 <w:bCs/>
-                <w:sz w:val="20"/>
-                <w:szCs w:val="20"/>
-              </w:rPr>
-              <w:t>Región  III – V – VII:</w:t>
-            </w:r>
-            <w:r>
-              <w:rPr>
-                <w:rFonts w:ascii="Roboto Mono" w:hAnsi="Roboto Mono"/>
-                <w:sz w:val="20"/>
-                <w:szCs w:val="20"/>
-              </w:rPr>
-              <w:t xml:space="preserve">  Si el punto se ubica en esta región, debe establecer acciones preventivas y tomar medidas en el mediano plazo.</w:t>
+                <w:color w:val="FFB300"/>
+                <w:sz w:val="20"/>
+                <w:szCs w:val="20"/>
+              </w:rPr>
+              <w:t>Región III – V – VII</w:t>
+            </w:r>
+            <w:r>
+              <w:rPr>
+                <w:rFonts w:ascii="Roboto Mono" w:hAnsi="Roboto Mono"/>
+                <w:b/>
+                <w:bCs/>
+                <w:sz w:val="20"/>
+                <w:szCs w:val="20"/>
+              </w:rPr>
+              <w:t>:</w:t>
+            </w:r>
+            <w:r>
+              <w:rPr>
+                <w:rFonts w:ascii="Roboto Mono" w:hAnsi="Roboto Mono"/>
+                <w:sz w:val="20"/>
+                <w:szCs w:val="20"/>
+              </w:rPr>
+              <w:t xml:space="preserve">  </w:t>
+            </w:r>
+            <w:r>
+              <w:rPr>
+                <w:rFonts w:ascii="Roboto Mono" w:hAnsi="Roboto Mono"/>
+                <w:sz w:val="20"/>
+                <w:szCs w:val="20"/>
+              </w:rPr>
+              <w:t>N</w:t>
+            </w:r>
+            <w:r>
+              <w:rPr>
+                <w:rFonts w:ascii="Roboto Mono" w:hAnsi="Roboto Mono"/>
+                <w:sz w:val="20"/>
+                <w:szCs w:val="20"/>
+              </w:rPr>
+              <w:t>ivel de riesgo moderado. Se identifican condiciones que, de no ser atendidas oportunamente, podrían derivar en situaciones de mayor complejidad. Se recomienda establecer acciones preventivas y planificar su ejecución en el mediano plazo.</w:t>
             </w:r>
           </w:p>
         </w:tc>
@@ -1339,6 +1411,7 @@
           </w:tcPr>
           <w:p>
             <w:pPr>
+              <w:jc w:val="both"/>
               <w:rPr>
                 <w:rFonts w:ascii="Roboto Mono" w:hAnsi="Roboto Mono"/>
                 <w:sz w:val="20"/>
@@ -1350,18 +1423,45 @@
                 <w:rFonts w:ascii="Roboto Mono" w:hAnsi="Roboto Mono"/>
                 <w:b/>
                 <w:bCs/>
-                <w:sz w:val="20"/>
-                <w:szCs w:val="20"/>
-              </w:rPr>
-              <w:t xml:space="preserve">Región  VI – VIII – IX: </w:t>
-            </w:r>
-            <w:r>
-              <w:rPr>
-                <w:rFonts w:ascii="Roboto Mono" w:hAnsi="Roboto Mono"/>
-                <w:sz w:val="20"/>
-                <w:szCs w:val="20"/>
-              </w:rPr>
-              <w:t xml:space="preserve"> Si el punto se ubica en esta región, sus estrategias de control deben ser de mantenimiento de las condiciones actuales y mejoramiento constante.</w:t>
+                <w:color w:val="4DB7AC"/>
+                <w:sz w:val="20"/>
+                <w:szCs w:val="20"/>
+              </w:rPr>
+              <w:t>Región VI – VIII – IX</w:t>
+            </w:r>
+            <w:r>
+              <w:rPr>
+                <w:rFonts w:ascii="Roboto Mono" w:hAnsi="Roboto Mono"/>
+                <w:b/>
+                <w:bCs/>
+                <w:sz w:val="20"/>
+                <w:szCs w:val="20"/>
+              </w:rPr>
+              <w:t xml:space="preserve">: </w:t>
+            </w:r>
+            <w:r>
+              <w:rPr>
+                <w:rFonts w:ascii="Roboto Mono" w:hAnsi="Roboto Mono"/>
+                <w:sz w:val="20"/>
+                <w:szCs w:val="20"/>
+              </w:rPr>
+              <w:t xml:space="preserve"> </w:t>
+            </w:r>
+            <w:r>
+              <w:rPr>
+                <w:rFonts w:ascii="Roboto Mono" w:hAnsi="Roboto Mono"/>
+                <w:sz w:val="20"/>
+                <w:szCs w:val="20"/>
+              </w:rPr>
+              <w:t>N</w:t>
+            </w:r>
+            <w:r>
+              <w:rPr>
+                <w:rFonts w:ascii="Roboto Mono" w:hAnsi="Roboto Mono"/>
+                <w:sz w:val="20"/>
+                <w:szCs w:val="20"/>
+              </w:rPr>
+              <w:t>ivel de riesgo bajo. Las condiciones actuales del establecimiento son favorables. La estrategia recomendada es el mantenimiento de las buenas prácticas implementadas y el mejoramiento continuo del sistema de control.</w:t>
             </w:r>
           </w:p>
         </w:tc>
@@ -2247,6 +2347,7 @@
           <w:sz w:val="20"/>
           <w:szCs w:val="20"/>
         </w:rPr>
+        <w:lastRenderedPageBreak/>
         <w:t>Los siguientes gráficos presentan la proporción de los distintos factores de riesgo detectados durante el control de plagas realizado.</w:t>
       </w:r>
       <w:r>
@@ -2297,7 +2398,6 @@
           <w:sz w:val="20"/>
           <w:szCs w:val="20"/>
         </w:rPr>
-        <w:lastRenderedPageBreak/>
         <w:t>Un mayor porcentaje en una categoría refleja mayor vulnerabilidad o exposición en ese aspecto.</w:t>
       </w:r>
       <w:r>

</xml_diff>

<commit_message>
Editar la plantilla de word para cambiar estilo
</commit_message>
<xml_diff>
--- a/INFORME TÉCNICO FINAL.docx
+++ b/INFORME TÉCNICO FINAL.docx
@@ -2072,21 +2072,22 @@
         <w:tblLook w:val="04A0" w:firstRow="1" w:lastRow="0" w:firstColumn="1" w:lastColumn="0" w:noHBand="0" w:noVBand="1"/>
       </w:tblPr>
       <w:tblGrid>
-        <w:gridCol w:w="1803"/>
-        <w:gridCol w:w="2728"/>
+        <w:gridCol w:w="1555"/>
+        <w:gridCol w:w="2976"/>
         <w:gridCol w:w="284"/>
-        <w:gridCol w:w="2397"/>
-        <w:gridCol w:w="1804"/>
+        <w:gridCol w:w="1559"/>
+        <w:gridCol w:w="2642"/>
       </w:tblGrid>
       <w:tr>
         <w:tc>
           <w:tcPr>
-            <w:tcW w:w="1803" w:type="dxa"/>
+            <w:tcW w:w="1555" w:type="dxa"/>
             <w:shd w:val="clear" w:color="auto" w:fill="E8E8E8" w:themeFill="background2"/>
             <w:vAlign w:val="center"/>
           </w:tcPr>
           <w:p>
             <w:pPr>
+              <w:jc w:val="right"/>
               <w:rPr>
                 <w:rFonts w:ascii="Roboto Mono" w:hAnsi="Roboto Mono"/>
                 <w:sz w:val="20"/>
@@ -2105,7 +2106,7 @@
         </w:tc>
         <w:tc>
           <w:tcPr>
-            <w:tcW w:w="2728" w:type="dxa"/>
+            <w:tcW w:w="2976" w:type="dxa"/>
             <w:tcBorders>
               <w:right w:val="single" w:sz="4" w:space="0" w:color="auto"/>
             </w:tcBorders>
@@ -2151,7 +2152,7 @@
         </w:tc>
         <w:tc>
           <w:tcPr>
-            <w:tcW w:w="2397" w:type="dxa"/>
+            <w:tcW w:w="1559" w:type="dxa"/>
             <w:tcBorders>
               <w:left w:val="single" w:sz="4" w:space="0" w:color="auto"/>
             </w:tcBorders>
@@ -2160,6 +2161,7 @@
           </w:tcPr>
           <w:p>
             <w:pPr>
+              <w:jc w:val="right"/>
               <w:rPr>
                 <w:rFonts w:ascii="Roboto Mono" w:hAnsi="Roboto Mono"/>
                 <w:sz w:val="20"/>
@@ -2178,7 +2180,7 @@
         </w:tc>
         <w:tc>
           <w:tcPr>
-            <w:tcW w:w="1804" w:type="dxa"/>
+            <w:tcW w:w="2642" w:type="dxa"/>
             <w:vAlign w:val="center"/>
           </w:tcPr>
           <w:p>
@@ -2203,12 +2205,13 @@
       <w:tr>
         <w:tc>
           <w:tcPr>
-            <w:tcW w:w="1803" w:type="dxa"/>
+            <w:tcW w:w="1555" w:type="dxa"/>
             <w:shd w:val="clear" w:color="auto" w:fill="E8E8E8" w:themeFill="background2"/>
             <w:vAlign w:val="center"/>
           </w:tcPr>
           <w:p>
             <w:pPr>
+              <w:jc w:val="right"/>
               <w:rPr>
                 <w:rFonts w:ascii="Roboto Mono" w:hAnsi="Roboto Mono"/>
                 <w:sz w:val="20"/>
@@ -2227,7 +2230,7 @@
         </w:tc>
         <w:tc>
           <w:tcPr>
-            <w:tcW w:w="2728" w:type="dxa"/>
+            <w:tcW w:w="2976" w:type="dxa"/>
             <w:tcBorders>
               <w:right w:val="single" w:sz="4" w:space="0" w:color="auto"/>
             </w:tcBorders>
@@ -2273,7 +2276,7 @@
         </w:tc>
         <w:tc>
           <w:tcPr>
-            <w:tcW w:w="2397" w:type="dxa"/>
+            <w:tcW w:w="1559" w:type="dxa"/>
             <w:tcBorders>
               <w:left w:val="single" w:sz="4" w:space="0" w:color="auto"/>
             </w:tcBorders>
@@ -2282,6 +2285,7 @@
           </w:tcPr>
           <w:p>
             <w:pPr>
+              <w:jc w:val="right"/>
               <w:rPr>
                 <w:rFonts w:ascii="Roboto Mono" w:hAnsi="Roboto Mono"/>
                 <w:sz w:val="20"/>
@@ -2300,7 +2304,7 @@
         </w:tc>
         <w:tc>
           <w:tcPr>
-            <w:tcW w:w="1804" w:type="dxa"/>
+            <w:tcW w:w="2642" w:type="dxa"/>
             <w:vAlign w:val="center"/>
           </w:tcPr>
           <w:p>

</xml_diff>